<commit_message>
PICB : rétablit le modèle actif et la sauvegarde .prec
Le commit précédent avait écrit le nouveau modèle dans
modele-rapport-spsti.prec.docx (renommé entre-temps sur GitHub), laissant
l'outil sans modele-rapport-spsti.docx.
- modele-rapport-spsti.docx : nouvelle présentation (modèle utilisé par l'export)
- modele-rapport-spsti.prec.docx : sauvegarde restaurée à l'identique

Co-Authored-By: Claude Opus 5.5 <noreply@anthropic.com>
Claude-Session: https://claude.ai/code/session_01PHogwabWwFBLWHVE3qj8hv
</commit_message>
<xml_diff>
--- a/PICB/modele-rapport-spsti.prec.docx
+++ b/PICB/modele-rapport-spsti.prec.docx
@@ -4,864 +4,1420 @@
   <w:body>
     <w:bookmarkStart w:id="0" w:name="_Hlk198462478"/>
     <w:bookmarkEnd w:id="0"/>
-    <w:p xmlns:a="http://schemas.openxmlformats.org/drawingml/2006/main" xmlns:pic="http://schemas.openxmlformats.org/drawingml/2006/picture">
-      <w:pPr>
-        <w:spacing w:before="0" w:after="0"/>
-      </w:pPr>
-      <w:r>
-        <w:drawing>
-          <wp:anchor distT="0" distB="0" distL="0" distR="0" simplePos="0" relativeHeight="251700000" behindDoc="0" locked="1" layoutInCell="1" allowOverlap="1">
-            <wp:simplePos x="0" y="0"/>
-            <wp:positionH relativeFrom="page">
-              <wp:posOffset>0</wp:posOffset>
-            </wp:positionH>
-            <wp:positionV relativeFrom="page">
-              <wp:posOffset>0</wp:posOffset>
-            </wp:positionV>
-            <wp:extent cx="7560000" cy="3231290"/>
-            <wp:effectExtent l="0" t="0" r="0" b="0"/>
-            <wp:wrapTopAndBottom/>
-            <wp:docPr id="9801" name="Bandeau rapport bruit"/>
-            <wp:cNvGraphicFramePr/>
-            <a:graphic>
-              <a:graphicData uri="http://schemas.openxmlformats.org/drawingml/2006/picture">
-                <pic:pic>
-                  <pic:nvPicPr>
-                    <pic:cNvPr id="9801" name="ob_bandeau.jpeg"/>
-                    <pic:cNvPicPr/>
-                  </pic:nvPicPr>
-                  <pic:blipFill>
-                    <a:blip r:embed="rIdObBan"/>
-                    <a:stretch>
-                      <a:fillRect/>
-                    </a:stretch>
-                  </pic:blipFill>
-                  <pic:spPr>
-                    <a:xfrm>
-                      <a:off x="0" y="0"/>
-                      <a:ext cx="7560000" cy="3231290"/>
-                    </a:xfrm>
-                    <a:prstGeom prst="rect">
-                      <a:avLst/>
-                    </a:prstGeom>
-                  </pic:spPr>
-                </pic:pic>
-              </a:graphicData>
-            </a:graphic>
-          </wp:anchor>
-        </w:drawing>
-      </w:r>
-    </w:p>
     <w:p>
       <w:pPr>
         <w:pStyle w:val="Corpsdetexte"/>
-        <w:spacing w:before="420" w:after="0"/>
-        <w:ind w:left="0" w:right="0" w:firstLine="0"/>
-      </w:pPr>
+        <w:rPr>
+          <w:rFonts w:ascii="Times New Roman"/>
+          <w:sz w:val="48"/>
+        </w:rPr>
+      </w:pPr>
+      <w:r>
+        <w:rPr>
+          <w:rFonts w:ascii="Times New Roman"/>
+          <w:noProof/>
+          <w:sz w:val="48"/>
+        </w:rPr>
+        <mc:AlternateContent>
+          <mc:Choice Requires="wpg">
+            <w:drawing>
+              <wp:anchor distT="0" distB="0" distL="0" distR="0" simplePos="0" relativeHeight="251616256" behindDoc="1" locked="0" layoutInCell="1" allowOverlap="1" wp14:anchorId="2E668490" wp14:editId="2DF860A6">
+                <wp:simplePos x="0" y="0"/>
+                <wp:positionH relativeFrom="page">
+                  <wp:posOffset>0</wp:posOffset>
+                </wp:positionH>
+                <wp:positionV relativeFrom="page">
+                  <wp:posOffset>0</wp:posOffset>
+                </wp:positionV>
+                <wp:extent cx="7564120" cy="10694035"/>
+                <wp:effectExtent l="0" t="0" r="0" b="0"/>
+                <wp:wrapNone/>
+                <wp:docPr id="1" name="Group 1"/>
+                <wp:cNvGraphicFramePr>
+                  <a:graphicFrameLocks xmlns:a="http://schemas.openxmlformats.org/drawingml/2006/main"/>
+                </wp:cNvGraphicFramePr>
+                <a:graphic xmlns:a="http://schemas.openxmlformats.org/drawingml/2006/main">
+                  <a:graphicData uri="http://schemas.microsoft.com/office/word/2010/wordprocessingGroup">
+                    <wpg:wgp>
+                      <wpg:cNvGrpSpPr>
+                        <a:grpSpLocks/>
+                      </wpg:cNvGrpSpPr>
+                      <wpg:grpSpPr>
+                        <a:xfrm>
+                          <a:off x="0" y="0"/>
+                          <a:ext cx="7564120" cy="10694035"/>
+                          <a:chOff x="0" y="0"/>
+                          <a:chExt cx="7564120" cy="10694035"/>
+                        </a:xfrm>
+                      </wpg:grpSpPr>
+                      <wps:wsp>
+                        <wps:cNvPr id="2" name="Graphic 2"/>
+                        <wps:cNvSpPr/>
+                        <wps:spPr>
+                          <a:xfrm>
+                            <a:off x="0" y="0"/>
+                            <a:ext cx="7259320" cy="10387965"/>
+                          </a:xfrm>
+                          <a:custGeom>
+                            <a:avLst/>
+                            <a:gdLst/>
+                            <a:ahLst/>
+                            <a:cxnLst/>
+                            <a:rect l="l" t="t" r="r" b="b"/>
+                            <a:pathLst>
+                              <a:path w="7259320" h="10387965">
+                                <a:moveTo>
+                                  <a:pt x="7223125" y="10345420"/>
+                                </a:moveTo>
+                                <a:lnTo>
+                                  <a:pt x="0" y="10345420"/>
+                                </a:lnTo>
+                                <a:lnTo>
+                                  <a:pt x="0" y="10352405"/>
+                                </a:lnTo>
+                                <a:lnTo>
+                                  <a:pt x="7223125" y="10352405"/>
+                                </a:lnTo>
+                                <a:lnTo>
+                                  <a:pt x="7223125" y="10345420"/>
+                                </a:lnTo>
+                                <a:close/>
+                              </a:path>
+                              <a:path w="7259320" h="10387965">
+                                <a:moveTo>
+                                  <a:pt x="7223125" y="0"/>
+                                </a:moveTo>
+                                <a:lnTo>
+                                  <a:pt x="7215505" y="0"/>
+                                </a:lnTo>
+                                <a:lnTo>
+                                  <a:pt x="7215505" y="10344785"/>
+                                </a:lnTo>
+                                <a:lnTo>
+                                  <a:pt x="7223125" y="10344785"/>
+                                </a:lnTo>
+                                <a:lnTo>
+                                  <a:pt x="7223125" y="0"/>
+                                </a:lnTo>
+                                <a:close/>
+                              </a:path>
+                              <a:path w="7259320" h="10387965">
+                                <a:moveTo>
+                                  <a:pt x="7259320" y="10345928"/>
+                                </a:moveTo>
+                                <a:lnTo>
+                                  <a:pt x="7231380" y="10345928"/>
+                                </a:lnTo>
+                                <a:lnTo>
+                                  <a:pt x="7231380" y="10359898"/>
+                                </a:lnTo>
+                                <a:lnTo>
+                                  <a:pt x="0" y="10359898"/>
+                                </a:lnTo>
+                                <a:lnTo>
+                                  <a:pt x="0" y="10387838"/>
+                                </a:lnTo>
+                                <a:lnTo>
+                                  <a:pt x="7259320" y="10387838"/>
+                                </a:lnTo>
+                                <a:lnTo>
+                                  <a:pt x="7259320" y="10359898"/>
+                                </a:lnTo>
+                                <a:lnTo>
+                                  <a:pt x="7259320" y="10345928"/>
+                                </a:lnTo>
+                                <a:close/>
+                              </a:path>
+                              <a:path w="7259320" h="10387965">
+                                <a:moveTo>
+                                  <a:pt x="7259320" y="0"/>
+                                </a:moveTo>
+                                <a:lnTo>
+                                  <a:pt x="7231380" y="0"/>
+                                </a:lnTo>
+                                <a:lnTo>
+                                  <a:pt x="7231380" y="10344785"/>
+                                </a:lnTo>
+                                <a:lnTo>
+                                  <a:pt x="7259320" y="10344785"/>
+                                </a:lnTo>
+                                <a:lnTo>
+                                  <a:pt x="7259320" y="0"/>
+                                </a:lnTo>
+                                <a:close/>
+                              </a:path>
+                            </a:pathLst>
+                          </a:custGeom>
+                          <a:solidFill>
+                            <a:srgbClr val="001F5F"/>
+                          </a:solidFill>
+                        </wps:spPr>
+                        <wps:bodyPr wrap="square" lIns="0" tIns="0" rIns="0" bIns="0" rtlCol="0">
+                          <a:prstTxWarp prst="textNoShape">
+                            <a:avLst/>
+                          </a:prstTxWarp>
+                          <a:noAutofit/>
+                        </wps:bodyPr>
+                      </wps:wsp>
+                      <pic:pic xmlns:pic="http://schemas.openxmlformats.org/drawingml/2006/picture">
+                        <pic:nvPicPr>
+                          <pic:cNvPr id="3" name="Image 3"/>
+                          <pic:cNvPicPr/>
+                        </pic:nvPicPr>
+                        <pic:blipFill>
+                          <a:blip r:embed="rId8" cstate="print"/>
+                          <a:stretch>
+                            <a:fillRect/>
+                          </a:stretch>
+                        </pic:blipFill>
+                        <pic:spPr>
+                          <a:xfrm>
+                            <a:off x="213359" y="216408"/>
+                            <a:ext cx="1440180" cy="1197102"/>
+                          </a:xfrm>
+                          <a:prstGeom prst="rect">
+                            <a:avLst/>
+                          </a:prstGeom>
+                        </pic:spPr>
+                      </pic:pic>
+                      <wps:wsp>
+                        <wps:cNvPr id="4" name="Graphic 4"/>
+                        <wps:cNvSpPr/>
+                        <wps:spPr>
+                          <a:xfrm>
+                            <a:off x="421741" y="12"/>
+                            <a:ext cx="7142480" cy="10694035"/>
+                          </a:xfrm>
+                          <a:custGeom>
+                            <a:avLst/>
+                            <a:gdLst/>
+                            <a:ahLst/>
+                            <a:cxnLst/>
+                            <a:rect l="l" t="t" r="r" b="b"/>
+                            <a:pathLst>
+                              <a:path w="7142480" h="10694035">
+                                <a:moveTo>
+                                  <a:pt x="7141858" y="7751762"/>
+                                </a:moveTo>
+                                <a:lnTo>
+                                  <a:pt x="7111797" y="7700188"/>
+                                </a:lnTo>
+                                <a:lnTo>
+                                  <a:pt x="7091299" y="7667726"/>
+                                </a:lnTo>
+                                <a:lnTo>
+                                  <a:pt x="7049249" y="7607109"/>
+                                </a:lnTo>
+                                <a:lnTo>
+                                  <a:pt x="7005841" y="7552410"/>
+                                </a:lnTo>
+                                <a:lnTo>
+                                  <a:pt x="6961162" y="7503833"/>
+                                </a:lnTo>
+                                <a:lnTo>
+                                  <a:pt x="6915290" y="7461567"/>
+                                </a:lnTo>
+                                <a:lnTo>
+                                  <a:pt x="6868300" y="7425842"/>
+                                </a:lnTo>
+                                <a:lnTo>
+                                  <a:pt x="6820281" y="7396848"/>
+                                </a:lnTo>
+                                <a:lnTo>
+                                  <a:pt x="6771297" y="7374801"/>
+                                </a:lnTo>
+                                <a:lnTo>
+                                  <a:pt x="6721437" y="7359891"/>
+                                </a:lnTo>
+                                <a:lnTo>
+                                  <a:pt x="6670776" y="7352347"/>
+                                </a:lnTo>
+                                <a:lnTo>
+                                  <a:pt x="6645173" y="7351382"/>
+                                </a:lnTo>
+                                <a:lnTo>
+                                  <a:pt x="6619557" y="7352347"/>
+                                </a:lnTo>
+                                <a:lnTo>
+                                  <a:pt x="6568897" y="7359891"/>
+                                </a:lnTo>
+                                <a:lnTo>
+                                  <a:pt x="6519037" y="7374801"/>
+                                </a:lnTo>
+                                <a:lnTo>
+                                  <a:pt x="6470053" y="7396848"/>
+                                </a:lnTo>
+                                <a:lnTo>
+                                  <a:pt x="6422034" y="7425842"/>
+                                </a:lnTo>
+                                <a:lnTo>
+                                  <a:pt x="6375044" y="7461567"/>
+                                </a:lnTo>
+                                <a:lnTo>
+                                  <a:pt x="6329172" y="7503833"/>
+                                </a:lnTo>
+                                <a:lnTo>
+                                  <a:pt x="6284493" y="7552410"/>
+                                </a:lnTo>
+                                <a:lnTo>
+                                  <a:pt x="6241085" y="7607109"/>
+                                </a:lnTo>
+                                <a:lnTo>
+                                  <a:pt x="6199035" y="7667726"/>
+                                </a:lnTo>
+                                <a:lnTo>
+                                  <a:pt x="6178537" y="7700188"/>
+                                </a:lnTo>
+                                <a:lnTo>
+                                  <a:pt x="6158408" y="7734046"/>
+                                </a:lnTo>
+                                <a:lnTo>
+                                  <a:pt x="6138659" y="7769276"/>
+                                </a:lnTo>
+                                <a:lnTo>
+                                  <a:pt x="6119292" y="7805864"/>
+                                </a:lnTo>
+                                <a:lnTo>
+                                  <a:pt x="6100318" y="7843761"/>
+                                </a:lnTo>
+                                <a:lnTo>
+                                  <a:pt x="6081763" y="7882966"/>
+                                </a:lnTo>
+                                <a:lnTo>
+                                  <a:pt x="6063615" y="7923441"/>
+                                </a:lnTo>
+                                <a:lnTo>
+                                  <a:pt x="6045898" y="7965160"/>
+                                </a:lnTo>
+                                <a:lnTo>
+                                  <a:pt x="6028614" y="8008099"/>
+                                </a:lnTo>
+                                <a:lnTo>
+                                  <a:pt x="6011773" y="8052244"/>
+                                </a:lnTo>
+                                <a:lnTo>
+                                  <a:pt x="5995390" y="8097545"/>
+                                </a:lnTo>
+                                <a:lnTo>
+                                  <a:pt x="5979477" y="8143989"/>
+                                </a:lnTo>
+                                <a:lnTo>
+                                  <a:pt x="5964034" y="8191563"/>
+                                </a:lnTo>
+                                <a:lnTo>
+                                  <a:pt x="5949086" y="8240217"/>
+                                </a:lnTo>
+                                <a:lnTo>
+                                  <a:pt x="5934621" y="8289938"/>
+                                </a:lnTo>
+                                <a:lnTo>
+                                  <a:pt x="5920664" y="8340699"/>
+                                </a:lnTo>
+                                <a:lnTo>
+                                  <a:pt x="5907227" y="8392477"/>
+                                </a:lnTo>
+                                <a:lnTo>
+                                  <a:pt x="5894311" y="8445246"/>
+                                </a:lnTo>
+                                <a:lnTo>
+                                  <a:pt x="5881929" y="8498967"/>
+                                </a:lnTo>
+                                <a:lnTo>
+                                  <a:pt x="5870092" y="8553640"/>
+                                </a:lnTo>
+                                <a:lnTo>
+                                  <a:pt x="5858802" y="8609216"/>
+                                </a:lnTo>
+                                <a:lnTo>
+                                  <a:pt x="5848083" y="8665680"/>
+                                </a:lnTo>
+                                <a:lnTo>
+                                  <a:pt x="5837936" y="8722995"/>
+                                </a:lnTo>
+                                <a:lnTo>
+                                  <a:pt x="5828373" y="8781148"/>
+                                </a:lnTo>
+                                <a:lnTo>
+                                  <a:pt x="5819406" y="8840114"/>
+                                </a:lnTo>
+                                <a:lnTo>
+                                  <a:pt x="5811037" y="8899868"/>
+                                </a:lnTo>
+                                <a:lnTo>
+                                  <a:pt x="5803277" y="8960371"/>
+                                </a:lnTo>
+                                <a:lnTo>
+                                  <a:pt x="5796153" y="9021597"/>
+                                </a:lnTo>
+                                <a:lnTo>
+                                  <a:pt x="5789650" y="9083535"/>
+                                </a:lnTo>
+                                <a:lnTo>
+                                  <a:pt x="5783796" y="9146159"/>
+                                </a:lnTo>
+                                <a:lnTo>
+                                  <a:pt x="5778589" y="9209430"/>
+                                </a:lnTo>
+                                <a:lnTo>
+                                  <a:pt x="5774042" y="9273337"/>
+                                </a:lnTo>
+                                <a:lnTo>
+                                  <a:pt x="5770181" y="9337827"/>
+                                </a:lnTo>
+                                <a:lnTo>
+                                  <a:pt x="5766994" y="9402915"/>
+                                </a:lnTo>
+                                <a:lnTo>
+                                  <a:pt x="5764492" y="9468548"/>
+                                </a:lnTo>
+                                <a:lnTo>
+                                  <a:pt x="5762701" y="9534703"/>
+                                </a:lnTo>
+                                <a:lnTo>
+                                  <a:pt x="5761609" y="9601352"/>
+                                </a:lnTo>
+                                <a:lnTo>
+                                  <a:pt x="5761253" y="9668472"/>
+                                </a:lnTo>
+                                <a:lnTo>
+                                  <a:pt x="5761609" y="9735604"/>
+                                </a:lnTo>
+                                <a:lnTo>
+                                  <a:pt x="5762701" y="9802254"/>
+                                </a:lnTo>
+                                <a:lnTo>
+                                  <a:pt x="5764492" y="9868408"/>
+                                </a:lnTo>
+                                <a:lnTo>
+                                  <a:pt x="5766994" y="9934042"/>
+                                </a:lnTo>
+                                <a:lnTo>
+                                  <a:pt x="5770181" y="9999116"/>
+                                </a:lnTo>
+                                <a:lnTo>
+                                  <a:pt x="5774042" y="10063620"/>
+                                </a:lnTo>
+                                <a:lnTo>
+                                  <a:pt x="5778589" y="10127513"/>
+                                </a:lnTo>
+                                <a:lnTo>
+                                  <a:pt x="5783796" y="10190785"/>
+                                </a:lnTo>
+                                <a:lnTo>
+                                  <a:pt x="5789650" y="10253408"/>
+                                </a:lnTo>
+                                <a:lnTo>
+                                  <a:pt x="5796153" y="10315346"/>
+                                </a:lnTo>
+                                <a:lnTo>
+                                  <a:pt x="5803277" y="10376573"/>
+                                </a:lnTo>
+                                <a:lnTo>
+                                  <a:pt x="5811037" y="10437076"/>
+                                </a:lnTo>
+                                <a:lnTo>
+                                  <a:pt x="5819406" y="10496829"/>
+                                </a:lnTo>
+                                <a:lnTo>
+                                  <a:pt x="5828373" y="10555796"/>
+                                </a:lnTo>
+                                <a:lnTo>
+                                  <a:pt x="5837936" y="10613949"/>
+                                </a:lnTo>
+                                <a:lnTo>
+                                  <a:pt x="5848083" y="10671264"/>
+                                </a:lnTo>
+                                <a:lnTo>
+                                  <a:pt x="5852376" y="10693895"/>
+                                </a:lnTo>
+                                <a:lnTo>
+                                  <a:pt x="7141858" y="10693895"/>
+                                </a:lnTo>
+                                <a:lnTo>
+                                  <a:pt x="7141858" y="7751762"/>
+                                </a:lnTo>
+                                <a:close/>
+                              </a:path>
+                              <a:path w="7142480" h="10694035">
+                                <a:moveTo>
+                                  <a:pt x="7141858" y="0"/>
+                                </a:moveTo>
+                                <a:lnTo>
+                                  <a:pt x="0" y="0"/>
+                                </a:lnTo>
+                                <a:lnTo>
+                                  <a:pt x="5359" y="4559"/>
+                                </a:lnTo>
+                                <a:lnTo>
+                                  <a:pt x="39560" y="30251"/>
+                                </a:lnTo>
+                                <a:lnTo>
+                                  <a:pt x="78663" y="55587"/>
+                                </a:lnTo>
+                                <a:lnTo>
+                                  <a:pt x="122555" y="80543"/>
+                                </a:lnTo>
+                                <a:lnTo>
+                                  <a:pt x="171157" y="105092"/>
+                                </a:lnTo>
+                                <a:lnTo>
+                                  <a:pt x="224370" y="129247"/>
+                                </a:lnTo>
+                                <a:lnTo>
+                                  <a:pt x="282092" y="152958"/>
+                                </a:lnTo>
+                                <a:lnTo>
+                                  <a:pt x="344220" y="176212"/>
+                                </a:lnTo>
+                                <a:lnTo>
+                                  <a:pt x="410667" y="199009"/>
+                                </a:lnTo>
+                                <a:lnTo>
+                                  <a:pt x="481330" y="221310"/>
+                                </a:lnTo>
+                                <a:lnTo>
+                                  <a:pt x="518210" y="232283"/>
+                                </a:lnTo>
+                                <a:lnTo>
+                                  <a:pt x="556120" y="243116"/>
+                                </a:lnTo>
+                                <a:lnTo>
+                                  <a:pt x="595020" y="253822"/>
+                                </a:lnTo>
+                                <a:lnTo>
+                                  <a:pt x="634923" y="264401"/>
+                                </a:lnTo>
+                                <a:lnTo>
+                                  <a:pt x="717651" y="285140"/>
+                                </a:lnTo>
+                                <a:lnTo>
+                                  <a:pt x="804227" y="305333"/>
+                                </a:lnTo>
+                                <a:lnTo>
+                                  <a:pt x="894511" y="324942"/>
+                                </a:lnTo>
+                                <a:lnTo>
+                                  <a:pt x="988453" y="343966"/>
+                                </a:lnTo>
+                                <a:lnTo>
+                                  <a:pt x="1135951" y="371348"/>
+                                </a:lnTo>
+                                <a:lnTo>
+                                  <a:pt x="1291082" y="397294"/>
+                                </a:lnTo>
+                                <a:lnTo>
+                                  <a:pt x="1453515" y="421754"/>
+                                </a:lnTo>
+                                <a:lnTo>
+                                  <a:pt x="1622920" y="444652"/>
+                                </a:lnTo>
+                                <a:lnTo>
+                                  <a:pt x="1859089" y="472681"/>
+                                </a:lnTo>
+                                <a:lnTo>
+                                  <a:pt x="2106307" y="497700"/>
+                                </a:lnTo>
+                                <a:lnTo>
+                                  <a:pt x="2429662" y="524522"/>
+                                </a:lnTo>
+                                <a:lnTo>
+                                  <a:pt x="2767533" y="546150"/>
+                                </a:lnTo>
+                                <a:lnTo>
+                                  <a:pt x="3118408" y="562305"/>
+                                </a:lnTo>
+                                <a:lnTo>
+                                  <a:pt x="3480778" y="572706"/>
+                                </a:lnTo>
+                                <a:lnTo>
+                                  <a:pt x="3853103" y="577088"/>
+                                </a:lnTo>
+                                <a:lnTo>
+                                  <a:pt x="4004170" y="577088"/>
+                                </a:lnTo>
+                                <a:lnTo>
+                                  <a:pt x="4376496" y="572706"/>
+                                </a:lnTo>
+                                <a:lnTo>
+                                  <a:pt x="4738865" y="562305"/>
+                                </a:lnTo>
+                                <a:lnTo>
+                                  <a:pt x="5089741" y="546150"/>
+                                </a:lnTo>
+                                <a:lnTo>
+                                  <a:pt x="5427611" y="524522"/>
+                                </a:lnTo>
+                                <a:lnTo>
+                                  <a:pt x="5750966" y="497700"/>
+                                </a:lnTo>
+                                <a:lnTo>
+                                  <a:pt x="5998184" y="472681"/>
+                                </a:lnTo>
+                                <a:lnTo>
+                                  <a:pt x="6234354" y="444652"/>
+                                </a:lnTo>
+                                <a:lnTo>
+                                  <a:pt x="6403759" y="421754"/>
+                                </a:lnTo>
+                                <a:lnTo>
+                                  <a:pt x="6566192" y="397294"/>
+                                </a:lnTo>
+                                <a:lnTo>
+                                  <a:pt x="6721322" y="371348"/>
+                                </a:lnTo>
+                                <a:lnTo>
+                                  <a:pt x="6868820" y="343966"/>
+                                </a:lnTo>
+                                <a:lnTo>
+                                  <a:pt x="6962762" y="324942"/>
+                                </a:lnTo>
+                                <a:lnTo>
+                                  <a:pt x="7053046" y="305333"/>
+                                </a:lnTo>
+                                <a:lnTo>
+                                  <a:pt x="7139622" y="285140"/>
+                                </a:lnTo>
+                                <a:lnTo>
+                                  <a:pt x="7141858" y="284594"/>
+                                </a:lnTo>
+                                <a:lnTo>
+                                  <a:pt x="7141858" y="0"/>
+                                </a:lnTo>
+                                <a:close/>
+                              </a:path>
+                            </a:pathLst>
+                          </a:custGeom>
+                          <a:solidFill>
+                            <a:srgbClr val="009FE2"/>
+                          </a:solidFill>
+                        </wps:spPr>
+                        <wps:bodyPr wrap="square" lIns="0" tIns="0" rIns="0" bIns="0" rtlCol="0">
+                          <a:prstTxWarp prst="textNoShape">
+                            <a:avLst/>
+                          </a:prstTxWarp>
+                          <a:noAutofit/>
+                        </wps:bodyPr>
+                      </wps:wsp>
+                    </wpg:wgp>
+                  </a:graphicData>
+                </a:graphic>
+              </wp:anchor>
+            </w:drawing>
+          </mc:Choice>
+          <mc:Fallback xmlns:w16sdtfl="http://schemas.microsoft.com/office/word/2024/wordml/sdtformatlock" xmlns:w16du="http://schemas.microsoft.com/office/word/2023/wordml/word16du">
+            <w:pict>
+              <v:group w14:anchorId="032945AA" id="Group 1" o:spid="_x0000_s1026" style="position:absolute;margin-left:0;margin-top:0;width:595.6pt;height:842.05pt;z-index:-251700224;mso-wrap-distance-left:0;mso-wrap-distance-right:0;mso-position-horizontal-relative:page;mso-position-vertical-relative:page" coordsize="75641,106940" o:gfxdata="UEsDBBQABgAIAAAAIQCKFT+YDAEAABUCAAATAAAAW0NvbnRlbnRfVHlwZXNdLnhtbJSRwU7DMAyG 70i8Q5QratPtgBBqu8M6joDQeIAocdtA40RxKNvbk3abBNNA4pjY3+/PSbna2YGNEMg4rPgiLzgD VE4b7Cr+un3I7jijKFHLwSFUfA/EV/X1VbndeyCWaKSK9zH6eyFI9WAl5c4DpkrrgpUxHUMnvFTv sgOxLIpboRxGwJjFKYPXZQOt/Bgi2+zS9cHkzUPH2frQOM2quLFTwFwQF5kAA50x0vvBKBnTdmJE fWaWHa3yRM491BtPN0mdX54wVX5KfR9w5J7ScwajgT3LEB+lTepCBxKwdI1T+d8Zk6SlzLWtUZA3 gTYzdXL6LVu7Twww/je8SdgLjKd0MX9q/QUAAP//AwBQSwMEFAAGAAgAAAAhADj9If/WAAAAlAEA AAsAAABfcmVscy8ucmVsc6SQwWrDMAyG74O9g9F9cZrDGKNOL6PQa+kewNiKYxpbRjLZ+vYzg8Ey ettRv9D3iX9/+EyLWpElUjaw63pQmB35mIOB98vx6QWUVJu9XSijgRsKHMbHh/0ZF1vbkcyxiGqU LAbmWsur1uJmTFY6KpjbZiJOtraRgy7WXW1APfT9s+bfDBg3THXyBvjkB1CXW2nmP+wUHZPQVDtH SdM0RXePqj195DOujWI5YDXgWb5DxrVrz4G+79390xvYljm6I9uEb+S2fhyoZT96vely/AIAAP// AwBQSwMEFAAGAAgAAAAhAORM8Ou6CQAAlSYAAA4AAABkcnMvZTJvRG9jLnhtbNRa224bRxJ9X2D/ geB7rL5fCEvBIo4NA0HW2Hixz6PhUCRCcmZnRhf//Z6+ccaU1U05ycM+WBxa1c2q6lOnTjX19sen w37x0PTDrj1eL+kbslw0x7pd745318t/f37/g1kuhrE6rqt9e2yul1+aYfnjzd//9vaxWzWs3bb7 ddMvsMlxWD1218vtOHarq6uh3jaHanjTds0Rv9y0/aEa8ba/u1r31SN2P+yvGCHq6rHt113f1s0w 4H/fhV8ub/z+m01Tj//cbIZmXOyvl/Bt9D97//PW/by6eVut7vqq2+7q6Eb1HV4cqt0RH3ra6l01 Vov7fvdsq8Ou7tuh3Yxv6vZw1W42u7rxMSAaSs6i+dC3952P5W71eNed0oTUnuXpu7etf3340He/ dZ/64D0ef2nr3wfk5eqxu1vNf+/e303GT5v+4BYhiMWTz+iXU0abp3FR4z+1VIIyJL7G7yhRVhAu Q9LrLU7m2cJ6+3Np6VW1Ch/tHTw59NgBQcOUpOGPJem3bdU1PveDS8KnfrFbXy/ZcnGsDsDxhwgZ 5oJxHw0bl8X4bogJvShHTFo+5YgbbZXP0SnQalXfD+OHpvX5rh5+GcaA23V6qrbpqX46psce6He4 33vcj8sFcN8vF8D9bTiCrhrdOneI7nHxiANLzmzdeUVfnMGhfWg+t950dKemGeOUyeXCHywXUiAE eAWnJ9P9cb4EMHhunEzSa+d3P5lKJkhKRjJJr8H0zJFXL5h7nnau9+3QhGBcYv5wgkqZ0YxKiThd fpJt8iW9pmgnS5yPENq8Kj2vW3Duy5+Tlwj3hAXLTAE4GlDj5oQJIaclKTvpNWXpqwXSGps+Ixmm 13O8XW5qtOH5XU/FFEJ99YKy32ef8K3M/NlnljDxUpXPDyvZpmSn12+e0iXQ/Bo6F4B/WnDuy7O8 gLlOhIjnOeUO7X63fr/b7x0TDP3d7U/7fvFQOU1B6Hv5PuJ3ZobeNKxCF3BPt+36C1rII7rG9XL4 733VN8vF/uMRTQqwHtNDnx5u00M/7n9qvXbxJNQP4+en/1R9t+jweL0c0Wh/bVOvqlapN7hYTrZu 5bH9x/3YbnaucXjfgkfxDfrmzdtuV6/wL6oMPD1roGU1hlXjvYstKLrDRXscqv73++4HCCLkf3e7 2+/GL17cof06p44Pn3a1EyjuzdSLeerFHw/VXbPg7hCShbN3kT5bfrvfdekg3XN0FJ3xTFF9I9ag 1t619f2hOY5BfvbNHj63x2G76wZ02FVzuG0gFPqPawrVA+k7Qi10/e44Ov+AnrFvxtq3lA0A9S/0 aOfo7Bfe6clPF8ILcoJRzqX1XYNRJYhno2qVxBcVglBHm158Uasp8XIFH5Z0iQOJ0xURTk4xIOnP cBSkh3csuOIf4VnQPn+57BLpqJPsEi6ZF8suwagWOA5Hwz4DU440FUyccjQTqLMkzZkgFRiU/l8g vpIzXnxFseyOY+LayJxUUCMxWiEirSXVKh3sZHnGtZRSbXVcAdYyhdZFLGU2YEsrpTVTLuXISto3 vUaPiLBMJHsCqNmCPZEmnomWEG30nJ+/3l9ZRSmi9BFLCFPu6/1Ff5SlktkgGbRQVCqd9UcZZThJ 9gy+pYwmP9JriFcZRpgJmNLcKiPy+UQGkc+Yf64BOZr3B5JQ8GTvhEDBXmmitQr54ZJxUYhXCcAG FOoQxCXkVSFeRa2UJ3/K+0tlzCneC/yX1JJTvBfkR2hCZPL/gvwLxiCXQ7zigvPlWhKR7C/AD2eW 6lfgkxkhbPT/Evy7CoHU9+elyvWF40I+k325fhXFIJHyj9SW+AEZMa7hBAbigog8PyggTMVeBZxa Bqzm+ATVbpmN+TTgCuUp/+V6p4RwGv0xqBxVqBdiwJox/8Ywqwr+EMURc4jXAv7grqz/REg3dPj8 YJ6nqsBvYBNFA94MIYaAe/P7g89j/SI9jAGrOXtpreSRD7G5liI/NkqrrdCh3g2YCARU2B/6I9aX oSBf5Dbvj7DEBL4ymPHRoQv2XCgW+NYwY21h9MKISBQw4/JvAE9VyKe0BBcJMV6OVobYs/4bKziN /giBBpbHjzTICgv90Qhks9CPpEERRvwbKTmyW/AHnwB55+NVWElL/qAFmYB/oxTYurQ/15bH80Km AKeCP8zwhE9tKC30R4n04JSC/2AWLCjsT3H9Ec8LcED7LtgTzhKercLSfP1KXMLR2F8s0Il6yO+v caQy6AcAm8twzfkiX0lcHuAjfLyWOoFSqC8NfkYNuvMFtAG+wnlpDU4OeADZco5cZfGsNTg/4NnC 2KAW8vYKJRXqCweH5lfAg1bod9EfoYws4QGSFh6FeCXUDCnwCQgfsA/2ilBIoJL/uL0M+Af3G4He XYh32h+CSZECPuf+ozCZLNpP+QGY4zCXwc8s/9b135L/s/O11kJMF+Kd8IPWiuZ3ut5NQji9BkEs ZwClhDJMJaUTmyoAC8C/hZtMlMypxDDJAhRh4M3kaKphkAXKuUjSE0k4dlESDJZFBYgtsRAlUB2k IGvmNIcF0K3oCflPmHiUEgkJDtLIL5iIGl+4UG4xleUXTJ0ACzCmFKSWNBgv4qjhvtLhptALMGOf ptVXL/h6vE2Ye3Z5N/sG43uG6ESmL43PgdiTVfIivcYKSHcxQhbInFvwh6cqDhznG5FGdw40hcM3 eVKmoBkZNCo0ochjl2pK40AHYDmtkUMJBCbQ7X3GHAt5lLfGdBzJ3o3huKnI7Q0xjeEs7A3aDFc0 L1Y15iDcRwRrzDiFewZhcEcW9ma4LivcMkhqGExck2WcofKyfkup/HebztqJwUJhWklilOAuw/L5 VhzdMpw76hF6KOuJxiwDHHm/jaQFrWjQLKLU5ZihCzcpELoyCl2OG55Cn7HGiNhWOaaGwlRF0adt dByKjBdEAZCHITiICG41g/7I4YrCExlnNncFWGjBuF4CssPpCyFUQUGA0iD0guKAelAQTzlngCvF ScCtsFBbeTJhwo2kIVQMFxjw8rtrpXGSHgHSqcn87gDraXqXigEF2d1xLrhcCsOs1NBleaRz3CSg LQZnEGnhqlEQImjkFqiIojl6Dxpn3L3ojNDc4OYhmJdDlTjSdFd8QSLxrTeEZ6i8C45J4lLJ1YQr 1AtAgKHd4KCCeRliiE5wgNzvXgawG9h1vJK5oDwwI+JS6eLiU7jABIV6Zy4obXf/iqYRzMvEgetg JD7uXmYlDZpzN1QuMxdQHpgI+4fdWZlP5/oG13qyQEtz8/MyfaZr0Aa/50tJ+/7nRBj/319K+r/x wd8++a8e4t9puT+umr/H8/yvyW7+BwAA//8DAFBLAwQKAAAAAAAAACEAeVijjnxVAAB8VQAAFQAA AGRycy9tZWRpYS9pbWFnZTEuanBlZ//Y/+AAEEpGSUYAAQEBAGAAYAAA/9sAQwADAgIDAgIDAwMD BAMDBAUIBQUEBAUKBwcGCAwKDAwLCgsLDQ4SEA0OEQ4LCxAWEBETFBUVFQwPFxgWFBgSFBUU/9sA QwEDBAQFBAUJBQUJFA0LDRQUFBQUFBQUFBQUFBQUFBQUFBQUFBQUFBQUFBQUFBQUFBQUFBQUFBQU FBQUFBQUFBQU/8AAEQgBBgE7AwEiAAIRAQMRAf/EAB8AAAEFAQEBAQEBAAAAAAAAAAABAgMEBQYH CAkKC//EALUQAAIBAwMCBAMFBQQEAAABfQECAwAEEQUSITFBBhNRYQcicRQygZGhCCNCscEVUtHw JDNicoIJChYXGBkaJSYnKCkqNDU2Nzg5OkNERUZHSElKU1RVVldYWVpjZGVmZ2hpanN0dXZ3eHl6 g4SFhoeIiYqSk5SVlpeYmZqio6Slpqeoqaqys7S1tre4ubrCw8TFxsfIycrS09TV1tfY2drh4uPk 5ebn6Onq8fLz9PX29/j5+v/EAB8BAAMBAQEBAQEBAQEAAAAAAAABAgMEBQYHCAkKC//EALURAAIB AgQEAwQHBQQEAAECdwABAgMRBAUhMQYSQVEHYXETIjKBCBRCkaGxwQkjM1LwFWJy0QoWJDThJfEX GBkaJicoKSo1Njc4OTpDREVGR0hJSlNUVVZXWFlaY2RlZmdoaWpzdHV2d3h5eoKDhIWGh4iJipKT lJWWl5iZmqKjpKWmp6ipqrKztLW2t7i5usLDxMXGx8jJytLT1NXW19jZ2uLj5OXm5+jp6vLz9PX2 9/j5+v/aAAwDAQACEQMRAD8A/VOiiigAoopO1AERx3GaUYx04o9O9cz428e6J4C0x7/Wr+Kztxwu 8/NIf7qr/FVxjKcuWCMKtWFGPPVl7p0ozg5xXOeKPH2geCbUS63q1vpy4+VZpPmb/dX7zfhXyl8S f2u9b15pLTwvCdFsG+X7XKN1w3/sqf8Aj1eBalqV5rF5LeX1zPeXcv3pbiXe7V9ngeGK1b38VLkR +eZjxnQoy9jg488/wPrnxh+2hotoZIfD+lXOrMo/4+Z28iL9fm/PbXk2v/taeP8AVmCWlxa6REP4 bW23P/31JurjvCfwW8aeNFSTS9CuHgf/AJb3C/Z4v++m+/XregfsU65dJv1nX7Wx/wBm1iadvz+S vc+rZHl3xzjJ/wDgR8z9a4jzj+EpRj/4CeL6l8WfGWsPvufE+qPu+8iXjIn/AHwtYVzreoXjbp76 5m/352evsHTf2LvCdup+2anqly38W2VI1/ILXRW/7JXw6hX95pdxMf7z3kv/AMXR/rDllDSjD/yU y/1TznEe9Vn/AOBSPhRLyeH5lnlT/catW08ceItO/wCPTXdUt/8ArleSr/7PX2w37J/w4kXCaRPF /uXso/8AZ6xNQ/Yy8E3S/wCjXerWB/6ZTo3/AKEppPiTL62lSn+A/wDU7NaPvUpR/wDAj5w0X9ov 4g6Ht8vxDNcxf3b5El/9C+evT/DH7a2q2rJFrug214n/AD1spGib/vht3/oVXNd/YhuFR30XxMrt /DDe2wX/AMfX/wCJry3xT+zV8QPCyvI2jf2pAn/LXTW8/d/wD73/AI5V82RY7T3V/wCSkcnEuVe9 7z/8mPq7wZ+0n4I8ZmOKPUv7MvHGfsl+PKYf8C+7+TV6mkiyJvTGK/LK5tp7O4eCeCWGVPvJMux0 rt/AXxw8XfDlkXTdSabT0/5h91+9i/8Asf8AgFeZi+FVy8+Cnc9vAcaThP2WYQ1/un6NHnqKXgDp XiHwt/ad8P8Aj+WGyvyND1l/lFvcP+6lb/Yk6H/dr27cMZHSvhsRhq2En7OrHlP0zCY2hjqftaE+ aJLRSZpa5z0AooooAKKKKACiiigAooooAKKKKACiiigAooooAKKKKACiiigApD0paKAIgeBSEZyD 0p3B9q+e/wBor9oUeBkk0DQJlfXpE/eT/eS0X1P+1XVhcLVxtVUqSPMzDMKGXUJV67902vjb+0Vp nwzhk03Tymp+IXX5bcP8sH+1If8A2WvizxT4v1nxxrD6lrN9Jf3Uv9/7if7CJ/DVjwv4R134meIv sulwzajfzt5sszv9z/bd6+yfg/8As16H8OxDqOoKusa8vz/aJU/dwt/0yTt/vV+gf7Dw7S/nqn5T /wAKfFlX+SgfPXwz/Zd8T+OFhu9QT/hH9Lf5vNuF/esv+zF/8XX1D8P/ANn7wd4CWKW301b2/Qf8 f2ofvZR/u/wr/wABxXpzHb3xSNgKOfxNfIY7OsZjvjlyx7H3+W8N4HLfejDml/NIkCIO1PpBS14h 9TZITFLRRQMTFGKWigApCOOlLRQByHiz4eeH/Hdt5WuaRb3xH3XkT96n+6/3l/CvnT4jfsayxLLe eDr92B+f+z71v/QZf/iv++q+tu1JjIr08JmOKwUr0pngY/JMDmEf30Pe/m+0fl34g8O6p4Y1BrDV rCbTryMZEVwu0GvYPg3+07q3geSLTPEDS6voZ+QO3zXFt/u/31/2a+vPG3w+0L4g6Y1jrmnxXcJ+ 45+/Ef7yt/DXxt8Y/wBm3WfhyZtR00S6toI+fzVX97B/vL/7PX2+HzTBZ3D2GNjyzPzTFZLmPDtT 61gJc0P6+I+2vDviTTPFelW+o6Vdx3tlMu9JYm4NawyQQa/Ov4Q/GPV/hRrSSWztc6VK3+k6ezfL L/tp/davvXwf4p07xt4fs9a0ubzbK8TfGzL/AN9D9K+RzPKquWz1+Doz9AyPPKWcUtfdqR3idIKW kFLXhn1QUUUUAFFFFABRRRQAUUUUAFFFFABRRRQAUUUUAFFFFAEYBzQT6UGsPxd4osvBvh+/1fUJ PJtLSIyu/t6URjKcuSJlOcaMHOR5x+0H8Z4vhh4b+z2TrJ4gvl220Wf9WP8Ano3sK+Q/hx8ONe+M niiZIC5Vm8291Gf51jLfxN/fersNt4g/aI+J0rKWE1225nP+qs4F/qpr7l8A+A9L+HXhu20fS4tk Uf8ArJf4pG/iZq+7lVpZBhfZU/48vwPy1YarxTjvb1fdoQ/Ej+Hvw20f4a6HHp2k2+xB/rJ25llb +87V14UkYalACigD0Oa+HqVJ1Zc82fp9GhTw9NUqUbRJMUYpaKg6AooooAKKKKACiiigAooooASl oooAKikRZF2su5WqWigTSe58kfH79mQxrc+IfB1tlT+9uNLiTr/tRf8AxNe4/Arw+PDvwl8M2RHz G0Sdv96X9636ua9AwMcimhFQBV4WvTrZjXxOHhhqrvynhYXJ8NgsXPF0FyuRYopBS15h7wUUUUAF FFFABRRRQAUUUUAFFFFABRRRQAUUUUAFFFFAEBYYUnPJ4r5L/a8+IU+s63YeBtK3TbXWW6hh+/LK 3+qi/wDZv+BJX074n1y28MeH9Q1a6bZb2UL3D59FXNfMH7M3g648f+OtU+ImuLuEd07WyMuN07fe b/gK4H4/7Ne7lUY0ObGVPs7f4j5DPp1cQ6WW0PiqfF/hPZ/gP8JIfhV4PjhlRX1m8Cy3sw7v/dH+ yua9RAwaB1oz1rx61eeIqyq1PiPpMNhaeEoRoUvhiSUtFFZHWFFFFABRRRQAUUUUAFFFFAFK8voN Pt5JrqRYYY13NI7bVWvLNb/aO0CxneKyt7nUgv8Ay1Rdifm1cz+0l4muEvbDQomZLZ4vtVxsbmT5 9qD/AMdrw+vx7iPizE4LEyweEXw/aOedTkPpvw9+0R4f1WdILyO50xm6SzLui/77r1CCZLqNZImV 42+ZWX+KvhSvo39m/XrnUfDl9p87s62UqiJn/hVudtbcMcVYnMMR9TxK/wC3i6VTnPaaKSlr9bNQ pKWkJA70ANorD8R+M9C8J2ouda1nT9Ih/wCemoXSQL/4+ab4U8Z6D42sHvNA1uw1u1VtjS6dcpOi t/vKavkny81jPnh8J0NFFFQaBRRRQAUUUUAFFFFABRRRQAUUUUAFFFFABRRRQB4H+1prdxH4M0zw 1p3z6hr9/HAsS/xqvP8A6F5Vem/DvwjbeB/B2laJb7dlrFsZh/E/V2/763V5vqunjxv+0vp6yHzd P8Mab9pdT91biU/L/wCO7W/4DXuGA+D0xXpV6nJh6dCP+Jnz+Dpe2xdXGT/wx+X/AASYdBS0lLXm n0AUUUhIHU4pN23AAaWq4uot+zzE3f3d1TggjI5rOFSE/hYC0UUVqAUUUUAFFFFAHj3xz+Gtz4qs 7fVNNi86/tF2tF/FJH/s/wC1Xzbc20ttK8E8TQyo3zI67HSvvAjNZl/oGm6qc3dlb3TL/wA94lev zfPeEKWa1/rNKXLIynS5z4s0XRdQ1++W0020ku525KxLX1b8K/Ag8B+G1tpGV7+dvNuXTu/92urs NOttMj8u0t4YIuyxrtrK8W+M9J8E6RNqWsXsdjbJ/E5+8391R/E3Fd3D3CdLKqntObnqGbcMNDnm dEWx14rjfHPxW8K/Dq0M/iHW7fTsruWJ33SN/uovzNXyt8VP2uNe8QebZeF1bQ7D7ou3+a4k/wDi P8/NXnvws+AHiT476pLql9eTWmjPJm51S7/ezXDf3V/vNX7JTyN0qf1jHy5I/ifHVOJPrFX6vl0e eR6j4/8A+ChECXf9n+BfC9xqt2zbIrjUPkRm/wBmJfmf/vpa5f8Asf8Aaq+Oq+ZNfSeCtKl+5uk/ s7/x1P3/AP33X1X8M/gZ4N+EtsBoekRJe7Nsl/cL5lxJ/wAD/P5Vr0fBVe2a4p47DUPdwlL/ALel qetQwOLq+/jKv/bsT4P07/gmRca3cG+8X/ES6vLqU7pfslrvf/v7I3/slfSH7P8A+zT4W/ZzsNSt vDk1/dz6oyPd3WoS73k2b9vyqqqv327V7FnHWgniuHEZhicTHlqy909ajg6ND3oxJKKKK4DuCiii gAooooAKKKKACiiigAooooAKKTNLQAUUlLQB5f8ACfT/ADvEHjfXpFxNfaq1oj+sUCLEv/j2+vTP Wud8D2H9m+G41/57zz3X/f2V5f8A2euiFaVZc1Q48LT9lRih9LRRWZ2Ee7A5r5m+MPxY1LUtcutI 0u5ks7C1bypHibY07fxfN/dr6ZIylfH3xU8H3vhXxZemaNvsV1cPPbXH8DK38FfnHGlbG0sFH6r8 P2jKp8JyKTMkvm7m3/369u+BvxM1C71dPD2qTtdrOrPbSyvudWX5tprw6vYf2f8AwJfXOvxeIp42 hsrZW8hn6ysy7T/wGvzDhmrmDzKlGjf+9/hMKXxH0rRRRX9LHYFFFJQAw4AoyAK5zxl400b4feG7 zXdf1KHS9Ls03S3E74A/+Kb/AGa/NX9oP9uLxd8Z9Tbwr8PIdQ0bQJ2+zobVf+JhqP8A3z91f9la 78HgK+Nl7nwnDiMXTwvxH2b8Zf2z/hn8HJZLC71V9d1qJ9r6bo6rK8bf7bfdT6bt1fOd5/wVWn+3 5tvh1H9g3Y/e6t+9b/yFXzrp37E/xp1TR21SPwNdxxbd3k3E9vFK/wD2yZ91eLalpt1o9/cWN9BL Z3drK0U9vcLseJ1++jpX3OBybLKkeTn55nzeJzHF7/Cfsn8E/wBqTwd8bPBN/r+nPJp0+lxebqVh ecS2vy7tx/vLhT83tXyR8V/ijqPxR8TzahdSMllG+20td3ywL6/79fNX7Ofiq98PfEq30+0lZE8Q WsuhzxJ/y189NsX/AJF8qvYa9TKsnoYLFzktex8HxVmlevSpUl8J2Pwi+HL/ABO8eWGjszLZf6+7 ZP4Y1+9/8R/wOv0X0bSLPQtMtrCygjtrW2j8uOGJcKi+lfHX7F15bQ/EPVoWK+fPYfu/+Auu6vtT APSvkeKK9SeN9l9mJ9ZwbhqVLA+3j8Uh9LRRXyJ+hBRRRQAUUlLQAUUUmaAFoopKAFoopM0ALRSZ zRmgBaKKSgCJgBzg1yfxG+ImlfDTw5Nq+psfLX5Y4k+/I391a6zOWB7Gvnj9sbw5e6v4IsL60jaa Cwud9yi/woy7d36/+PVjWlKFOUonq5Vh6WMx1KhXlaMmc/pf7a0c2rImpeHWt9OduZo7jfLH/wAA 2/NX0xpes22sadbX1pIsttcRiWN0bhlIyCK/L6GFppUiiVnlb5ERP4q/Qb4UaBqXhn4ceHtNvIXN zDaIZF/uFvm2f8B3bfwrzcBialVy9ofecWZFl2WqjLDaOW6ueK/GD45fHzwn47utB8EfCcarodsi i31O5glnS5+X726KVFX/AHaxrD9ov9pmBd+ofBu2dPS3tp93/o1q+zx9KCRX08cTTjHl9lH8T8cl h6kvhqyPjKX9ufxt4VUDxZ8ItR0tP+ezyy26f+RYsf8Aj1dp4Y/bx8D61sXUNM1bR3b7zvEkqf8A jrb/APx2vpN0SRCrqGB/vc15F8QP2XvAnj9ZZTpUWkak/K3unL5Tbv8AaX7rfiK7qWIy2r7tely/ 4ZHlVsPmdL3sPV5v8SOp8I/GPwb432Jo/iC0uZm+7bs/ly/98Nhq6u+0+11azaC6hju4H+8ki7lr 86Pid8G9c+D+rpbagTdafK3+jX8afLJ/8S3+zXW/C39pLxJ8P7qK2vrmTWtFzta3uG3zRL/sv/7L XpYnhyOIoe1wcueB8/R4rlh8R9VzGlys+zbf4Y+Fbabz4tCshL6+UGrqY41jXaq7Vr5e/aU/bU0v 4NeDtEufD9vFruv67CbixhmZlihi/wCesv8AF975dv8Asv8A3a+QF/4KQ/GM3nnmfRPK/wCff+zv l/8AQ99eHgOG6s4ueHpRj/5KfXzzLDUj9ZKK/PX4d/8ABUqXzoYfHPg9drfevdBl+7/2yl/+O19g /Cv4/wDgT4zWol8K+ILa+lVd0tkzeXdRf78TfMKjE5ficJ/FgdNHG0MR8Mj0rtXMePfG+kfDjwpq fiPXLpbPTNPiM00p7f7K/wC03T8a6fgjNZuo6VZ6vCsN5bxXcSurKk8Ydd6/MrV50fi947Jc3L7p 8Eah8KPij+3P4mh17xM1x4C+Gdu+7TdOuFzcyr/z1SL+Jm/56t0/g3V9b/Bz9nrwP8EdNEPhjRI4 Lp0Czalcfvbuf/elP/oK4X2r048Dk4HtSHlOOK76uOq1Y+zj7sP5Tjp4WnTlzv3pDvX6V+Un/BSX w5Y6F+0RFd2caxS6tpEF5c7P45d8sW7/AL5iSv1bxx+Ffkp/wUX15dY/aZv7ZW3f2Zp1rZ4/4D5v /tWva4b5/r3u/wArODOLfVjxH4RPJD8WvBTRf61Nas9v/gQlfcX7Sfwwl8BeN5b+3j26PqrNPD/d SX/lqtfHX7NWiP4g/aB+Htoq7/8Aie2srf7kT+a//oFfsb8TfAFh8SvCV1ot6uBIN0cv8UUn8LV9 NmWZfUMwpS+z9o+Sq5THNcBOP2o/Cfnp4I8Y3Pw/8XaX4gtPnazn3On9+L+NP++K/Sbw9r9p4m0a y1Wwk86zvIlnif1Vq/M/xr4Tv/BWuXuj6pA0V1bNtb+4/wDtp/s17n+x18axpWpDwJq1x/ol027T ZXb7sv8AFF/wL/0L/fo4hwUcZQjjcP8AZ/8ASTxeFMfPLq8sBiPtf+lH2tRSDpRmvzE/ZRmQBXkP xR/aR8M/De8fT28zU9VVfmtbTny/99v4a9ZmbETfSvzC8U29/aeJNVj1RZDqK3Mv2ky/e3b/AJq+ jyPLqWY1ZKq9InxXE+b18qoR9h8Uj6Km/bfvC+IvCUKr6vf7v/aVaui/tvWE8xTWPDVzZwH/AJa2 dys//jrKlct8MPH3wZtNBtLLXfDUUF9HEq3N1eWf2pZHx8zbvmY/9816RoXw5+DHjzWrG88Pz2Av YJVuBaWtzs8wL/C9u38P/Aa9jE0MvoqUKmFnH+8fPYLE5niHGdPGRl/dPT/GfjuPwn8PrvxQtpJc RQWyzrat+7c7tvr9371eE/8ADcUeP+RTfPr9t/8AtVeu/tErj4KeJtp5SBf/AENa+E/AlhBqvjbQ LG7i861utRgikT+8rSpurPJctwmLw1avXj8BtxHm2PwWMpYfDT5eaJ9JJ+3BF/F4TlH/AG+j/wCI rtvA/wC1b4Q8V3qWd20+h3cp2oL3b5TN/vqf/QsVr3H7NPw2ubMqNAjiOz78VzKrL/4/Xw7400i0 8P8Ai7WtNsLj7VZ2dzLFHJ/eVWrbCYLK815qVCEoyOXHZnnWS8lXE1YzjI/S+91K203T5Ly5mjgt Y13ySu21VWvnvxd+2boOmXckGhaTca3tO0XEsn2eJv8Ad+VmP/fFc1quo694m/Y6tJ08yZoJfKnb +NraKVl/8d2r/wB8V86+E77StO8RWNxrdhJqelRybri2jO1mX6VllmS0ZqrOv73JLlsjfOuJMTSl Sp4b3eeMZc3+I+hk/bfvg+T4TiK/3Y75v/iK9K+F37Tml/EvW49F/sm903UZUd1PyyRfL/t//Y1y Ol+NPgDr9olvNpNhpkjDpc6e0Lr/ANtVH/s1ej/CT4b+AvDl7f674QmiuxeIsReG589I1H8KcnA/ +JrjxscFCnL/AGeUJHdl1XMqtaNsZGpH7R5neftuR211NB/wiTP5TMm/7d/9qqL/AIbliP8AzKMn /gw/+1V63cfs5fDyWR5W8MweYzbixlk/+Kr4v+N2hWHhf4o69pelwJZ2NtIixxR/w/uUr0csoZRm FX2UaUvvPMznF57lVP29SvHl/wAJ7n/w3HFj/kUn3ev2/wD+1V3Xw1/aEg+JWj+J7t9Ba1TR7ZZ2 je483z9yv8v3f+mdcL+zZ8HPCHjr4c/2lrejx3t79rlj81pGU7fl/utXrt38NvDXw+8E+K30HTI9 ON5p8om2MzbysT7fvf71ebj/AOy4Slh6NOXNe2vqetlc87qwjja1ePs+W58+ab+0p4N0fU/7Qsvh dp9pe/e+0RTqjr/5Cr7JgmWSFG2DkV+WFfqhYqPskPH8Iqs+y7C5d7J4eHKpK5fDed4/OJVViqvM 4Fuiiivkj78TFFLRQB5j8ffDtp4l+E/iKG6CE2to97G2PuSRqXH+f9qvzyr76/aj8Up4Z+D+qqG2 XGolbCP/AIH97/xxXr4P0jSrnWtUstPtF33V5KsUSf7TPtr9O4Xc6eDqVZ/BzH4pxoo1MfShS+Pl PB/jrNfP4wtILxm2QWMSQI/8MTO8v/oUrUnwD+FR+NPxb8P+DzcNZ29/KzXNwq/OsUatK3/A9q17 b/wUR+Gq+AfiL4Sntkxp91oEVqjn+OWB9r/8C2PFXl/7JHjeL4f/ALRPgjV5222j3n2Kdnf5FWdH i3f8B83d/wABr1ZYl4jATxGG3Pdw+G9hUhQrfZ5T9E/+HefwU/spbT/hHbrzVTb9t/tOfzv977+z /wAdryfxb/wTKTSb9NV+G/jrUNE1OBt8Calztb/Zni2sn/fLV93DpQa/LY5li4S/iH37wVCX2T5D +G3xc+MvwbvbfRPjJ4Yu9e0Dd5UXjHRIvtXlf7dwkX8H+1sVv96vrdJFlTep3K3SpBg9qXOe+K5K tZVZc3Lym1OnKn7vMPxRilorE6SJ+FJr8Pv2jPFP/Ca/Hfx1q6vvin1WdIn/AOmSN5Sf+Oolfsp8 WPF0fgT4a+KvERZQ+mabPdKf9pEYr/49X4Uu7TSuzNvdvnZ6+54Woe/Vqnyud1PhgfTX/BOvwp/w kX7Sen3zLui0XT7m+b8V8lP/AEdX61Gvg3/gln4HNn4a8Y+Lpo/nvLqLTYH/ANiJN7f+jU/75r7x B614ufVvbY6f909LK6fJhjx79oP4IQfFfw/9otFSHX7Nc20zf8tP+mb+1fnbrdtfeG9WlgninsNT spfmR/leKVa/XHKhRySDXzt+1D+zdF8UNMm17w/AsPiq2j+ZD8qXyL/A/wDtf3Wr0cjzh4X/AGbE fAz5vPsj9v8A7ZhfjX/kxsfsv/HqD4x+E1tb+RE8U6YqpfQ/89V/gnX/AGX/APQs17lgYNfj54R8 da98GfH9trWm+bZ6lp0/k3FpcfJ5qfxxSrX6ofCn4n6N8XfBVl4h0eUNbzrtkib78MnG6N/9oVyZ 1lf1Kr7Wl8EjtyHNfrtL2Nb+JE7FXAODjPoK8P8AHn/CofiJ4ku9I1y6sI9bs2EDzySfZn3f3PN4 Vv8Ad/Svapo/MjdVJQsuN69q+TvGH7GeryXtzd6P4iivvPdmb+0wyt/wJ13bv++K4sshQdVyq1fZ +ZvncsT7OMaFBVY/a5jY1z9jvwxdWrXOjeKbiAfe3ziOdP8Ax3ZXzBr+lt4X8Q3VlFew3ctnPtS7 spflbb/ErV6y37Ifj9XxjTHH9/7U3/xFdd4M/YtvpLxJ/E2swxWq/et9P3sz/wDA3+7X3FHH0MEp fWMV7WPY/NcVlOKx8o/VcH7KX+I6WbxNqPi79j681HV2ea+MDxNM/wB6XbcbVavknSku7nVrKLT/ ADP7QadVtvKfY/m7/k21+hPj34erq/wqvPCOgxw2KPbrb2yyD5I9rL/hXz94R/ZI8W6D4s0XU577 SZLezvoJ5USWXe6o6t/drz8pzXDYehWcvd5pStE9TPMlx2Ir4eMY83LGMZSOMl8CfGvUYngnj8RX MUibHSXUW2N/4/Wx4I/ZD8Xa1eRNr/l6HYf8tR5qyyt/uqvyCvt5VCqOKCA3vXkT4ixKg4UYRh6I +jp8JYTmU685TOVS00H4a+ChEVW10TTLb5t2Xwij9a8al+FvwX+LMv2vR9Qgsbqb52TTrnynH/bB vu/98V6t8V/h2vxO8JS6E2ozaWkkiO0luu7eF/gZf7uf/Qa+Y9W/Yw8X2krfYNR0y9i/6aM0T/ot Z5Z7GSlOeI9nUKzqGIhKFKlg41aQ/wCKn7Ltj4G8P3mr2PipXihjLLaXqIrSf7Kv/e/4DXlHwt8W ap4R8caRdaTPKkr3MUMsKfcnR2+41eiWv7Hnju4k2yPpdun957l//ZUr2X4Qfsr6b4D1aDWdXvBq +qwfNAiRbIIG/v8A+01fUVMzw2Hws6WIq+3kz4qlkuMxOOhVw1D2EP8AEfQCH5OfSvzz/aO/5LV4 n/67xf8AopK/Qz+E5r5R+K/7L3inx18RNZ1yyvdMitbyRXjS4kl3jESJ2X/Zr5rh7F0cJipTrS5f dPsuLMFXxuDhSoR5veO6/Y9/5JN7/bZf/Za9S+IZz4E8RZ/6B8+P+/TVyfwD+HWo/DDwP/Y+qS28 12bmSUNaszJtbb/f5rtvFWlya54b1SwiZVmuraSJXb7u5l215WLqwqY6VWL93mPcwNCrSyqNGUfe 5T8wa/VGyDGzh/3B/Kvixv2MfGq9dQ0T/v8Ay/8AxqvtW0jMVtGh6hcV7/EeNoY72Soz5lFHy/CO W4rL54h4iHLzWLFFFFfGn6QNIFGB60dq53xr4rsvA/hbVNdvzstLG2eeUjuFH3aIRc5ckTOc404O cj5B/bS8fnWfHen+GLaTdb6TF5s23/nvL/8AEps/77qx+x58O317xbP4muYv9C0pdkG/+Kd//iF/ 9DWvnP8AtLVfiP40lu2VrjV9YvNywp/E0r/cr9L/AIT+ALf4a+CNN0SHbJLCoaeVR/rJW+81fouY 1Y5VlkMFD45f1I/K8sw0s4zeeOn8Ef6ieAf8FHfhi3jT4Ff27bR773w1cre/IvzeQ3yS/wDsrf8A AK/KpHZHRlbY6/7Vfvl4g0Sz8S6FqGkahALmwv4Htp4m/jjddrD9a/Dz4ufDu9+E/wAStf8ACmob jLpdy0SO6f62L78T/wDA02NUcM4uM6c8JPofU5xQ5Kka0T9hP2a/ignxi+C/hnxG8nmXstssF9/s 3UfyS/8Ajy7v+BV6rX5v/wDBMX4uf2b4l134eX0+yLUV/tLTkf8A57r/AK1f+Bptb/tk9fpBXyGZ 4T6pip0j6DBV/rFCMh9FFFeYd4UUUUAfK3/BRjxqfCv7OV7p8b7bjXb6309ef4d/mt/6K2/8Cr8n a+5P+Cpfjn7Z408H+E42+Wws5dQlTd/HK2xP/HYn/wC+q+bf2ZPhr/wtn45eEvD7xedZNeJdXn/X CL96/wD6Bs/4HX6fksY4TLHWn/iPh8xl9Yxnson6rfsqfDtvhf8AATwfoksRivPsa3V0rr8wlm/e un/Ad+z/AIBXr+OtIAEwtOr80rVJVasqsvtH2VKPJDkHY4oxS0VmbHyn+1h+yfD8T7KbxL4Wiitv FcSbpLcfImoL6P8A9NPR6+Q/2f8A48av+zl4/mS+guf7Fnl+z6xpjptlXb/y1VP+ei//AGNfrGAM EV8u/tWfsj2vxk0+48R+HIotP8aW8eP7sWoJ/cf/AGv7r/8AfX+z9Rl+ZxlT+pYzWH5HyeNyvkrf XMJ8R9H+H/EWn+K9Es9W0q5jvdOvIlnt7iJspKjdDWpx0r8w/wBkv9pnUP2ffGc/w/8AHiz2Hh2S 58pku12NpM/97/rk38X/AH3/AH6/TaCeO5iSWJleJ13KyfxV42OwcsHV5fsnu4LFRxVPmLOBRgUt JXAd4YoozRmgBaKKKACikpaAEwPSijI9aWgApMUtFACYopaSgBaKKKACiiigCIjpXxf/AMFAPi0l nYaV4CsZsz3m2+1DY3/LJD+6T/gT/N/wBa+ufE/iKx8KeHtR1nUZhb2FhA088p/hRV3Gvyu0u013 9qr4+3DruSXWLnz5X++tnar/APErsSvpshw0JV3iqvwU9T5PiCtUeH+q0PikfRf7DHwia9nk8d6n Bi3ty1tpiuv3m/jl/wCA/c/76/u19vAYrE8JeGtP8GeHdO0XS4FtrCyiWGCMdlFbh6V5WY42WYYm dWR6mV4COX4aFKIgFfBv/BTL4ItqGj6b8S9Nt/MlsNlhqoX/AJ4s37qX/gLtt/4GtfeOcAVkeK/D en+NPDmpaHqkC3Om6jA9rPE/R0ZeazwWLlgq8KsTsxNGOIpSpn4ZfDvxxe/DXxxoXifTWze6ZeRX Spu+/t++n/A0+Sv3I8F+KrDxx4V0nxBpkvnafqlrHdQP/sMu4V+J/wAbfhVqHwV+JmteE9S3OLOX /Rbj/nvA3+qb/vmvur/gmb8ZTrvg3Vfh7qE5e70RvtljvP3rWV/nX/gEv/o2vts/w8cXhoY2l/UT 5zK6n1erLDzPueiiivzw+vEpv8FBrkPit4zj+H3w68S+JZNpGmafPdKG7uiEqv4tgUQjzz5DOcuS PMfkR+1344/4WD+0b431JZA1vb3n9nwYb+GD91/7Lv8A+B19T/8ABMD4WG2sfEvxAu4cNOw0ixd+ uxTuuG/FvL/74avgOzs77xPrlvbQJJeanfzpFEn8csrP/wDFV+4HwW+HNt8I/hd4Z8JWu3GnWaxy yJ0ll+9K/wDwJ2Zvxr9DzuusFgKeDgfKZdS+sYmeIkd9RRRX54fXhRRRQAUUUUAfNn7Vv7I2i/H/ AEo6lYtDovjK3TbBqZjys6f88p8dV/2uq1qfsj/D/wCIvwt+Hcnhzx9fWOoLZTmPSWtZ3leODH3H YqPl/u/j/s1730HFeM/tCfEvxT4B0VR4d0We58xS0upeV5sVqv8Au/3v975a9GjVr4qMcJf7zysR 7HBKWLkeykrkelNzwSvPsK/Oaa9+MXxX8y40i88R6mi8FrSdoYlf/wAcWvKNS+L3xh+DPiGW2m8R +IdI1GD52stTnaZD/wABl3o9e4uHZzfLCtHm7HgU+JI1OWXsJcp+uPJpCxPTGa+Zf2dv2jdQ/aJ+ C/ia4FsbPxlpMEttOlif9azxOYZYv7u7b/30pryO80347iL923i7f/sTy/8AxdeXRyqdSc6VWcYS j3PRxucRwqg40pT5v5T74LAdcUHp1wK/J34g/FD4ueCtYfT9U8WeJdLvFVXa3l1OVWVf++69L/Yc 8WfFX4gfGZL3UvEPiHWvCFhBOl697fSvaJKy/InzN8zbq7sTkFXDYeWIlVjymOCzyGNq+yjSkfos CBj0rzH40fGe0+D+mWM01m+oXd5KUjtUkEZKr95/w+X/AL6r0x3AA47Zr8/P2i/Hp8e/E3UGhl32 Gnf6BbbP4tv32/763f8AjlceTYCOPxPLP4Y7kcRZpLK8JzUvjl8J9T/BH43T/GGfUv8AiQHTLezV M3DXHmBnb+HG1a9dYgA5IFfLlz4jl/Zi+DOh2NtaI3ibVw07iXokpVd7v/ubokrwlfFHxX+MviH+ ztJ1zVr6/ZPNaK3vPssSr/e+Xaq13/2Q8U54il7lJdX5HmU+IHgoUsLXUqldn6MiVW6EGpc8dK/K b4h6r8bf2fdatf7W8R67pctyrS2zHUvPt5yn3/4mX/gD19UfsWftWaj8ebfV/D/iWKD/AISXSYFu BdW6bUvIN23ft/hZW2/99Vx4nJ6lCj9YhJSge9g82jiZOnOHLI+rs4xzRwMnNfnBqXxV8b/2pdRR eKdY/wBeyIiX0v8Ae/36g8Tr+0Fb20s8c/jaKCNfNZ0nnVVWu6XDtSHLz1Y6niUeK6ddzVOhL3D9 Jg4PcUufpX4v63+0J8UIF/dfELxKn+5qs/8A8VX6T/soT+JdV/Z78HX3iefUb/WrqCaeW5vbqRpp EeeRomYluT5ZjrhxuS1cAk6stz3MJm8MWrxie9jp9abnHWlrlfiJ46034beDtX8TavJ5Wn6XbNcS 8/M391F/2mbC/U14MY80uWJ7spckbnyR/wAFE/jcNO0zTfhrpU4N1qJS81Mo33YN37qL/gT/ADf8 AX+9Xqn7GnwDPwh8BJqmr2+zxPrSrLdI6/NbRfwRf+zt/tN/s184/si/C/Vf2kvjJrfxl8aQltLg vvNtYHGUnuv4FX/plEmz/wAc/wBuv0YCANmvfxteOFoRwNL/ALe9TxMLQdevLF1f+3SaiiivAPeC iiigD5E/4KB/s9/8LT+HY8XaPbBvEnhuN5CiL891Z/8ALVPqv31/4F/er88PgD8VJvg18V9A8Vx7 vs9rPtvIk/5aWzfLKv8A3zX7iuAV+bpX5Gftwfs6N8EviQ+q6RbbPCfiCVp7TYnyWsv8dv8A+zL/ ALP+5X2mRY6NWlPL6+z2Pmczw0oS+tUj9ZtN1S21awtb6zmW5triNJY5UbKsrcq1XjyK+RP+CdHx lPj74UyeE76436t4YZYYw7fM1m3+q/75+ZP+ArX13718nisPLC150pHuYassRSjUiKelfJv/AAUg 8b/8Ix+z8+kxvtuPEGoRWmz/AKZJ+9f/ANFL/wB9V9YjpX5nf8FPvGzax8UvDHhSBtyaTp/2h0T/ AJ6zv93/AL4iT/vuu/KKPtcdC/TX7jnzGp7PDSOZ/wCCdPweHj74xP4pvoN+leFV89N/3Xun/wBV /wB8/O3/AAFK/VfHGK8U/ZJ+DK/BL4J6Po1xFs1m8X7fqf8A13l/h/4Au1P+AV7WDmlm2K+u4qU4 /CGAw/1ehyj6WiivJPSCiiigAooooAiwMAUhiDdRmg54rzL45/FtfhJ4ZivVtGvLy6l8i2Td8u7b 95jWlGjUxFSNKn8TOLE4inhaUqtX4Ym3458feGPhB4Zl1LV54dPtE3eXDEvzyt/dRf4mr8sv2ivi xffHj4jSatHp7xKyJp+n2USbpvK3vs/3md3rrPir431nx7qcuo63eyXc7fcTd8kS/wB1E/hqf4K/ HbwD8D/+JlL4Hu/EHiXHOo3F2i+T/wBcl2fL/vfer9MwuU1MppfWOXnqn5nUzhZvXjSh7lI+r/2E /gHqXwU+HeoXfiBBBr/iCeO4ltBz9miRcRo3+18zt/wOvU/j/wCLNV8EfCrWtV0Qf8TKJYo4m8vf s3yqm7b/AMCrxv4R/t4aJ8T28SeZ4budCj0TTzftNNdpKJfnVUiXC/eZmqnov7cM9pDjxB4aWX/p tp8+3/xx/wD4qvlPqWPxOJlXlS5ne59bicywGFoRwzqcvNE+GfGc19c63Lear59zdzy+bK93v3y1 9p/si/teeDtdn0v4bN4bi8G3e3Zp6Wb7rS6b7235vnSRv9rdu/vVwH7S37XuifE7wDd+F9P8LTLL dNE32zUNu6Dawb5UX+Pjb+NfPf7L3w01z4kfH7wqukQS/Z9I1GDUr67T7lrFE2/52/29mxK+txdL 69gZSxkPZOGx85lco4LE8uGqe05j9Sfj14//AOFefDfUr6JxHqEy/ZbT/rq38X/Afmf/AIDXyF+z n4BPj74naesyb7DTv9Mud/8AFt+4v/fW3/x+um/a3+IB8TeN4tBtpN1lpC7W2P8Aenb73/fPyL+L 17b+yh4A/wCEV+Hi6pPEEvdaf7W3/XL/AJZfp83/AAOvIpr+ysodT7dUxrXz3PY0/wDl1SMj9r+y 8P3Xg+wk1LUPsmrQSM+nxou55z/EmP7v3fmr5J8GePPE3w98TLqPhYeZqUsX2d7fyPN81f7u3/gF e/ftpeF9UXxHpGurFJLpH2b7KzJ9yKXezfN/vbv/AByvP/2f/jRoHwd1rVJddsZ7iG+iiVby3iV2 g2u3y/7rbv8Ax2vTy1ShlD5I+1/unlZo/aZ7aX7r+8eDftC/Fjxv8T9Wtf8AhMk+xvYxN9msvsfk LFu+++1/n/gr6C/4JoaV4PhHiPULbWDdeOZ4xFcaZNGYvItd/wB5P+eu5tm5/wCH5B7tyP7Zf7SX hP4zaDpekeHtLuXls7r7Q+pXUSo23bt8pP8Afz/45XMf8E6/AOva18e4vE9nBNDoGj2twl3d/wDL KV5U2pF/vfNv/wCAUsW/aZVLmj7K32T6PL1y473Ze1/vH3A/7JfgWS9+0iK+3M27/j5NcJ+3Z8Xv +EP+H6+EtMm8vVddXE2z78Vr/H/3393/AL6r6W1vWLbw9pN3qV7IkNrbRNLLK38KrX5S/Hbx3d/E nxnqmu3e9fPk/cRH/llF/AteDktCtmWJVXES5oQOrPKmHyvDSpYaPLOqY/7PXwUf46fF7StDkib+ xYG+26q392Bf4P8AgfyL/wADr9fbW2jsraOCBFhhjUKkaJgKPSvAP2L/AIMD4VfC6LUL2DZ4g1/b e3W9fmii/wCWUX4L83+8719BmTBxivOzvHyx2Jcafwx0R7uT4VYPCxdT4pEtYfi/wlo/jnQrnRNe 06DVdKuinn2lwu5H2tuX/wAeVfyrfpleCfQGXoHh7TfCuk2+l6Pp9tpWm2ybILS0iWKKJf8AZVa1 6KKACiiigAooooAYelef/Gn4SaR8a/h9qnhXWFAhul3QThfntp1+5Knupr0CkxVRlKnLniZzhGce SR+PPwY8R61+yD+09b23iJWs47W6/svV0/gltpf+Wq/3k+5Kv+7X7AxSLMgZW3KwyrLXyx+3H+y/ /wALp8HjxJoFp5njXRYzsRE+a+t/4of97+Jf++f4q0/2DvjG3xO+CdppWoSF9e8Muum3isfmMXWB /wDvn5frE1fQ5hUhmFCGMj8cfdkeThIzwtSVCXw/ZPphzha/PH4WfDtv2kf23vGvjfUIxP4Z8Mar 8jMvyTywfurdf/IXm/8AAf8Abr9DZD8n1rhfg98JtH+DfgqDw7o26ZRI09zdy/625nY/PK/+0a8j CYn6rGo4fFL3TvrUfayjzfCd+BgYpaQdKK4zrFooooAKKKKACiikNADDXJeN/hzoHxDtYLfxBYC+ ihffGnmPHtb/AIC1dZgEdaTB7ciqjOVOXNEwq06daPJVjzRPIbj9lD4XXIxL4YMn/b9cf/Hay5v2 KfgxN/rPB+/66jdf/Ha9zwaXNdf1/F/8/Zf+BM445dhIfBSj/wCAnkvgL9mL4afDC8v7nw54Xjs5 r+D7Lc+bcy3CSxbt2wrK7L/DS67+zD8OvELM8/h5bZ3HP2WeWIf98q239K9ZCj0ox7VEcZiYS541 ZfeXUwOGqx5Z0ongNv8AsSfCf7SZ59BnvW/u3F9Nt/8AHWr1HR/Bel/D3wxc2PhLQrDTkSN2itLa JYEkk2/LuYD/AMerrgwoqamLr1f4s3IqngsPQX7qHKfE1l+yn441jxZHd+IPshtbm786+njufndG fc9fZ9napZQRQxIqRxrtVV/hqxgg07pXRjMwr49RVX7JxZdlGGyxzdD7RUv7CDVLV7a5ijngkXa0 ci7lavJ/EH7Knw28RytLPoAtpX7Wc8sK/wDfKtt/SvYhQT6Gualia9D+FPlO6vhKGI/iw5jwPTP2 JvhJp9z58nhx9Qf+5d3crp/3xv217ToHh3TfDGlxabpGn2+lWEC4jtbSJYok+irWmPwpxFFbE16/ 8WfMXRw1DD/wocpz/irwnpnjTQ5tJ1aA3NjPgSRrIybv++a84H7JnwsW7iuT4XVpIJFlTddzsob1 2769hAK+i077w7GiFetSjy0puJNTCUK0uerCMpEijaoFLigUtYHWFFFJmgYtFFJmgBaKKKACio2y e9UpreR/uvRykcxd81f71N+0Rr/FWZLaTmqE1hc1t7OJj7SRtm9gJH7wV4ZpvwVHgL9oFvH3hKSC DSvEEbweI9JLbEL/AH0uov8Aa3/eX/aavTX028/2qi/s28/2q3pxVNS5ZfEZSm5/ZOs/tK3/AOeo o/tK3/56iuQ/sq89WoTSrz+61Z+ziV7SZ2H9oQf89RTvtcT9JK5qHSLvb91qsJo9zUcsTaMpHRB0 fo1LWPDpU6fxVoQ2zJ/HWfLEst0UxKdUli0UmaMigBaKKTNAC0mKM0tABRSUtABRSZooAWikzS0A FFFJmgBaKKKAEoozRmgBaKTI9aWgDx34mfH21+HPim20I6Jf6vdz2q3SiyHRd7L/AOy0fD39ozQ/ G2vjQriyv9C1eTmK31GLZ5v+7XI+Pte03w1+1N4evtUu4bGxXQ3V5Z32J96Ws/4meLdB+IvxS+Hd j4Tni1PUbPUVuJ7m0+dYrferP830Rq+hWFpSpQXs/ijzc33nxNTMcSq8pe1j7suXl/m2PpdmC4GQ PrTkGFPavnj49XviWf4oeBtG8N6tcaZNqEc8RCysU4wWdl/i2LuNdN401TUPgX8Dp2XU59a1WD91 HfXnzO8ssv32/wB3d/47Xm/U3y0+WXvS+yez/acYyq88fdp/aOnu/F+v3nxCg0TTNH2aNbr5l9ql 6jqrf7EGPvNXdMwzg8GvjS+1dvBejweKNL+Kj614oiaKW806a9823uv7yIn+f+A16t8bfE2oWnhT wZ8QNJvLyGxs7qCe8t4pWRZYJdv3l/i/u/8AA66a2AlzQUfte7/28cWGzbmp1Kk/s+9/26e6nOTx +NMdQuWJxkV4t8U/EV74j8d+BPCmiahNai+uBqN3LaTtE5tYhnbuT+F8sPwrnPjV4zk1j4nQeDJ/ FR8IaDbWgub68im8mWdm+7Ej/wDfP/j1c1PAyqSS+Z2V82p04Smo7S5f+3j6OBBUMp3YprsABwPq TXzr8FPGB0T4mz+DrfxS3i7Qbqz+1WN09x50sDL96J3/AM/w1Q8S6d4l8e/tB+JfC9l4n1HRtFS2 gnuPs8rZRdi/Kn93czH9a1/s9+0lGU/d5eYwecfuI1YU+aUpcvL/AHj6bRg3IwR6iuYm8faPa+M7 fwrLMw1i5g+0xReW23Z838X/AABq8n+Dk2t+A/i3r/gHUtYudbsEs0v7S5u23Og+Vdn/AI9/47XH +Ofh1qOqftLW2nR+J9UtJdQsZLyG6hlYPbJul/dJ833fl/8AHqqlgaftJU5y05eZGdbNa3sIVaVP 3ubllE94+K+oeKtO8JNceDbOC+1jz418uY8eVn5q62x89rOL7SqLcGNfMVT8u6vIf2irrUPC3wSm +w6jdw3lq1tF9thlaKUnei7t1Wvjf461bwj8P9Nj0eULrWsTw6fazN/Czr979P8Ax6s44aVSnTUf tSZ01MbGhWqSqc3uxieuKQX5I3HggGnsoQZzjHrXy34w8EeK/gVo1v4zs/GOo61Jayxf2jaX8rPF cKzbf73956679pjxXqFp8LdL1TRL25s5ri+gaOW3l8p3VldttN4LmnGNOfMpaELNeWlUlUp8so+9 ynum8N91wW707aOnavk/4g+EPGHwd0yw8bt4y1DVL+O4ia/tJpH+zOGP3VTdwv8ADX1Zbz+bbxSA 5Vl3VhiMMqUYyjLmjI6sFj5YqUqdSnyyjb8TmfHvxA0v4a+H5dY1aRlt0O1Y4l3PI391a820T9pn 7Zqlha6l4L13SLW/nW3trqaD5Hdvu9dtbX7Q3gPWfHHhWwOgxxXOp6XfJqEdtM2En2bvk/Wub8N/ tJxLq1nofjfw1eeE9RlZUSa4jxA7f3st93/x6u3D0KcsPzRhzS166x+XU8zGYytSxnsp1PZx93l9 33Zf9vHvrjcnUAe9ImwqQCCPavOfjPo7av4etRJ4xfwdYQz7ru6SVYjLFt+5vP3a8i+FPiI+E/jN p3h3R/GMvi3w/qttKwE1wJjbyqrP1/4B/wCPVy0sI6tGU4y+H+tzuxGZewxMKMo+7LrzfofUbyBT jcAT2NIm0EBXHHOK+dvjlL4j1f4zeE/Dmga5d6P/AGjaSrI0UjbFX5iz7f7+1GqvoOl698GPjT4b 0Z/Ed9ruh6/HKrJfOzusqJ97/wBBrWOA5qalz+8483KZSzWUa8oey92MuXm9T2/xP460fwhfaTaa lO0Vzqs/2W1VY2bdL/lq6WN9ygjvXzD+0v4Ru774ieDLhNdvrZdSvUs4oo2+S0bcv71P9v5q7/x3 rN98FPgjKy6pc6tqkC/Z4dQvvmd5ZH4d/wDd3f8AjtEsJGVOl7OXvSFHM6ka1f20fdpnRXPivXr3 4hQaLpuk+Xo1qvm32q3iOivn/llBj7zf7XSu9DZwMda+NNR1T/hB9Fg8UaT8VG1rxPCyS3enTXvm 291/fRE/z/wGvrjQNYi13RdO1GEfuryBZ0P+yy7hWeLwzoqMommW4/61KUZfF8X/AG6cZ8U/iz/w rW4sI/8AhH9T1oXau27T4t/lbdv3vzrgLH9rm21JmNr4N1242NscQw79rV9AXCCSJlK544zXh/7L Sg2fjbIyR4huMH/gCV0Yd4b6tOU6XNKP97uc2N+u/XqVOlV5Yy/u/wAp7ksi7FJOM81IWXGc8V88 /H6/8TD4l+B9J8OatcaZNqK3Eb7JG2D7h3sn8W1d9d7/AMIVqGhfCmbRIvFVzDqEcTt/bt22ZELP uZ23fjXLLDKMISlL4jup4+U6lWnGP8M9GRgSCDke1JkM23dn2xXx3qGq2/wv1/QdV8OfEufxVJLf RW+oWM16LjzUb7z/AH/87q9W+Pmral4MvfCPiy0vLmHT7K/WDU7eKRvKmgk4+ZfunHPJ/vVrLASj KKjL4jmp5xCdOUpR+H4up7lkJ7UjsAOoGa8W+I3iC+8QfFHwP4U0jUJ7WLc2rai1pKy74E+4jbf4 XO8f981U+NPhy31LxBbz6z8RZ/CumfZlSDT4LpIGll3Nufnlv4KxjhfeipS+I6qmYqMZTpx5uU9x BA5P3eBXAeCtT8Z3XjDxVBr9hbwaJBOq6XLF96VOck/N/u1wn7M3i2/1O58V+HrvWz4jtNHni+ya i7bzLE+7Hz/xfdrV+Emr39/8Yfifa3V5cXMFtPaiCKWdnWIFZMhF/hreWFlQ9pGX2V+djlhj44pU KkeaPNKR0fhP4iXWvfFHxh4YltoUtdHS3MUqFt7b03fNXoxFeHfDEf8AGRnxRz/dsv8A0VXuOcVz Y6nCjOMYfyx/I9DLa1StTlKp/NL8z5++Ifw7bxn+0Vobanok2peHho7LPO0TG3WXdLtV29fu16v4 W+HHhzwVJLJoej2mnySj55IYsM3/AAKup2jdk9aTcB1ZR+NKpiqtWMad/diTSwGHw9Sdfl96UuY8 Y+IuiajefHb4d38FlczWFsl19ouoomaKLKYG9v4a6j41eBJviL8O9U0W2dReNtktzJ93ejBh/wDE 134KvhutOz14o+s1FKnKP2R/Uac41Yy/5eHyboms6i7WOjy/BOF9bEiRTzy2CLbMv8b79m3/AMer 6H8ZeELbxN4E1Hw4Io4YJ7NreNFX5YvlwnH+z8tdUEUHIApzYxz0q6uK9pKM4x5eUxwuWrD0p0pS 5uY+bf2ZfCHiFtZv9f8AFVldWl3Y2cGjWC3ULK3lL98ru6/dT5v96n/GbwdqGgfEu18bWnhqPxjp c9t9j1DTfI811/uuibG/2f1/vV9FiIjIwAMYFBXCgE5XGPrWjx7nWdfl3+yc/wDY1OOFjhub4Xzc 3948W+CtwfEOu32of8K4t/B9jBEq211LarFcSt/FxsX5af4T0TULf9pPxlqclhcx6bPYQRx3jxt5 Uj7I8qr17OIwGwoxSlRye5rKWKtKfLH4o8p1xy5RhTjKXwy5jxix0PUov2n9S1R9PuU0x9DWFL3y m8p33r8m7+9WJ8X4dZ8IfGPw942s9CvdfsYrF7KeGwXc6N8+D/49X0GAMA9/WmhdxwwzjvVRxko1 FJx+zykyy2Mqcoxl9rmPE/jzb6p40+BG+z0a+OoXn2WV9NWBmuI/nXeuz1X+laHxt8B6r4x+HunD Rv8AkNaTPDf20TfKGdF+5XrxVWGMdO1V5pYrWOWR22qF3NRTxUo8kYx+GV/vCrl9Op7WdSXxRUf/ AAE+YfFfinxv8dNJtvB6eDNQ0AXEsX9o6heIyRRorBsJuTnpXbftIeFb2++Gmi6Zo1hc38ltqNsf KtYmkdUVW+bC/hXoPw68eWnxI8NQ63ZWc1payyOkfnhdzbW27v0rrDJ07Dua2qYmVOpFRjy8vTzO ajl8a1GUpVOb2kfi/unkH7TuiX+tfCi7tdNsrm/uzLAUhtYnlc7XB+6v0r1WzjZbK2VvlZYhmrh2 yIKcuD/FmuKVaUqcafb9T1KeHjCtKsvtcv8A5KcB8UvEHirwtpNpf+FdFXXZIp/9LtA+HaDac7P9 rO2vEvHOveK/2gLew8M2/gW/0JPtKSXGpagjoluP4tvyrk19UY3YJOT60bUGc/Ln0rehi1Q1UfeX 2jjxeXyxk7SqS5HvE8J/aO8O6neS+DNTh0e58RaRpVy73+m26ea8v3Nj7P4sbW/76rkvC2nXmr/H nwhruneBLzwx4fiinj3vYpbnd9nlG+UJ9z7yqu6vqQoCBu5o2ruDYwcVrTzGUKXs+X+aP/gRz1sl hVxHt+b7UZf+AnivjLRNRn/aR8D6nHY3U2lwWlyk12kTNDE5STAZ/wCGpPihoeo3/wAafhre21hc 3NlZyXX2ieKJmSDci7d7fw17RgZ9/WjA47+9YRxkoyjLl+GPL/X3nZLL4yjKPN8UuY8S/aP0XV5k 8J+IdJ06fV30LU1uprK3Xc7p7f8AfP8A49Vnxbpt78efgrfQjSbnQtSlYyW9rqK7H3xv8mf97H/j 1ewFNuMngdfenDAOBwKI4qUYx5Y+9Empl0alWrKUvdqR96J8oaPreoytY6NL8E4X1xZIorm4msEW 3K/xvv2bf/Hq+p7O1isreKGCJIoo12pGi7VVanMaLgkAU8lccYpYjEe3d4x5R4DBPBc3NLmGyKdk n04rxb9mzRr/AEWy8XrqNhc2Mk+uXE0S3ETR+Yny4dd3avaPMA+Yt16CsVvGGjf8JO3h5dRg/tlY vPayDfPs9azhOUacqa+0bVqNOdenXlL4f/bjzP4kaFqN58dPh3f21lczWVsl159wkTPFFlMDc38N bf7Q3h3VPFnwo1fTtHRpb5/Kf7OjfNKqurMn6V6cFHGecd6TbknPIrRYqXNTl/z7JlgIyjWjzfxD 4y8XWNx4t0TRLfw/8Lr/AEI2V5btdXJ0zZKP9lNq7nX+81fUHxJ8IJ41+H+s6IQvm3Nqyx5/hl+8 n/jwWutES5yQM0oHJzW1XGuq4OMeXlOXCZVHDwqRlLm5j51/Zj8La+L7VvEniixu7PUlgh0y2juY WifyI0X+Bv8AgP47qofETSp/Dvxxv9f1rwfe+MNDvbFI7UWdkLswMu35dn/ff/fVfS4XHOefUU0h clu/rVf2jKVaVWUfi90z/siMcNGhGXwy5uY+fv2d9C1ax8bePb+/8OT+GrW+a1e2szDsiVP3uVTH y5+7ux61u/CfRNS0v4u/E26urG4tbS7ubV7a4liZEmGH37G/ir2XYBuIGM4pwUZYjjNZVce6spS5 fitH7v8AhjXD5ZHDxpx5vhlKX/gR4x8PtE1G0+OnxGv57K4hsrlLXyLp4mWKXCc7W/ir2GRCXJ5q bavJxUhArnqVvau520MJGhTdOPWTl97Oc8YeIrfwj4a1LWrgF4rC3adlT+IKPu189eEPhR4g+POn /wDCVeL/ABJqFjBeMz2Wn6e+xIk/hr2r406HceI/hZ4k0+0VmupbRjGq/eZ1+YL/AOO1zv7O3jTT fE/wx0ezgnjjvdNtUtbi23/MhT5d3/AsV6FByoYWVWj8XN+B4+MhTxWPjQrv3OXm5f5pF/4RfD7x J8P/AO1LLVPEj69pG5f7PS4T97Ev8W5//ZaxvE37Tnh7wvr2saNNYajc6np0qQLb28Ssbhm6bK9N 0nxZo+vX99ZafqNvd3NjJ5VzFFJuaJvQ14n8LNNt7n9o74j3jxq8tuYlR2/hDD5v/QBToKNeVWri Y/DH/CGJnLCxoUcFL4pcv8x6h43+J+j+APCsWt6t5kUU5RYbdF3SyO38CrXMeDP2iNO8TeJLbQ9R 0XVPDN9eLutBqcGxbj/cNcP+1A19B8QPh1NBPaW8azSrDPfr+4in3xfM3/jtJ4j+HfxB8Y6p4eTW dc8MxyWV8l1aGBXWdmT5m2ZX/O2t4YXD+wjOp9rm+Rx1swxf1uVKn9nl/wC3j2Lx/wDEiy8A3Ohw XdtcXDatepZReQFO12/vVH8UPiZZfC/Q7TUr62uLqK4uVtUS3CltzKzfxH/Zrzn9qWSKyl8AX858 u1g1yJpZT/D/AJ21S/a/1W1/4Q7w/ZrNH58+qRTLEG+8qq25v/HlrOhgoVfYW+1zHTicxqUXiU5f Dy8v/bx7B488e6X8N/Dkut6oxWCL5VSNdzyN/dUVxXgv4/J4t8UWOjT+Etd0dr7e1tc3lrtiZVTd Wp8a/h7F8RPBcOmnUI9MvVuYp7S4k+75q7tq/wDjzVwWieP/AB/8P/G3h/w943TS9Us9Zl8i31DT /ldX6c/d/vJ/D/FU0KFGph3yrmqe91t9w8Vi8TTxUOaXLT937PMel/E74u6T8Mo7WK6iuNR1K8bZ a6fZJvllrO+HHxt03x/q11o0+nX+ha3Anmtp+oRbHZP7615T8Tk14/tN2K6ZdadZ302lKmny6qrt F/HvVMfxferoNK+HnjO9+LPh3W9e1jw+1zpay7orAOs8sDfL90/73/j1bvB4eFCPP8Uo83zOVZli p4uUacfdjLlPoQj5favMv2hvEp8MfCnXGibN3exfYoEX+JpPl/8AQdx/4DXppYAYx7V4j8XAfF/x f8A+EkffbwTNrN4nosX+qP8A32rL/wACry8JGMq8XL4Y6/ce/mVSUcNKMfil7v8A4EejfDXwyvg/ wPoujIVLWlsiSY7vj5j/AN9bqyfjxdS2fwm8TzQSPDKtm5V4m2std+q7QB6DFeeftA8/B/xR/wBe b/yp4eXtcVGUv5v1Fio/V8BKEPsxJfg1f+d8J/Csk85mlfToizyn5m+SuG+BeoXd78WvipHNcyzQ x3kXlo8m5F+aX7tcj8Of2WvC/ivwLous3OoavFdXlsk7pDcKqhtv8PyVp/sw6DbeF/iF8S9ItZZG gs7iCKN5X3uyq033q9mrToQjifZy5pf4f7x83Rr4udTCRqx5Y/4v7p3Pj749WngnxFLoNv4e1jXd SijSaZLGDekSN/tVv/C/4q6T8VtKlvNLSa2ltpfKubW6TbLE3vXBa3458YeKfifrvhbwdFo9lHo8 cX2m91VXZpGYbvlC/wC9WH+zc19b/FH4kR38ttNd+Zb/AGh7NWETS7pd23Nc8sHTeFlJx5ZRjGXx dzojmVf6/GPNzU5SlH4f5T1vQ/ibY674+13wpHbXCXujqjySuFCNuCn5f++qW1+JdldfE288Frb3 C39rZ/bGuML5Wz5f/i68z8CXEVr+1F8QLeZ1SSe2geNW/iGyKovCeqW+o/tceJHt5FlEOj/Z2Zez q8G4VnLBwTlb+VS/I3jmNTliubX2ko/9ulD4o/HzUfDXxi0rTrWDVf7LsGdb21jt1P2zcnyeV/fr 2y28d6ePA8fim983S9O+zfaJfti7JI1x/Ev96vLfikEt/wBo34aF/lUx3H/oDVf/AGuEuX+Dt0bX P2dbuD7Vs/55b/8A4rZW0qNGv9Wpxjy83X5mFPEYjCvF15T5uX7PyK1j+1bpE13by3ug6zpeiXMn lQaxc2+IXNe5JIsiKynejfdr5n1bwv488YfD8W0+ueDo/Dd1bxKjxxyoqp8uza38P8NertoPizSP hNZaPomoWUfie1tIIFurjc0OVKhm+7/dz/D3rmxVGjGyp+70OjLsXip8zrR5o8vMdlr2mpr+i3un yOyLdQPAzx/eUMteOfsweI7yTRtb8J61O82q6BevE7yvuZ0Z2/8AZlf/AMdrs/hbY+PrFNRHjjUt O1HeyfZDYLjYPm37/kX/AGa8s+ImqQ/BT4/W/imRWXRdf0+Rbvb/AM9Yk/8AsYv++mp4Sj7WNTCP 3m/ej6xHjcS6Pssw5eWPwy5v5Wbt3qF38QP2lrewguZU0XwvaebOiP8ALLO3/wC0n/fDV0HneE1/ aCa2XS5x4tbTPOfUN37vyfu427/vf8A/Gsv9l/QZo/B1/wCKtQT/AImniO8e9lb/AGNx2f8Aszf8 DqoBu/a9x/1AP/Z62cIurUpR/wCXcTlhKXsKdeXxVKil/wDInb/E34x6R8M5LO1mguNU1a84ttNs k3zS/wC1Vb4b/GzTfiHqN1pT2N7omt2q7pNP1CLZKF/vLXkXj1PEH/DUU0el3em2N9PpiJYy6srs jp/EsWP4vvf+P10vh74e+Mrj4waHr+vax4fmuNOgdJrfTw6ytEyOv3T/ALTVUsJh4UU5buPN/Wgo 5ji6uLlCPwxlynXfET496J8NPEUWj6lb3jzTWYu43gRXDfMy7P8Ae+WqXw//AGitL8a+Jj4eutLv 9B1WRC8MWoJtMo9q5nxrZRX/AO1r4LiuI1lWPSnlRWX+JftFWPjpAtr8ZfhNcwptuGu5YmkVfvLu i4/8eaiFDDuMKfL70o83Nf1/yCpjMbGdStz+7GUY8vL6Hf8AxO+Luk/Cp9J/taK4eLUJGRZYk3CL bt+Z/b5hXG+Hf2oND1XxJp+lXui6nosWosq2d7ew7EmJ+7WZ+01bxX3jL4XW9xCs1vNrCRyRt91l aSKpP2u7dIvAehzpGqTx6vDtl/ufK/8A8TSoYehKNOEo+9UvqGLxmNjVrVKUvdp8vu8vxHsfivxV pvgrw/d6zqs62thbJvdz/wCgrXl2h/tRaPf6pZQ6loOr6FY6i2y01PUbfZDN/d+lZn7Xy3B8BaK6 Ffsq6pE07Ou5Puvt3f7NY/i/wV8QfHXhH7Bqev8AhEaTdtH5MkSSL8+/5djVNDC0PYxqVPtNl4vM cV9ZlTo6csf/AAI+m0IYZp+B61laDbXFno+nwXcnm3UUEaSyj+JwvzVq8V4UtJH11OTlFNjCishG ODXjHjD9lrwj4p1eXU0e90i7mbfMdPkRFdvUqyMKKK3o16tCp+6lY4MVhqOKp/vo3Ov+G/wp8PfD DTpINHtWEtwR511K2+aX/ebvVjw98NdO8N+Lte8RWs1w99q+zz1kZSi7em35aKKidepJ1G5bl08N RhTpKMdifx54D0f4g6DJpetW32i1d8rtO143/vK3Y1wvgf8AZo8NeD/EFrqy3mp6neWnFr9uuAyw /QKq0UVtSxNWNF01LQwxGEoTxMako6nc+PvA2k/ELw7NpGsQtNaO/BRtrxv2ZTXmFr+yL4PjsD51 5qt0+UdLiWdTJEq9FUbdo/KiitYYqth6VqUmh4jAYbEV+erBNnpHxE+G2kfEvQhpmrCZYI5fNje3 k2MrjK7s/jXJ+Bf2dvD/AIO8Qw62bvUdZv7YbbaTVLgS+QMbfk+XjiiiopYirGjyKWhFbCUJYmM3 HU6P4m/CfQPijY28OrQyLLD80FzA2yWM+xrI+G3wH8P/AA51abVre4v9R1R4vJN1fT+Yypxwvp92 iilHE1vq/s+bQc8JQeL9o46nqOPmrxv4fadJqfx08ea9duHe0WHTbVFJ+SIgM35suaKKrD/w6v8A h/UMZ/Hof4v0PZelYPjLwxa+M/Dl/ot80iWt5GYZGhba2360UVyU24y0PSqxUqckx/hXw5a+E/D1 ho1mZHtrOJYY2lbc20eprH8KfDTTfCXiTxDrdnNcNda3Ik10srqVVl3Y2/Lx940UVp7SXv67mXsK f7vTY5vxv8BtD8V+Jm15L/VNE1WRPJnn0q5MJnX0bitT4dfB3Qvhlf6jeaObgPfqiyJNLuX5elFF dEsTW9jyc2h51PCUI4rnUdTO+JXwC8PfEnVIdVvJbvTtSjUQ/arCRUeReeG+Xn7xqb4f/APw58ON eOs6R9pW5Nn9idJZQysNytvPH3vl60UUvrNb2Xs+bQ2+oYb617XkVy98UvhHo3xRtbL+05Lm1ubR i9td2cmyWInrg1o+H/h5pmjeCl8LTeZqml+W0L/bm8xpVdmZt57/AHqKKz9vU9jGHNoh/VqP1mc+ XVnnEX7I3g+HUkka71aWwWXzRpj3Q+z5/wC+d/8A49XuUcSwRIijhaKKutXq4i3tZXFhcLRwvN7G NgX94cGuJ+Jvwm0f4p6XBYay06RwSiaOS2dVcNjHXbRRWNOcqc7xdjpnThiaLhVV0dPpGmW3h/Sb HTrSPZa20aQRJ/dVRtH6Vz4+GWmf8LEPi/zrn+1fsn2PZvXytnX7u2iipjOSlOz3NJUKbhTVtil8 Tvg/oHxQt7carFJFdQcwXls+yWP6GqHww+Bvh/4balcanaT31/qc8PlPd305kfZ/doorojia31f2 fNoee8JQ+ue05dTa1P4ZaZqPxD0vxhLLcjVbC2e1hVXURFG3Z3Lt6/O3el8W/DLTfGHiDw7rN7Nc LdaDM81ssTKFZm253fLz9xaKKwjVnzbnW6FO1TTcPGfww0zxvrHh+/v5bhLjRLr7ZbCF1VWfcrfN 8vP3RSfEb4aab8TtFh0vVJrmGCC5S6V7Z1V96hlHO3/aNFFSq9SMqdnsVLD0nGpeO5u+JvDth4r0 afStUt1u7C6TZJFJyCK8k0X9k3wnpuqW92bzVb6G1k86Cyubr9yjfRVFFFdEMTVoU5KnKxyVsJQx FWE6sbs92AwAKMUUVynrH//ZUEsDBBQABgAIAAAAIQDEFzsf3gAAAAcBAAAPAAAAZHJzL2Rvd25y ZXYueG1sTI9BS8NAEIXvgv9hGcGb3WzV0sZsSinqqQi2gvQ2zU6T0OxsyG6T9N+79aKX4Q1veO+b bDnaRvTU+dqxBjVJQBAXztRcavjavT3MQfiAbLBxTBou5GGZ395kmBo38Cf121CKGMI+RQ1VCG0q pS8qsugnriWO3tF1FkNcu1KaDocYbhs5TZKZtFhzbKiwpXVFxWl7threBxxWj+q135yO68t+9/zx vVGk9f3duHoBEWgMf8dwxY/okEemgzuz8aLREB8Jv/PqqYWagjhENZs/KZB5Jv/z5z8AAAD//wMA UEsDBBQABgAIAAAAIQBYYLMbugAAACIBAAAZAAAAZHJzL19yZWxzL2Uyb0RvYy54bWwucmVsc4SP ywrCMBBF94L/EGZv07oQkaZuRHAr9QOGZJpGmwdJFPv3BtwoCC7nXu45TLt/2ok9KCbjnYCmqoGR k14ZpwVc+uNqCyxldAon70jATAn23XLRnmnCXEZpNCGxQnFJwJhz2HGe5EgWU+UDudIMPlrM5Yya B5Q31MTXdb3h8ZMB3ReTnZSAeFINsH4Oxfyf7YfBSDp4ebfk8g8FN7a4CxCjpizAkjL4DpvqGkgD 71r+9Vn3AgAA//8DAFBLAQItABQABgAIAAAAIQCKFT+YDAEAABUCAAATAAAAAAAAAAAAAAAAAAAA AABbQ29udGVudF9UeXBlc10ueG1sUEsBAi0AFAAGAAgAAAAhADj9If/WAAAAlAEAAAsAAAAAAAAA AAAAAAAAPQEAAF9yZWxzLy5yZWxzUEsBAi0AFAAGAAgAAAAhAORM8Ou6CQAAlSYAAA4AAAAAAAAA AAAAAAAAPAIAAGRycy9lMm9Eb2MueG1sUEsBAi0ACgAAAAAAAAAhAHlYo458VQAAfFUAABUAAAAA AAAAAAAAAAAAIgwAAGRycy9tZWRpYS9pbWFnZTEuanBlZ1BLAQItABQABgAIAAAAIQDEFzsf3gAA AAcBAAAPAAAAAAAAAAAAAAAAANFhAABkcnMvZG93bnJldi54bWxQSwECLQAUAAYACAAAACEAWGCz G7oAAAAiAQAAGQAAAAAAAAAAAAAAAADcYgAAZHJzL19yZWxzL2Uyb0RvYy54bWwucmVsc1BLBQYA AAAABgAGAH0BAADNYwAAAAA= ">
+                <v:shape id="Graphic 2" o:spid="_x0000_s1027" style="position:absolute;width:72593;height:103879;visibility:visible;mso-wrap-style:square;v-text-anchor:top" coordsize="7259320,10387965" o:gfxdata="UEsDBBQABgAIAAAAIQDb4fbL7gAAAIUBAAATAAAAW0NvbnRlbnRfVHlwZXNdLnhtbHyQz07DMAyH 70i8Q+QralM4IITa7kDhCAiNB7ASt43WOlEcyvb2pNu4IODoPz9/n1xv9vOkForiPDdwXVagiI23 jocG3rdPxR0oScgWJ8/UwIEENu3lRb09BBKV0ywNjCmFe63FjDSjlD4Q50nv44wpl3HQAc0OB9I3 VXWrjedEnIq03oC27qjHjympx31un0wiTQLq4bS4shrAECZnMGVTvbD9QSnOhDInjzsyuiBXWQP0 r4R18jfgnHvJr4nOknrFmJ5xzhraRtHWf3Kkpfz/yGo5S+H73hkquyhdjr3R8m2lj09svwAAAP// AwBQSwMEFAAGAAgAAAAhAFr0LFu/AAAAFQEAAAsAAABfcmVscy8ucmVsc2zPwWrDMAwG4Ptg72B0 X5TuUMaI01uh19I+gLGVxCy2jGSy9e1nemrHjpL4P0nD4SetZiPRyNnCruvBUPYcYp4tXC/Htw8w Wl0ObuVMFm6kcBhfX4Yzra62kC6xqGlKVgtLreUTUf1CyWnHhXKbTCzJ1VbKjMX5LzcTvvf9HuXR gPHJNKdgQU5hB+ZyK23zHztFL6w81c5zQp6m6P9TMfB3PtPWFCczVQtB9N4U2rp2HOA44NMz4y8A AAD//wMAUEsDBBQABgAIAAAAIQBe6KegxAAAANoAAAAPAAAAZHJzL2Rvd25yZXYueG1sRI/dasJA FITvBd9hOYJ3ulFQSnQVUYQKivWnNJeH7GkSmj2bZtcY394tFLwcZuYbZr5sTSkaql1hWcFoGIEg Tq0uOFNwvWwHbyCcR9ZYWiYFD3KwXHQ7c4y1vfOJmrPPRICwi1FB7n0VS+nSnAy6oa2Ig/dta4M+ yDqTusZ7gJtSjqNoKg0WHBZyrGidU/pzvhkFSfI5KTj6/djsvprban84NpQcler32tUMhKfWv8L/ 7XetYAx/V8INkIsnAAAA//8DAFBLAQItABQABgAIAAAAIQDb4fbL7gAAAIUBAAATAAAAAAAAAAAA AAAAAAAAAABbQ29udGVudF9UeXBlc10ueG1sUEsBAi0AFAAGAAgAAAAhAFr0LFu/AAAAFQEAAAsA AAAAAAAAAAAAAAAAHwEAAF9yZWxzLy5yZWxzUEsBAi0AFAAGAAgAAAAhAF7op6DEAAAA2gAAAA8A AAAAAAAAAAAAAAAABwIAAGRycy9kb3ducmV2LnhtbFBLBQYAAAAAAwADALcAAAD4AgAAAAA= " path="m7223125,10345420l,10345420r,6985l7223125,10352405r,-6985xem7223125,r-7620,l7215505,10344785r7620,l7223125,xem7259320,10345928r-27940,l7231380,10359898,,10359898r,27940l7259320,10387838r,-27940l7259320,10345928xem7259320,r-27940,l7231380,10344785r27940,l7259320,xe" fillcolor="#001f5f" stroked="f">
+                  <v:path arrowok="t"/>
+                </v:shape>
+                <v:shapetype id="_x0000_t75" coordsize="21600,21600" o:spt="75" o:preferrelative="t" path="m@4@5l@4@11@9@11@9@5xe" filled="f" stroked="f">
+                  <v:stroke joinstyle="miter"/>
+                  <v:formulas>
+                    <v:f eqn="if lineDrawn pixelLineWidth 0"/>
+                    <v:f eqn="sum @0 1 0"/>
+                    <v:f eqn="sum 0 0 @1"/>
+                    <v:f eqn="prod @2 1 2"/>
+                    <v:f eqn="prod @3 21600 pixelWidth"/>
+                    <v:f eqn="prod @3 21600 pixelHeight"/>
+                    <v:f eqn="sum @0 0 1"/>
+                    <v:f eqn="prod @6 1 2"/>
+                    <v:f eqn="prod @7 21600 pixelWidth"/>
+                    <v:f eqn="sum @8 21600 0"/>
+                    <v:f eqn="prod @7 21600 pixelHeight"/>
+                    <v:f eqn="sum @10 21600 0"/>
+                  </v:formulas>
+                  <v:path o:extrusionok="f" gradientshapeok="t" o:connecttype="rect"/>
+                  <o:lock v:ext="edit" aspectratio="t"/>
+                </v:shapetype>
+                <v:shape id="Image 3" o:spid="_x0000_s1028" type="#_x0000_t75" style="position:absolute;left:2133;top:2164;width:14402;height:11971;visibility:visible;mso-wrap-style:square" o:gfxdata="UEsDBBQABgAIAAAAIQDb4fbL7gAAAIUBAAATAAAAW0NvbnRlbnRfVHlwZXNdLnhtbHyQz07DMAyH 70i8Q+QralM4IITa7kDhCAiNB7ASt43WOlEcyvb2pNu4IODoPz9/n1xv9vOkForiPDdwXVagiI23 jocG3rdPxR0oScgWJ8/UwIEENu3lRb09BBKV0ywNjCmFe63FjDSjlD4Q50nv44wpl3HQAc0OB9I3 VXWrjedEnIq03oC27qjHjympx31un0wiTQLq4bS4shrAECZnMGVTvbD9QSnOhDInjzsyuiBXWQP0 r4R18jfgnHvJr4nOknrFmJ5xzhraRtHWf3Kkpfz/yGo5S+H73hkquyhdjr3R8m2lj09svwAAAP// AwBQSwMEFAAGAAgAAAAhAFr0LFu/AAAAFQEAAAsAAABfcmVscy8ucmVsc2zPwWrDMAwG4Ptg72B0 X5TuUMaI01uh19I+gLGVxCy2jGSy9e1nemrHjpL4P0nD4SetZiPRyNnCruvBUPYcYp4tXC/Htw8w Wl0ObuVMFm6kcBhfX4Yzra62kC6xqGlKVgtLreUTUf1CyWnHhXKbTCzJ1VbKjMX5LzcTvvf9HuXR gPHJNKdgQU5hB+ZyK23zHztFL6w81c5zQp6m6P9TMfB3PtPWFCczVQtB9N4U2rp2HOA44NMz4y8A AAD//wMAUEsDBBQABgAIAAAAIQCGINyCwwAAANoAAAAPAAAAZHJzL2Rvd25yZXYueG1sRI9BawIx FITvBf9DeEJvmlVLqatRRBCKUGxVxONj89wsu3lZNlFXf70RhB6HmfmGmc5bW4kLNb5wrGDQT0AQ Z04XnCvY71a9LxA+IGusHJOCG3mYzzpvU0y1u/IfXbYhFxHCPkUFJoQ6ldJnhiz6vquJo3dyjcUQ ZZNL3eA1wm0lh0nyKS0WHBcM1rQ0lJXbs1Xw+7M+mILKcnTfHMdllbjhYvmh1Hu3XUxABGrDf/jV /tYKRvC8Em+AnD0AAAD//wMAUEsBAi0AFAAGAAgAAAAhANvh9svuAAAAhQEAABMAAAAAAAAAAAAA AAAAAAAAAFtDb250ZW50X1R5cGVzXS54bWxQSwECLQAUAAYACAAAACEAWvQsW78AAAAVAQAACwAA AAAAAAAAAAAAAAAfAQAAX3JlbHMvLnJlbHNQSwECLQAUAAYACAAAACEAhiDcgsMAAADaAAAADwAA AAAAAAAAAAAAAAAHAgAAZHJzL2Rvd25yZXYueG1sUEsFBgAAAAADAAMAtwAAAPcCAAAAAA== ">
+                  <v:imagedata r:id="rId9" o:title=""/>
+                </v:shape>
+                <v:shape id="Graphic 4" o:spid="_x0000_s1029" style="position:absolute;left:4217;width:71425;height:106940;visibility:visible;mso-wrap-style:square;v-text-anchor:top" coordsize="7142480,10694035" o:gfxdata="UEsDBBQABgAIAAAAIQDb4fbL7gAAAIUBAAATAAAAW0NvbnRlbnRfVHlwZXNdLnhtbHyQz07DMAyH 70i8Q+QralM4IITa7kDhCAiNB7ASt43WOlEcyvb2pNu4IODoPz9/n1xv9vOkForiPDdwXVagiI23 jocG3rdPxR0oScgWJ8/UwIEENu3lRb09BBKV0ywNjCmFe63FjDSjlD4Q50nv44wpl3HQAc0OB9I3 VXWrjedEnIq03oC27qjHjympx31un0wiTQLq4bS4shrAECZnMGVTvbD9QSnOhDInjzsyuiBXWQP0 r4R18jfgnHvJr4nOknrFmJ5xzhraRtHWf3Kkpfz/yGo5S+H73hkquyhdjr3R8m2lj09svwAAAP// AwBQSwMEFAAGAAgAAAAhAFr0LFu/AAAAFQEAAAsAAABfcmVscy8ucmVsc2zPwWrDMAwG4Ptg72B0 X5TuUMaI01uh19I+gLGVxCy2jGSy9e1nemrHjpL4P0nD4SetZiPRyNnCruvBUPYcYp4tXC/Htw8w Wl0ObuVMFm6kcBhfX4Yzra62kC6xqGlKVgtLreUTUf1CyWnHhXKbTCzJ1VbKjMX5LzcTvvf9HuXR gPHJNKdgQU5hB+ZyK23zHztFL6w81c5zQp6m6P9TMfB3PtPWFCczVQtB9N4U2rp2HOA44NMz4y8A AAD//wMAUEsDBBQABgAIAAAAIQDFvXEVxAAAANoAAAAPAAAAZHJzL2Rvd25yZXYueG1sRI/dasJA EIXvC32HZQreFLOplGBjNqEURaEXRe0DjNnJD83OhuxGo0/fLRS8PJyfj5MVk+nEmQbXWlbwEsUg iEurW64VfB838yUI55E1dpZJwZUcFPnjQ4apthfe0/ngaxFG2KWooPG+T6V0ZUMGXWR74uBVdjDo gxxqqQe8hHHTyUUcJ9Jgy4HQYE8fDZU/h9EE7jMlyem0/+pvY3zb0Fv1ud5KpWZP0/sKhKfJ38P/ 7Z1W8Ap/V8INkPkvAAAA//8DAFBLAQItABQABgAIAAAAIQDb4fbL7gAAAIUBAAATAAAAAAAAAAAA AAAAAAAAAABbQ29udGVudF9UeXBlc10ueG1sUEsBAi0AFAAGAAgAAAAhAFr0LFu/AAAAFQEAAAsA AAAAAAAAAAAAAAAAHwEAAF9yZWxzLy5yZWxzUEsBAi0AFAAGAAgAAAAhAMW9cRXEAAAA2gAAAA8A AAAAAAAAAAAAAAAABwIAAGRycy9kb3ducmV2LnhtbFBLBQYAAAAAAwADALcAAAD4AgAAAAA= " path="m7141858,7751762r-30061,-51574l7091299,7667726r-42050,-60617l7005841,7552410r-44679,-48577l6915290,7461567r-46990,-35725l6820281,7396848r-48984,-22047l6721437,7359891r-50661,-7544l6645173,7351382r-25616,965l6568897,7359891r-49860,14910l6470053,7396848r-48019,28994l6375044,7461567r-45872,42266l6284493,7552410r-43408,54699l6199035,7667726r-20498,32462l6158408,7734046r-19749,35230l6119292,7805864r-18974,37897l6081763,7882966r-18148,40475l6045898,7965160r-17284,42939l6011773,8052244r-16383,45301l5979477,8143989r-15443,47574l5949086,8240217r-14465,49721l5920664,8340699r-13437,51778l5894311,8445246r-12382,53721l5870092,8553640r-11290,55576l5848083,8665680r-10147,57315l5828373,8781148r-8967,58966l5811037,8899868r-7760,60503l5796153,9021597r-6503,61938l5783796,9146159r-5207,63271l5774042,9273337r-3861,64490l5766994,9402915r-2502,65633l5762701,9534703r-1092,66649l5761253,9668472r356,67132l5762701,9802254r1791,66154l5766994,9934042r3187,65074l5774042,10063620r4547,63893l5783796,10190785r5854,62623l5796153,10315346r7124,61227l5811037,10437076r8369,59753l5828373,10555796r9563,58153l5848083,10671264r4293,22631l7141858,10693895r,-2942133xem7141858,l,,5359,4559,39560,30251,78663,55587r43892,24956l171157,105092r53213,24155l282092,152958r62128,23254l410667,199009r70663,22301l518210,232283r37910,10833l595020,253822r39903,10579l717651,285140r86576,20193l894511,324942r93942,19024l1135951,371348r155131,25946l1453515,421754r169405,22898l1859089,472681r247218,25019l2429662,524522r337871,21628l3118408,562305r362370,10401l3853103,577088r151067,l4376496,572706r362369,-10401l5089741,546150r337870,-21628l5750966,497700r247218,-25019l6234354,444652r169405,-22898l6566192,397294r155130,-25946l6868820,343966r93942,-19024l7053046,305333r86576,-20193l7141858,284594,7141858,xe" fillcolor="#009fe2" stroked="f">
+                  <v:path arrowok="t"/>
+                </v:shape>
+                <w10:wrap anchorx="page" anchory="page"/>
+              </v:group>
+            </w:pict>
+          </mc:Fallback>
+        </mc:AlternateContent>
+      </w:r>
     </w:p>
     <w:p>
       <w:pPr>
         <w:pStyle w:val="Corpsdetexte"/>
-        <w:spacing w:before="0" w:after="40"/>
-        <w:ind w:left="0" w:right="0" w:firstLine="0"/>
-      </w:pPr>
-      <w:r>
-        <w:rPr>
-          <w:rFonts w:ascii="Arial" w:hAnsi="Arial" w:cs="Arial"/>
+        <w:spacing w:before="36"/>
+        <w:rPr>
+          <w:rFonts w:ascii="Times New Roman"/>
+          <w:sz w:val="48"/>
+        </w:rPr>
+      </w:pPr>
+      <w:r>
+        <w:rPr>
+          <w:rFonts w:ascii="Times New Roman"/>
+          <w:noProof/>
+          <w:sz w:val="48"/>
+        </w:rPr>
+        <mc:AlternateContent>
+          <mc:Choice Requires="wps">
+            <w:drawing>
+              <wp:anchor distT="0" distB="0" distL="114300" distR="114300" simplePos="0" relativeHeight="251714560" behindDoc="1" locked="0" layoutInCell="1" allowOverlap="1" wp14:anchorId="033290B6" wp14:editId="75DC1E1F">
+                <wp:simplePos x="0" y="0"/>
+                <wp:positionH relativeFrom="column">
+                  <wp:posOffset>1343025</wp:posOffset>
+                </wp:positionH>
+                <wp:positionV relativeFrom="paragraph">
+                  <wp:posOffset>109220</wp:posOffset>
+                </wp:positionV>
+                <wp:extent cx="4838700" cy="746760"/>
+                <wp:effectExtent l="0" t="0" r="19050" b="15240"/>
+                <wp:wrapThrough wrapText="bothSides">
+                  <wp:wrapPolygon edited="0">
+                    <wp:start x="0" y="0"/>
+                    <wp:lineTo x="0" y="21490"/>
+                    <wp:lineTo x="21600" y="21490"/>
+                    <wp:lineTo x="21600" y="0"/>
+                    <wp:lineTo x="0" y="0"/>
+                  </wp:wrapPolygon>
+                </wp:wrapThrough>
+                <wp:docPr id="761634548" name="Zone de texte 872"/>
+                <wp:cNvGraphicFramePr/>
+                <a:graphic xmlns:a="http://schemas.openxmlformats.org/drawingml/2006/main">
+                  <a:graphicData uri="http://schemas.microsoft.com/office/word/2010/wordprocessingShape">
+                    <wps:wsp>
+                      <wps:cNvSpPr txBox="1"/>
+                      <wps:spPr>
+                        <a:xfrm>
+                          <a:off x="0" y="0"/>
+                          <a:ext cx="4838700" cy="746760"/>
+                        </a:xfrm>
+                        <a:prstGeom prst="rect">
+                          <a:avLst/>
+                        </a:prstGeom>
+                        <a:ln/>
+                      </wps:spPr>
+                      <wps:style>
+                        <a:lnRef idx="2">
+                          <a:schemeClr val="accent1"/>
+                        </a:lnRef>
+                        <a:fillRef idx="1">
+                          <a:schemeClr val="lt1"/>
+                        </a:fillRef>
+                        <a:effectRef idx="0">
+                          <a:schemeClr val="accent1"/>
+                        </a:effectRef>
+                        <a:fontRef idx="minor">
+                          <a:schemeClr val="dk1"/>
+                        </a:fontRef>
+                      </wps:style>
+                      <wps:txbx>
+                        <w:txbxContent>
+                          <w:p>
+                            <w:pPr>
+                              <w:ind w:left="636" w:right="12"/>
+                              <w:jc w:val="center"/>
+                              <w:rPr>
+                                <w:b/>
+                                <w:color w:val="001F5F"/>
+                                <w:sz w:val="20"/>
+                                <w:szCs w:val="20"/>
+                              </w:rPr>
+                            </w:pPr>
+                          </w:p>
+                          <w:p>
+                            <w:pPr>
+                              <w:ind w:left="636" w:right="12"/>
+                              <w:jc w:val="center"/>
+                              <w:rPr>
+                                <w:b/>
+                                <w:sz w:val="48"/>
+                              </w:rPr>
+                            </w:pPr>
+                            <w:r>
+                              <w:rPr>
+                                <w:b/>
+                                <w:color w:val="001F5F"/>
+                                <w:sz w:val="48"/>
+                              </w:rPr>
+                              <w:t>Estimation</w:t>
+                            </w:r>
+                            <w:r>
+                              <w:rPr>
+                                <w:b/>
+                                <w:color w:val="001F5F"/>
+                                <w:spacing w:val="-2"/>
+                                <w:sz w:val="48"/>
+                              </w:rPr>
+                              <w:t xml:space="preserve"> </w:t>
+                            </w:r>
+                            <w:r>
+                              <w:rPr>
+                                <w:b/>
+                                <w:color w:val="001F5F"/>
+                                <w:sz w:val="48"/>
+                              </w:rPr>
+                              <w:t>des</w:t>
+                            </w:r>
+                            <w:r>
+                              <w:rPr>
+                                <w:b/>
+                                <w:color w:val="001F5F"/>
+                                <w:spacing w:val="-1"/>
+                                <w:sz w:val="48"/>
+                              </w:rPr>
+                              <w:t xml:space="preserve"> </w:t>
+                            </w:r>
+                            <w:r>
+                              <w:rPr>
+                                <w:b/>
+                                <w:color w:val="001F5F"/>
+                                <w:sz w:val="48"/>
+                              </w:rPr>
+                              <w:t>niveaux</w:t>
+                            </w:r>
+                            <w:r>
+                              <w:rPr>
+                                <w:b/>
+                                <w:color w:val="001F5F"/>
+                                <w:spacing w:val="-2"/>
+                                <w:sz w:val="48"/>
+                              </w:rPr>
+                              <w:t xml:space="preserve"> sonores</w:t>
+                            </w:r>
+                          </w:p>
+                          <w:p>
+                            <w:pPr>
+                              <w:rPr>
+                                <w:sz w:val="20"/>
+                                <w:szCs w:val="20"/>
+                              </w:rPr>
+                            </w:pPr>
+                          </w:p>
+                        </w:txbxContent>
+                      </wps:txbx>
+                      <wps:bodyPr rot="0" spcFirstLastPara="0" vertOverflow="overflow" horzOverflow="overflow" vert="horz" wrap="square" lIns="91440" tIns="45720" rIns="91440" bIns="45720" numCol="1" spcCol="0" rtlCol="0" fromWordArt="0" anchor="t" anchorCtr="0" forceAA="0" compatLnSpc="1">
+                        <a:prstTxWarp prst="textNoShape">
+                          <a:avLst/>
+                        </a:prstTxWarp>
+                        <a:noAutofit/>
+                      </wps:bodyPr>
+                    </wps:wsp>
+                  </a:graphicData>
+                </a:graphic>
+                <wp14:sizeRelV relativeFrom="margin">
+                  <wp14:pctHeight>0</wp14:pctHeight>
+                </wp14:sizeRelV>
+              </wp:anchor>
+            </w:drawing>
+          </mc:Choice>
+          <mc:Fallback>
+            <w:pict>
+              <v:shapetype w14:anchorId="033290B6" id="_x0000_t202" coordsize="21600,21600" o:spt="202" path="m,l,21600r21600,l21600,xe">
+                <v:stroke joinstyle="miter"/>
+                <v:path gradientshapeok="t" o:connecttype="rect"/>
+              </v:shapetype>
+              <v:shape id="Zone de texte 872" o:spid="_x0000_s1026" type="#_x0000_t202" style="position:absolute;margin-left:105.75pt;margin-top:8.6pt;width:381pt;height:58.8pt;z-index:-251601920;visibility:visible;mso-wrap-style:square;mso-height-percent:0;mso-wrap-distance-left:9pt;mso-wrap-distance-top:0;mso-wrap-distance-right:9pt;mso-wrap-distance-bottom:0;mso-position-horizontal:absolute;mso-position-horizontal-relative:text;mso-position-vertical:absolute;mso-position-vertical-relative:text;mso-height-percent:0;mso-height-relative:margin;v-text-anchor:top" o:gfxdata="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" fillcolor="white [3201]" strokecolor="#4f81bd [3204]" strokeweight="2pt">
+                <v:textbox>
+                  <w:txbxContent>
+                    <w:p>
+                      <w:pPr>
+                        <w:ind w:left="636" w:right="12"/>
+                        <w:jc w:val="center"/>
+                        <w:rPr>
+                          <w:b/>
+                          <w:color w:val="001F5F"/>
+                          <w:sz w:val="20"/>
+                          <w:szCs w:val="20"/>
+                        </w:rPr>
+                      </w:pPr>
+                    </w:p>
+                    <w:p>
+                      <w:pPr>
+                        <w:ind w:left="636" w:right="12"/>
+                        <w:jc w:val="center"/>
+                        <w:rPr>
+                          <w:b/>
+                          <w:sz w:val="48"/>
+                        </w:rPr>
+                      </w:pPr>
+                      <w:r>
+                        <w:rPr>
+                          <w:b/>
+                          <w:color w:val="001F5F"/>
+                          <w:sz w:val="48"/>
+                        </w:rPr>
+                        <w:t>Estimation</w:t>
+                      </w:r>
+                      <w:r>
+                        <w:rPr>
+                          <w:b/>
+                          <w:color w:val="001F5F"/>
+                          <w:spacing w:val="-2"/>
+                          <w:sz w:val="48"/>
+                        </w:rPr>
+                        <w:t xml:space="preserve"> </w:t>
+                      </w:r>
+                      <w:r>
+                        <w:rPr>
+                          <w:b/>
+                          <w:color w:val="001F5F"/>
+                          <w:sz w:val="48"/>
+                        </w:rPr>
+                        <w:t>des</w:t>
+                      </w:r>
+                      <w:r>
+                        <w:rPr>
+                          <w:b/>
+                          <w:color w:val="001F5F"/>
+                          <w:spacing w:val="-1"/>
+                          <w:sz w:val="48"/>
+                        </w:rPr>
+                        <w:t xml:space="preserve"> </w:t>
+                      </w:r>
+                      <w:r>
+                        <w:rPr>
+                          <w:b/>
+                          <w:color w:val="001F5F"/>
+                          <w:sz w:val="48"/>
+                        </w:rPr>
+                        <w:t>niveaux</w:t>
+                      </w:r>
+                      <w:r>
+                        <w:rPr>
+                          <w:b/>
+                          <w:color w:val="001F5F"/>
+                          <w:spacing w:val="-2"/>
+                          <w:sz w:val="48"/>
+                        </w:rPr>
+                        <w:t xml:space="preserve"> sonores</w:t>
+                      </w:r>
+                    </w:p>
+                    <w:p>
+                      <w:pPr>
+                        <w:rPr>
+                          <w:sz w:val="20"/>
+                          <w:szCs w:val="20"/>
+                        </w:rPr>
+                      </w:pPr>
+                    </w:p>
+                  </w:txbxContent>
+                </v:textbox>
+                <w10:wrap type="through"/>
+              </v:shape>
+            </w:pict>
+          </mc:Fallback>
+        </mc:AlternateContent>
+      </w:r>
+    </w:p>
+    <w:p>
+      <w:pPr>
+        <w:pStyle w:val="Corpsdetexte"/>
+        <w:spacing w:before="472"/>
+        <w:rPr>
+          <w:b/>
+          <w:sz w:val="48"/>
+        </w:rPr>
+      </w:pPr>
+    </w:p>
+    <w:p>
+      <w:pPr>
+        <w:spacing w:before="123"/>
+        <w:ind w:left="636" w:right="610"/>
+        <w:jc w:val="center"/>
+        <w:rPr>
           <w:b/>
           <w:bCs/>
-          <w:color w:val="0B3C78"/>
-          <w:sz w:val="52"/>
-          <w:szCs w:val="52"/>
-        </w:rPr>
-        <w:t xml:space="preserve">ESTIMATION DES </w:t>
-      </w:r>
-      <w:r>
-        <w:rPr>
-          <w:rFonts w:ascii="Arial" w:hAnsi="Arial" w:cs="Arial"/>
+          <w:color w:val="001F5F"/>
+          <w:spacing w:val="-2"/>
+          <w:sz w:val="44"/>
+        </w:rPr>
+      </w:pPr>
+      <w:r>
+        <w:rPr>
           <w:b/>
           <w:bCs/>
-          <w:color w:val="1D9BD1"/>
-          <w:sz w:val="52"/>
-          <w:szCs w:val="52"/>
-        </w:rPr>
-        <w:t xml:space="preserve">NIVEAUX SONORES</w:t>
+          <w:color w:val="001F5F"/>
+          <w:spacing w:val="-2"/>
+          <w:sz w:val="44"/>
+        </w:rPr>
+        <w:t>{{ENTREPRISE}}</w:t>
+      </w:r>
+    </w:p>
+    <w:p>
+      <w:pPr>
+        <w:spacing w:before="121"/>
+        <w:ind w:left="636" w:right="609"/>
+        <w:jc w:val="center"/>
+        <w:rPr>
+          <w:b/>
+          <w:color w:val="001F5F"/>
+          <w:sz w:val="32"/>
+          <w:szCs w:val="32"/>
+        </w:rPr>
+      </w:pPr>
+      <w:r>
+        <w:rPr>
+          <w:b/>
+          <w:color w:val="001F5F"/>
+          <w:sz w:val="32"/>
+          <w:szCs w:val="32"/>
+        </w:rPr>
+        <w:t>{{ADRESSE}}</w:t>
+      </w:r>
+    </w:p>
+    <w:p>
+      <w:pPr>
+        <w:spacing w:before="121"/>
+        <w:ind w:left="636" w:right="609"/>
+        <w:jc w:val="center"/>
+        <w:rPr>
+          <w:b/>
+          <w:sz w:val="32"/>
+          <w:szCs w:val="32"/>
+        </w:rPr>
+      </w:pPr>
+      <w:r>
+        <w:rPr>
+          <w:b/>
+          <w:color w:val="001F5F"/>
+          <w:sz w:val="32"/>
+          <w:szCs w:val="32"/>
+        </w:rPr>
+        <w:t>{{CP_VILLE}}</w:t>
       </w:r>
     </w:p>
     <w:p>
       <w:pPr>
         <w:pStyle w:val="Corpsdetexte"/>
-        <w:spacing w:before="0" w:after="40"/>
-        <w:ind w:left="0" w:right="0" w:firstLine="0"/>
-      </w:pPr>
-      <w:r>
-        <w:rPr>
-          <w:rFonts w:ascii="Arial" w:hAnsi="Arial" w:cs="Arial"/>
+        <w:spacing w:before="300"/>
+        <w:rPr>
           <w:b/>
-          <w:bCs/>
-          <w:color w:val="0B3C78"/>
-          <w:sz w:val="26"/>
-          <w:szCs w:val="26"/>
-        </w:rPr>
-        <w:t xml:space="preserve">Dosimétrie &amp; sonométrie  •  Efficacité des protections auditives (PICB)</w:t>
-      </w:r>
+          <w:sz w:val="44"/>
+        </w:rPr>
+      </w:pPr>
     </w:p>
     <w:p>
       <w:pPr>
         <w:pStyle w:val="Corpsdetexte"/>
-        <w:spacing w:before="0" w:after="60"/>
-        <w:ind w:left="0" w:right="0" w:firstLine="0"/>
-      </w:pPr>
-      <w:r>
-        <w:rPr>
-          <w:rFonts w:ascii="Arial" w:hAnsi="Arial" w:cs="Arial"/>
-          <w:i/>
-          <w:iCs/>
-          <w:color w:val="5D6B7A"/>
-          <w:sz w:val="18"/>
-          <w:szCs w:val="18"/>
-        </w:rPr>
-        <w:t xml:space="preserve">Méthode OB : affaiblissement des PICB calculé bande d’octave par bande d’octave (63 Hz – 8 kHz), NF EN ISO 4869-2 · calculette INRS</w:t>
-      </w:r>
+        <w:spacing w:before="300"/>
+        <w:rPr>
+          <w:b/>
+          <w:sz w:val="44"/>
+        </w:rPr>
+      </w:pPr>
+    </w:p>
+    <w:p>
+      <w:pPr>
+        <w:ind w:left="636"/>
+        <w:jc w:val="center"/>
+        <w:rPr>
+          <w:b/>
+          <w:color w:val="001F5F"/>
+          <w:spacing w:val="-10"/>
+          <w:sz w:val="40"/>
+        </w:rPr>
+      </w:pPr>
+      <w:r>
+        <w:rPr>
+          <w:b/>
+          <w:color w:val="001F5F"/>
+          <w:sz w:val="40"/>
+        </w:rPr>
+        <w:t>Dosimétrie</w:t>
+      </w:r>
+      <w:r>
+        <w:rPr>
+          <w:b/>
+          <w:color w:val="001F5F"/>
+          <w:spacing w:val="-6"/>
+          <w:sz w:val="40"/>
+        </w:rPr>
+        <w:t xml:space="preserve"> </w:t>
+      </w:r>
+      <w:r>
+        <w:rPr>
+          <w:b/>
+          <w:color w:val="001F5F"/>
+          <w:sz w:val="40"/>
+        </w:rPr>
+        <w:t>&amp;</w:t>
+      </w:r>
+      <w:r>
+        <w:rPr>
+          <w:b/>
+          <w:color w:val="001F5F"/>
+          <w:spacing w:val="-9"/>
+          <w:sz w:val="40"/>
+        </w:rPr>
+        <w:t xml:space="preserve"> </w:t>
+      </w:r>
+      <w:r>
+        <w:rPr>
+          <w:b/>
+          <w:color w:val="001F5F"/>
+          <w:sz w:val="40"/>
+        </w:rPr>
+        <w:t>Sonométrie</w:t>
+      </w:r>
+      <w:r>
+        <w:rPr>
+          <w:b/>
+          <w:color w:val="001F5F"/>
+          <w:spacing w:val="-3"/>
+          <w:sz w:val="40"/>
+        </w:rPr>
+        <w:t xml:space="preserve"> </w:t>
+      </w:r>
+      <w:r>
+        <w:rPr>
+          <w:b/>
+          <w:color w:val="001F5F"/>
+          <w:sz w:val="40"/>
+        </w:rPr>
+        <w:t>des</w:t>
+      </w:r>
+      <w:r>
+        <w:rPr>
+          <w:b/>
+          <w:color w:val="001F5F"/>
+          <w:spacing w:val="-6"/>
+          <w:sz w:val="40"/>
+        </w:rPr>
+        <w:t xml:space="preserve"> </w:t>
+      </w:r>
+      <w:r>
+        <w:rPr>
+          <w:b/>
+          <w:color w:val="001F5F"/>
+          <w:sz w:val="40"/>
+        </w:rPr>
+        <w:t>postes</w:t>
+      </w:r>
+      <w:r>
+        <w:rPr>
+          <w:b/>
+          <w:color w:val="001F5F"/>
+          <w:spacing w:val="-7"/>
+          <w:sz w:val="40"/>
+        </w:rPr>
+        <w:t xml:space="preserve"> </w:t>
+      </w:r>
+      <w:r>
+        <w:rPr>
+          <w:b/>
+          <w:color w:val="001F5F"/>
+          <w:sz w:val="40"/>
+        </w:rPr>
+        <w:t xml:space="preserve">suivants </w:t>
+      </w:r>
+      <w:r>
+        <w:rPr>
+          <w:b/>
+          <w:color w:val="001F5F"/>
+          <w:spacing w:val="-10"/>
+          <w:sz w:val="40"/>
+        </w:rPr>
+        <w:t>:</w:t>
+      </w:r>
+    </w:p>
+    <w:p>
+      <w:pPr>
+        <w:ind w:left="636"/>
+        <w:jc w:val="center"/>
+        <w:rPr>
+          <w:b/>
+          <w:sz w:val="40"/>
+        </w:rPr>
+      </w:pPr>
     </w:p>
     <w:p>
       <w:pPr>
         <w:pStyle w:val="Corpsdetexte"/>
-        <w:spacing w:before="0" w:after="220"/>
-        <w:ind w:left="0" w:right="0" w:firstLine="0"/>
-      </w:pPr>
-      <w:r>
-        <w:rPr>
-          <w:rFonts w:ascii="Arial" w:hAnsi="Arial" w:cs="Arial"/>
-          <w:color w:val="AFCA0C"/>
-          <w:sz w:val="24"/>
-          <w:szCs w:val="24"/>
-        </w:rPr>
-        <w:t xml:space="preserve">▬▬▬</w:t>
-      </w:r>
-    </w:p>
-    <w:tbl>
-      <w:tblPr>
-        <w:tblW w:w="10480" w:type="dxa"/>
-        <w:tblInd w:w="0" w:type="dxa"/>
-        <w:tblBorders>
-          <w:top w:val="nil"/>
-          <w:left w:val="nil"/>
-          <w:bottom w:val="nil"/>
-          <w:right w:val="nil"/>
-          <w:insideH w:val="nil"/>
-          <w:insideV w:val="nil"/>
-        </w:tblBorders>
-        <w:tblLayout w:type="fixed"/>
-        <w:tblCellMar>
-          <w:top w:w="40" w:type="dxa"/>
-          <w:left w:w="140" w:type="dxa"/>
-          <w:bottom w:w="40" w:type="dxa"/>
-          <w:right w:w="140" w:type="dxa"/>
-        </w:tblCellMar>
-        <w:tblLook w:val="0000" w:firstRow="0" w:lastRow="0" w:firstColumn="0" w:lastColumn="0" w:noHBand="1" w:noVBand="1"/>
-      </w:tblPr>
-      <w:tblGrid>
-        <w:gridCol w:w="3100"/>
-        <w:gridCol w:w="7380"/>
-      </w:tblGrid>
-      <w:tr>
-        <w:trPr>
-          <w:cantSplit/>
-        </w:trPr>
-        <w:tc>
-          <w:tcPr>
-            <w:tcW w:w="10480" w:type="dxa"/>
-            <w:gridSpan w:val="2"/>
-            <w:shd w:val="clear" w:color="auto" w:fill="0B3C78"/>
-            <w:vAlign w:val="center"/>
-          </w:tcPr>
-          <w:p>
-            <w:pPr>
-              <w:pStyle w:val="Corpsdetexte"/>
-              <w:spacing w:before="60" w:after="60"/>
-              <w:ind w:left="0" w:right="0" w:firstLine="0"/>
-            </w:pPr>
-            <w:r>
-              <w:rPr>
-                <w:rFonts w:ascii="Arial" w:hAnsi="Arial" w:cs="Arial"/>
-                <w:b/>
-                <w:bCs/>
-                <w:color w:val="FFFFFF"/>
-                <w:sz w:val="22"/>
-                <w:szCs w:val="22"/>
-              </w:rPr>
-              <w:t xml:space="preserve">▣  IDENTIFICATION DE L’INTERVENTION</w:t>
-            </w:r>
-          </w:p>
-        </w:tc>
-      </w:tr>
-      <w:tr>
-        <w:trPr>
-          <w:cantSplit/>
-        </w:trPr>
-        <w:tc>
-          <w:tcPr>
-            <w:tcW w:w="3100" w:type="dxa"/>
-            <w:tcBorders>
-              <w:bottom w:val="single" w:sz="4" w:space="0" w:color="D3E3EF"/>
-            </w:tcBorders>
-            <w:shd w:val="clear" w:color="auto" w:fill="F3F8FC"/>
-            <w:vAlign w:val="top"/>
-          </w:tcPr>
-          <w:p>
-            <w:pPr>
-              <w:pStyle w:val="Corpsdetexte"/>
-              <w:spacing w:before="70" w:after="70"/>
-              <w:ind w:left="0" w:right="0" w:firstLine="0"/>
-            </w:pPr>
-            <w:r>
-              <w:rPr>
-                <w:rFonts w:ascii="Arial" w:hAnsi="Arial" w:cs="Arial"/>
-                <w:b/>
-                <w:bCs/>
-                <w:color w:val="0B3C78"/>
-                <w:sz w:val="20"/>
-                <w:szCs w:val="20"/>
-              </w:rPr>
-              <w:t xml:space="preserve">Entreprise</w:t>
-            </w:r>
-          </w:p>
-        </w:tc>
-        <w:tc>
-          <w:tcPr>
-            <w:tcW w:w="7380" w:type="dxa"/>
-            <w:tcBorders>
-              <w:bottom w:val="single" w:sz="4" w:space="0" w:color="D3E3EF"/>
-            </w:tcBorders>
-            <w:vAlign w:val="center"/>
-          </w:tcPr>
-          <w:p>
-            <w:pPr>
-              <w:pStyle w:val="Corpsdetexte"/>
-              <w:spacing w:before="70" w:after="70"/>
-              <w:ind w:left="0" w:right="0" w:firstLine="0"/>
-            </w:pPr>
-            <w:r>
-              <w:rPr>
-                <w:rFonts w:ascii="Arial" w:hAnsi="Arial" w:cs="Arial"/>
-                <w:color w:val="222A35"/>
-                <w:sz w:val="20"/>
-                <w:szCs w:val="20"/>
-              </w:rPr>
-              <w:t xml:space="preserve">{{ENTREPRISE}}</w:t>
-            </w:r>
-          </w:p>
-        </w:tc>
-      </w:tr>
-      <w:tr>
-        <w:trPr>
-          <w:cantSplit/>
-        </w:trPr>
-        <w:tc>
-          <w:tcPr>
-            <w:tcW w:w="3100" w:type="dxa"/>
-            <w:tcBorders>
-              <w:bottom w:val="single" w:sz="4" w:space="0" w:color="D3E3EF"/>
-            </w:tcBorders>
-            <w:shd w:val="clear" w:color="auto" w:fill="F3F8FC"/>
-            <w:vAlign w:val="top"/>
-          </w:tcPr>
-          <w:p>
-            <w:pPr>
-              <w:pStyle w:val="Corpsdetexte"/>
-              <w:spacing w:before="70" w:after="70"/>
-              <w:ind w:left="0" w:right="0" w:firstLine="0"/>
-            </w:pPr>
-            <w:r>
-              <w:rPr>
-                <w:rFonts w:ascii="Arial" w:hAnsi="Arial" w:cs="Arial"/>
-                <w:b/>
-                <w:bCs/>
-                <w:color w:val="0B3C78"/>
-                <w:sz w:val="20"/>
-                <w:szCs w:val="20"/>
-              </w:rPr>
-              <w:t xml:space="preserve">Adresse</w:t>
-            </w:r>
-          </w:p>
-        </w:tc>
-        <w:tc>
-          <w:tcPr>
-            <w:tcW w:w="7380" w:type="dxa"/>
-            <w:tcBorders>
-              <w:bottom w:val="single" w:sz="4" w:space="0" w:color="D3E3EF"/>
-            </w:tcBorders>
-            <w:vAlign w:val="center"/>
-          </w:tcPr>
-          <w:p>
-            <w:pPr>
-              <w:pStyle w:val="Corpsdetexte"/>
-              <w:spacing w:before="70" w:after="70"/>
-              <w:ind w:left="0" w:right="0" w:firstLine="0"/>
-            </w:pPr>
-            <w:r>
-              <w:rPr>
-                <w:rFonts w:ascii="Arial" w:hAnsi="Arial" w:cs="Arial"/>
-                <w:color w:val="222A35"/>
-                <w:sz w:val="20"/>
-                <w:szCs w:val="20"/>
-              </w:rPr>
-              <w:t xml:space="preserve">{{ADRESSE}}</w:t>
-            </w:r>
-          </w:p>
-          <w:p>
-            <w:pPr>
-              <w:pStyle w:val="Corpsdetexte"/>
-              <w:spacing w:before="70" w:after="70"/>
-              <w:ind w:left="0" w:right="0" w:firstLine="0"/>
-            </w:pPr>
-            <w:r>
-              <w:rPr>
-                <w:rFonts w:ascii="Arial" w:hAnsi="Arial" w:cs="Arial"/>
-                <w:color w:val="222A35"/>
-                <w:sz w:val="20"/>
-                <w:szCs w:val="20"/>
-              </w:rPr>
-              <w:t xml:space="preserve">{{CP_VILLE}}</w:t>
-            </w:r>
-          </w:p>
-        </w:tc>
-      </w:tr>
-      <w:tr>
-        <w:trPr>
-          <w:cantSplit/>
-        </w:trPr>
-        <w:tc>
-          <w:tcPr>
-            <w:tcW w:w="3100" w:type="dxa"/>
-            <w:tcBorders>
-              <w:bottom w:val="single" w:sz="4" w:space="0" w:color="D3E3EF"/>
-            </w:tcBorders>
-            <w:shd w:val="clear" w:color="auto" w:fill="F3F8FC"/>
-            <w:vAlign w:val="top"/>
-          </w:tcPr>
-          <w:p>
-            <w:pPr>
-              <w:pStyle w:val="Corpsdetexte"/>
-              <w:spacing w:before="70" w:after="70"/>
-              <w:ind w:left="0" w:right="0" w:firstLine="0"/>
-            </w:pPr>
-            <w:r>
-              <w:rPr>
-                <w:rFonts w:ascii="Arial" w:hAnsi="Arial" w:cs="Arial"/>
-                <w:b/>
-                <w:bCs/>
-                <w:color w:val="0B3C78"/>
-                <w:sz w:val="20"/>
-                <w:szCs w:val="20"/>
-              </w:rPr>
-              <w:t xml:space="preserve">Unités de travail mesurées</w:t>
-            </w:r>
-          </w:p>
-        </w:tc>
-        <w:tc>
-          <w:tcPr>
-            <w:tcW w:w="7380" w:type="dxa"/>
-            <w:tcBorders>
-              <w:bottom w:val="single" w:sz="4" w:space="0" w:color="D3E3EF"/>
-            </w:tcBorders>
-            <w:vAlign w:val="center"/>
-          </w:tcPr>
-          <w:p>
-            <w:pPr>
-              <w:pStyle w:val="Corpsdetexte"/>
-              <w:spacing w:before="70" w:after="70"/>
-              <w:ind w:left="0" w:right="0" w:firstLine="0"/>
-            </w:pPr>
-            <w:r>
-              <w:rPr>
-                <w:rFonts w:ascii="Arial" w:hAnsi="Arial" w:cs="Arial"/>
-                <w:color w:val="222A35"/>
-                <w:sz w:val="20"/>
-                <w:szCs w:val="20"/>
-              </w:rPr>
-              <w:t xml:space="preserve">{{UNITE_1}}</w:t>
-            </w:r>
-          </w:p>
-          <w:p>
-            <w:pPr>
-              <w:pStyle w:val="Corpsdetexte"/>
-              <w:spacing w:before="70" w:after="70"/>
-              <w:ind w:left="0" w:right="0" w:firstLine="0"/>
-            </w:pPr>
-            <w:r>
-              <w:rPr>
-                <w:rFonts w:ascii="Arial" w:hAnsi="Arial" w:cs="Arial"/>
-                <w:color w:val="222A35"/>
-                <w:sz w:val="20"/>
-                <w:szCs w:val="20"/>
-              </w:rPr>
-              <w:t xml:space="preserve">{{UNITE_2}}</w:t>
-            </w:r>
-          </w:p>
-          <w:p>
-            <w:pPr>
-              <w:pStyle w:val="Corpsdetexte"/>
-              <w:spacing w:before="70" w:after="70"/>
-              <w:ind w:left="0" w:right="0" w:firstLine="0"/>
-            </w:pPr>
-            <w:r>
-              <w:rPr>
-                <w:rFonts w:ascii="Arial" w:hAnsi="Arial" w:cs="Arial"/>
-                <w:color w:val="222A35"/>
-                <w:sz w:val="20"/>
-                <w:szCs w:val="20"/>
-              </w:rPr>
-              <w:t xml:space="preserve">{{UNITE_3}}</w:t>
-            </w:r>
-          </w:p>
-          <w:p>
-            <w:pPr>
-              <w:pStyle w:val="Corpsdetexte"/>
-              <w:spacing w:before="70" w:after="70"/>
-              <w:ind w:left="0" w:right="0" w:firstLine="0"/>
-            </w:pPr>
-            <w:r>
-              <w:rPr>
-                <w:rFonts w:ascii="Arial" w:hAnsi="Arial" w:cs="Arial"/>
-                <w:color w:val="222A35"/>
-                <w:sz w:val="20"/>
-                <w:szCs w:val="20"/>
-              </w:rPr>
-              <w:t xml:space="preserve">{{UNITE_4}}</w:t>
-            </w:r>
-          </w:p>
-        </w:tc>
-      </w:tr>
-      <w:tr>
-        <w:trPr>
-          <w:cantSplit/>
-        </w:trPr>
-        <w:tc>
-          <w:tcPr>
-            <w:tcW w:w="3100" w:type="dxa"/>
-            <w:tcBorders>
-              <w:bottom w:val="single" w:sz="4" w:space="0" w:color="D3E3EF"/>
-            </w:tcBorders>
-            <w:shd w:val="clear" w:color="auto" w:fill="F3F8FC"/>
-            <w:vAlign w:val="top"/>
-          </w:tcPr>
-          <w:p>
-            <w:pPr>
-              <w:pStyle w:val="Corpsdetexte"/>
-              <w:spacing w:before="70" w:after="70"/>
-              <w:ind w:left="0" w:right="0" w:firstLine="0"/>
-            </w:pPr>
-            <w:r>
-              <w:rPr>
-                <w:rFonts w:ascii="Arial" w:hAnsi="Arial" w:cs="Arial"/>
-                <w:b/>
-                <w:bCs/>
-                <w:color w:val="0B3C78"/>
-                <w:sz w:val="20"/>
-                <w:szCs w:val="20"/>
-              </w:rPr>
-              <w:t xml:space="preserve">Date des mesures</w:t>
-            </w:r>
-          </w:p>
-        </w:tc>
-        <w:tc>
-          <w:tcPr>
-            <w:tcW w:w="7380" w:type="dxa"/>
-            <w:tcBorders>
-              <w:bottom w:val="single" w:sz="4" w:space="0" w:color="D3E3EF"/>
-            </w:tcBorders>
-            <w:vAlign w:val="center"/>
-          </w:tcPr>
-          <w:p>
-            <w:pPr>
-              <w:pStyle w:val="Corpsdetexte"/>
-              <w:spacing w:before="70" w:after="70"/>
-              <w:ind w:left="0" w:right="0" w:firstLine="0"/>
-            </w:pPr>
-            <w:r>
-              <w:rPr>
-                <w:rFonts w:ascii="Arial" w:hAnsi="Arial" w:cs="Arial"/>
-                <w:color w:val="222A35"/>
-                <w:sz w:val="20"/>
-                <w:szCs w:val="20"/>
-              </w:rPr>
-              <w:t xml:space="preserve">{{DATES_MESURES}}</w:t>
-            </w:r>
-          </w:p>
-        </w:tc>
-      </w:tr>
-      <w:tr>
-        <w:trPr>
-          <w:cantSplit/>
-        </w:trPr>
-        <w:tc>
-          <w:tcPr>
-            <w:tcW w:w="3100" w:type="dxa"/>
-            <w:tcBorders>
-              <w:bottom w:val="single" w:sz="4" w:space="0" w:color="D3E3EF"/>
-            </w:tcBorders>
-            <w:shd w:val="clear" w:color="auto" w:fill="F3F8FC"/>
-            <w:vAlign w:val="top"/>
-          </w:tcPr>
-          <w:p>
-            <w:pPr>
-              <w:pStyle w:val="Corpsdetexte"/>
-              <w:spacing w:before="70" w:after="70"/>
-              <w:ind w:left="0" w:right="0" w:firstLine="0"/>
-            </w:pPr>
-            <w:r>
-              <w:rPr>
-                <w:rFonts w:ascii="Arial" w:hAnsi="Arial" w:cs="Arial"/>
-                <w:b/>
-                <w:bCs/>
-                <w:color w:val="0B3C78"/>
-                <w:sz w:val="20"/>
-                <w:szCs w:val="20"/>
-              </w:rPr>
-              <w:t xml:space="preserve">Intervenant</w:t>
-            </w:r>
-          </w:p>
-        </w:tc>
-        <w:tc>
-          <w:tcPr>
-            <w:tcW w:w="7380" w:type="dxa"/>
-            <w:tcBorders>
-              <w:bottom w:val="single" w:sz="4" w:space="0" w:color="D3E3EF"/>
-            </w:tcBorders>
-            <w:vAlign w:val="center"/>
-          </w:tcPr>
-          <w:p>
-            <w:pPr>
-              <w:pStyle w:val="Corpsdetexte"/>
-              <w:spacing w:before="70" w:after="70"/>
-              <w:ind w:left="0" w:right="0" w:firstLine="0"/>
-            </w:pPr>
-            <w:r>
-              <w:rPr>
-                <w:rFonts w:ascii="Arial" w:hAnsi="Arial" w:cs="Arial"/>
-                <w:color w:val="222A35"/>
-                <w:sz w:val="20"/>
-                <w:szCs w:val="20"/>
-              </w:rPr>
-              <w:t xml:space="preserve">{{INTERVENANT}} – {{QUALITE}}</w:t>
-            </w:r>
-          </w:p>
-        </w:tc>
-      </w:tr>
-    </w:tbl>
+        <w:numPr>
+          <w:ilvl w:val="0"/>
+          <w:numId w:val="24"/>
+        </w:numPr>
+        <w:rPr>
+          <w:b/>
+          <w:color w:val="0070C0"/>
+          <w:sz w:val="28"/>
+          <w:szCs w:val="28"/>
+        </w:rPr>
+      </w:pPr>
+      <w:bookmarkStart w:id="1" w:name="_Hlk237554613"/>
+      <w:r>
+        <w:rPr>
+          <w:b/>
+          <w:color w:val="0070C0"/>
+          <w:sz w:val="28"/>
+          <w:szCs w:val="28"/>
+        </w:rPr>
+        <w:t xml:space="preserve">{{UNITE_1}}</w:t>
+      </w:r>
+      <w:bookmarkEnd w:id="1"/>
+    </w:p>
     <w:p>
       <w:pPr>
         <w:pStyle w:val="Corpsdetexte"/>
-        <w:spacing w:before="0" w:after="420"/>
-        <w:ind w:left="0" w:right="0" w:firstLine="0"/>
-      </w:pPr>
-    </w:p>
-    <w:tbl>
-      <w:tblPr>
-        <w:tblW w:w="10480" w:type="dxa"/>
-        <w:tblInd w:w="0" w:type="dxa"/>
-        <w:tblBorders>
-          <w:top w:val="nil"/>
-          <w:left w:val="nil"/>
-          <w:bottom w:val="nil"/>
-          <w:right w:val="nil"/>
-          <w:insideH w:val="nil"/>
-          <w:insideV w:val="nil"/>
-        </w:tblBorders>
-        <w:tblLayout w:type="fixed"/>
-        <w:tblCellMar>
-          <w:top w:w="40" w:type="dxa"/>
-          <w:left w:w="140" w:type="dxa"/>
-          <w:bottom w:w="40" w:type="dxa"/>
-          <w:right w:w="140" w:type="dxa"/>
-        </w:tblCellMar>
-        <w:tblLook w:val="0000" w:firstRow="0" w:lastRow="0" w:firstColumn="0" w:lastColumn="0" w:noHBand="1" w:noVBand="1"/>
-      </w:tblPr>
-      <w:tblGrid>
-        <w:gridCol w:w="3420"/>
-        <w:gridCol w:w="110"/>
-        <w:gridCol w:w="3420"/>
-        <w:gridCol w:w="110"/>
-        <w:gridCol w:w="3420"/>
-      </w:tblGrid>
-      <w:tr>
-        <w:trPr>
-          <w:cantSplit/>
-        </w:trPr>
-        <w:tc>
-          <w:tcPr>
-            <w:tcW w:w="3420" w:type="dxa"/>
-            <w:tcBorders>
-              <w:top w:val="single" w:sz="24" w:space="0" w:color="1D9BD1"/>
-            </w:tcBorders>
-            <w:shd w:val="clear" w:color="auto" w:fill="EAF3FA"/>
-            <w:vAlign w:val="top"/>
-          </w:tcPr>
-          <w:p>
-            <w:pPr>
-              <w:pStyle w:val="Corpsdetexte"/>
-              <w:spacing w:before="80" w:after="40"/>
-              <w:ind w:left="0" w:right="0" w:firstLine="0"/>
-            </w:pPr>
-            <w:r>
-              <w:rPr>
-                <w:rFonts w:ascii="Arial" w:hAnsi="Arial" w:cs="Arial"/>
-                <w:b/>
-                <w:bCs/>
-                <w:color w:val="1D9BD1"/>
-                <w:sz w:val="26"/>
-                <w:szCs w:val="26"/>
-              </w:rPr>
-              <w:t xml:space="preserve">①  </w:t>
-            </w:r>
-            <w:r>
-              <w:rPr>
-                <w:rFonts w:ascii="Arial" w:hAnsi="Arial" w:cs="Arial"/>
-                <w:b/>
-                <w:bCs/>
-                <w:color w:val="0B3C78"/>
-                <w:sz w:val="21"/>
-                <w:szCs w:val="21"/>
-              </w:rPr>
-              <w:t xml:space="preserve">Dosimétrie</w:t>
-            </w:r>
-          </w:p>
-          <w:p>
-            <w:pPr>
-              <w:pStyle w:val="Corpsdetexte"/>
-              <w:spacing w:before="0" w:after="20"/>
-              <w:ind w:left="0" w:right="0" w:firstLine="0"/>
-            </w:pPr>
-            <w:r>
-              <w:rPr>
-                <w:rFonts w:ascii="Arial" w:hAnsi="Arial" w:cs="Arial"/>
-                <w:color w:val="222A35"/>
-                <w:sz w:val="17"/>
-                <w:szCs w:val="17"/>
-              </w:rPr>
-              <w:t xml:space="preserve">Exposition quotidienne Lex,8h et crêtes Lp,C sur la journée.</w:t>
-            </w:r>
-          </w:p>
-          <w:p>
-            <w:pPr>
-              <w:pStyle w:val="Corpsdetexte"/>
-              <w:spacing w:before="0" w:after="80"/>
-              <w:ind w:left="0" w:right="0" w:firstLine="0"/>
-            </w:pPr>
-            <w:r>
-              <w:rPr>
-                <w:rFonts w:ascii="Arial" w:hAnsi="Arial" w:cs="Arial"/>
-                <w:i/>
-                <w:iCs/>
-                <w:color w:val="5D6B7A"/>
-                <w:sz w:val="16"/>
-                <w:szCs w:val="16"/>
-              </w:rPr>
-              <w:t xml:space="preserve">NF EN ISO 9612</w:t>
-            </w:r>
-          </w:p>
-        </w:tc>
-        <w:tc>
-          <w:tcPr>
-            <w:tcW w:w="110" w:type="dxa"/>
-            <w:vAlign w:val="center"/>
-          </w:tcPr>
-          <w:p>
-            <w:pPr>
-              <w:pStyle w:val="Corpsdetexte"/>
-              <w:spacing w:before="0" w:after="0"/>
-              <w:ind w:left="0" w:right="0" w:firstLine="0"/>
-            </w:pPr>
-          </w:p>
-        </w:tc>
-        <w:tc>
-          <w:tcPr>
-            <w:tcW w:w="3420" w:type="dxa"/>
-            <w:tcBorders>
-              <w:top w:val="single" w:sz="24" w:space="0" w:color="1D9BD1"/>
-            </w:tcBorders>
-            <w:shd w:val="clear" w:color="auto" w:fill="EAF3FA"/>
-            <w:vAlign w:val="top"/>
-          </w:tcPr>
-          <w:p>
-            <w:pPr>
-              <w:pStyle w:val="Corpsdetexte"/>
-              <w:spacing w:before="80" w:after="40"/>
-              <w:ind w:left="0" w:right="0" w:firstLine="0"/>
-            </w:pPr>
-            <w:r>
-              <w:rPr>
-                <w:rFonts w:ascii="Arial" w:hAnsi="Arial" w:cs="Arial"/>
-                <w:b/>
-                <w:bCs/>
-                <w:color w:val="1D9BD1"/>
-                <w:sz w:val="26"/>
-                <w:szCs w:val="26"/>
-              </w:rPr>
-              <w:t xml:space="preserve">②  </w:t>
-            </w:r>
-            <w:r>
-              <w:rPr>
-                <w:rFonts w:ascii="Arial" w:hAnsi="Arial" w:cs="Arial"/>
-                <w:b/>
-                <w:bCs/>
-                <w:color w:val="0B3C78"/>
-                <w:sz w:val="21"/>
-                <w:szCs w:val="21"/>
-              </w:rPr>
-              <w:t xml:space="preserve">Sonométrie</w:t>
-            </w:r>
-          </w:p>
-          <w:p>
-            <w:pPr>
-              <w:pStyle w:val="Corpsdetexte"/>
-              <w:spacing w:before="0" w:after="20"/>
-              <w:ind w:left="0" w:right="0" w:firstLine="0"/>
-            </w:pPr>
-            <w:r>
-              <w:rPr>
-                <w:rFonts w:ascii="Arial" w:hAnsi="Arial" w:cs="Arial"/>
-                <w:color w:val="222A35"/>
-                <w:sz w:val="17"/>
-                <w:szCs w:val="17"/>
-              </w:rPr>
-              <w:t xml:space="preserve">Spectre par bande d’octave au poste, de 63 Hz à 8 kHz.</w:t>
-            </w:r>
-          </w:p>
-          <w:p>
-            <w:pPr>
-              <w:pStyle w:val="Corpsdetexte"/>
-              <w:spacing w:before="0" w:after="80"/>
-              <w:ind w:left="0" w:right="0" w:firstLine="0"/>
-            </w:pPr>
-            <w:r>
-              <w:rPr>
-                <w:rFonts w:ascii="Arial" w:hAnsi="Arial" w:cs="Arial"/>
-                <w:i/>
-                <w:iCs/>
-                <w:color w:val="5D6B7A"/>
-                <w:sz w:val="16"/>
-                <w:szCs w:val="16"/>
-              </w:rPr>
-              <w:t xml:space="preserve">NF EN 61672-1</w:t>
-            </w:r>
-          </w:p>
-        </w:tc>
-        <w:tc>
-          <w:tcPr>
-            <w:tcW w:w="110" w:type="dxa"/>
-            <w:vAlign w:val="center"/>
-          </w:tcPr>
-          <w:p>
-            <w:pPr>
-              <w:pStyle w:val="Corpsdetexte"/>
-              <w:spacing w:before="0" w:after="0"/>
-              <w:ind w:left="0" w:right="0" w:firstLine="0"/>
-            </w:pPr>
-          </w:p>
-        </w:tc>
-        <w:tc>
-          <w:tcPr>
-            <w:tcW w:w="3420" w:type="dxa"/>
-            <w:tcBorders>
-              <w:top w:val="single" w:sz="24" w:space="0" w:color="1D9BD1"/>
-            </w:tcBorders>
-            <w:shd w:val="clear" w:color="auto" w:fill="EAF3FA"/>
-            <w:vAlign w:val="top"/>
-          </w:tcPr>
-          <w:p>
-            <w:pPr>
-              <w:pStyle w:val="Corpsdetexte"/>
-              <w:spacing w:before="80" w:after="40"/>
-              <w:ind w:left="0" w:right="0" w:firstLine="0"/>
-            </w:pPr>
-            <w:r>
-              <w:rPr>
-                <w:rFonts w:ascii="Arial" w:hAnsi="Arial" w:cs="Arial"/>
-                <w:b/>
-                <w:bCs/>
-                <w:color w:val="1D9BD1"/>
-                <w:sz w:val="26"/>
-                <w:szCs w:val="26"/>
-              </w:rPr>
-              <w:t xml:space="preserve">③  </w:t>
-            </w:r>
-            <w:r>
-              <w:rPr>
-                <w:rFonts w:ascii="Arial" w:hAnsi="Arial" w:cs="Arial"/>
-                <w:b/>
-                <w:bCs/>
-                <w:color w:val="0B3C78"/>
-                <w:sz w:val="21"/>
-                <w:szCs w:val="21"/>
-              </w:rPr>
-              <w:t xml:space="preserve">Méthode OB</w:t>
-            </w:r>
-          </w:p>
-          <w:p>
-            <w:pPr>
-              <w:pStyle w:val="Corpsdetexte"/>
-              <w:spacing w:before="0" w:after="20"/>
-              <w:ind w:left="0" w:right="0" w:firstLine="0"/>
-            </w:pPr>
-            <w:r>
-              <w:rPr>
-                <w:rFonts w:ascii="Arial" w:hAnsi="Arial" w:cs="Arial"/>
-                <w:color w:val="222A35"/>
-                <w:sz w:val="17"/>
-                <w:szCs w:val="17"/>
-              </w:rPr>
-              <w:t xml:space="preserve">Niveau résiduel sous PICB (APV84 / APV98) et adéquation.</w:t>
-            </w:r>
-          </w:p>
-          <w:p>
-            <w:pPr>
-              <w:pStyle w:val="Corpsdetexte"/>
-              <w:spacing w:before="0" w:after="80"/>
-              <w:ind w:left="0" w:right="0" w:firstLine="0"/>
-            </w:pPr>
-            <w:r>
-              <w:rPr>
-                <w:rFonts w:ascii="Arial" w:hAnsi="Arial" w:cs="Arial"/>
-                <w:i/>
-                <w:iCs/>
-                <w:color w:val="5D6B7A"/>
-                <w:sz w:val="16"/>
-                <w:szCs w:val="16"/>
-              </w:rPr>
-              <w:t xml:space="preserve">NF EN ISO 4869-2 · INRS</w:t>
-            </w:r>
-          </w:p>
-        </w:tc>
-      </w:tr>
-    </w:tbl>
+        <w:numPr>
+          <w:ilvl w:val="0"/>
+          <w:numId w:val="24"/>
+        </w:numPr>
+        <w:rPr>
+          <w:b/>
+          <w:color w:val="0070C0"/>
+          <w:sz w:val="28"/>
+          <w:szCs w:val="28"/>
+        </w:rPr>
+      </w:pPr>
+      <w:r>
+        <w:rPr>
+          <w:b/>
+          <w:color w:val="0070C0"/>
+          <w:sz w:val="28"/>
+          <w:szCs w:val="28"/>
+        </w:rPr>
+        <w:t>{{UNITE_2}}</w:t>
+      </w:r>
+    </w:p>
     <w:p>
       <w:pPr>
         <w:pStyle w:val="Corpsdetexte"/>
-        <w:spacing w:before="0" w:after="700"/>
-        <w:ind w:left="0" w:right="0" w:firstLine="0"/>
-      </w:pPr>
+        <w:numPr>
+          <w:ilvl w:val="0"/>
+          <w:numId w:val="24"/>
+        </w:numPr>
+        <w:rPr>
+          <w:b/>
+          <w:color w:val="0070C0"/>
+          <w:sz w:val="28"/>
+          <w:szCs w:val="28"/>
+        </w:rPr>
+      </w:pPr>
+      <w:r>
+        <w:rPr>
+          <w:b/>
+          <w:color w:val="0070C0"/>
+          <w:sz w:val="28"/>
+          <w:szCs w:val="28"/>
+        </w:rPr>
+        <w:t xml:space="preserve">{{UNITE_3}} </w:t>
+      </w:r>
     </w:p>
     <w:p>
       <w:pPr>
         <w:pStyle w:val="Corpsdetexte"/>
-        <w:spacing w:before="0" w:after="0"/>
-        <w:ind w:left="0" w:right="0" w:firstLine="0"/>
-        <w:jc w:val="center"/>
-      </w:pPr>
-      <w:r>
-        <w:rPr>
-          <w:rFonts w:ascii="Arial" w:hAnsi="Arial" w:cs="Arial"/>
-          <w:i/>
-          <w:iCs/>
-          <w:color w:val="7F8FA4"/>
-          <w:sz w:val="15"/>
-          <w:szCs w:val="15"/>
-        </w:rPr>
-        <w:t xml:space="preserve">Document confidentiel établi par le service de prévention et de santé au travail. Les résultats ne valent que pour les conditions de travail observées le jour des mesures.</w:t>
-      </w:r>
+        <w:numPr>
+          <w:ilvl w:val="0"/>
+          <w:numId w:val="24"/>
+        </w:numPr>
+        <w:rPr>
+          <w:b/>
+          <w:color w:val="0070C0"/>
+          <w:sz w:val="28"/>
+          <w:szCs w:val="28"/>
+        </w:rPr>
+      </w:pPr>
+      <w:r>
+        <w:rPr>
+          <w:b/>
+          <w:color w:val="0070C0"/>
+          <w:sz w:val="28"/>
+          <w:szCs w:val="28"/>
+        </w:rPr>
+        <w:t>{{UNITE_4}}</w:t>
+      </w:r>
+    </w:p>
+    <w:p>
+      <w:pPr>
+        <w:ind w:left="851" w:hanging="142"/>
+        <w:rPr>
+          <w:b/>
+          <w:color w:val="001F5F"/>
+          <w:sz w:val="24"/>
+        </w:rPr>
+      </w:pPr>
+    </w:p>
+    <w:p>
+      <w:pPr>
+        <w:rPr>
+          <w:b/>
+          <w:color w:val="001F5F"/>
+          <w:sz w:val="24"/>
+        </w:rPr>
+      </w:pPr>
+    </w:p>
+    <w:p>
+      <w:pPr>
+        <w:rPr>
+          <w:b/>
+          <w:color w:val="001F5F"/>
+          <w:sz w:val="24"/>
+        </w:rPr>
+      </w:pPr>
+    </w:p>
+    <w:p>
+      <w:pPr>
+        <w:rPr>
+          <w:b/>
+          <w:color w:val="001F5F"/>
+          <w:sz w:val="24"/>
+        </w:rPr>
+      </w:pPr>
+    </w:p>
+    <w:p>
+      <w:pPr>
+        <w:rPr>
+          <w:b/>
+          <w:color w:val="001F5F"/>
+          <w:sz w:val="24"/>
+        </w:rPr>
+      </w:pPr>
+    </w:p>
+    <w:p>
+      <w:pPr>
+        <w:ind w:left="851" w:hanging="142"/>
+        <w:rPr>
+          <w:b/>
+          <w:color w:val="001F5F"/>
+          <w:sz w:val="24"/>
+        </w:rPr>
+      </w:pPr>
+    </w:p>
+    <w:p>
+      <w:pPr>
+        <w:ind w:left="851" w:hanging="142"/>
+        <w:rPr>
+          <w:b/>
+          <w:color w:val="001F5F"/>
+          <w:sz w:val="24"/>
+        </w:rPr>
+      </w:pPr>
+    </w:p>
+    <w:p>
+      <w:pPr>
+        <w:ind w:left="851" w:hanging="142"/>
+        <w:rPr>
+          <w:b/>
+          <w:color w:val="001F5F"/>
+          <w:sz w:val="24"/>
+        </w:rPr>
+      </w:pPr>
+    </w:p>
+    <w:p>
+      <w:pPr>
+        <w:ind w:left="851" w:hanging="142"/>
+        <w:rPr>
+          <w:b/>
+          <w:color w:val="001F5F"/>
+          <w:sz w:val="24"/>
+        </w:rPr>
+      </w:pPr>
+    </w:p>
+    <w:p>
+      <w:pPr>
+        <w:ind w:left="851" w:hanging="142"/>
+        <w:rPr>
+          <w:b/>
+          <w:color w:val="001F5F"/>
+          <w:sz w:val="24"/>
+        </w:rPr>
+      </w:pPr>
+    </w:p>
+    <w:p>
+      <w:pPr>
+        <w:ind w:left="851" w:hanging="142"/>
+        <w:rPr>
+          <w:b/>
+          <w:color w:val="001F5F"/>
+          <w:sz w:val="24"/>
+        </w:rPr>
+      </w:pPr>
+    </w:p>
+    <w:p>
+      <w:pPr>
+        <w:ind w:left="851" w:hanging="142"/>
+        <w:rPr>
+          <w:b/>
+          <w:color w:val="001F5F"/>
+          <w:sz w:val="24"/>
+        </w:rPr>
+      </w:pPr>
+      <w:r>
+        <w:rPr>
+          <w:b/>
+          <w:color w:val="001F5F"/>
+          <w:sz w:val="24"/>
+        </w:rPr>
+        <w:t xml:space="preserve">Mesures réalisées le {{DATES_MESURES}}</w:t>
+      </w:r>
+    </w:p>
+    <w:p>
+      <w:pPr>
+        <w:ind w:left="851" w:hanging="142"/>
+        <w:rPr>
+          <w:b/>
+          <w:color w:val="001F5F"/>
+          <w:sz w:val="24"/>
+        </w:rPr>
+      </w:pPr>
+    </w:p>
+    <w:p>
+      <w:pPr>
+        <w:ind w:left="851" w:hanging="142"/>
+        <w:rPr>
+          <w:b/>
+          <w:color w:val="001F5F"/>
+          <w:sz w:val="24"/>
+        </w:rPr>
+      </w:pPr>
+    </w:p>
+    <w:p>
+      <w:pPr>
+        <w:ind w:left="851" w:hanging="142"/>
+        <w:rPr>
+          <w:b/>
+          <w:color w:val="001F5F"/>
+          <w:sz w:val="24"/>
+        </w:rPr>
+      </w:pPr>
+    </w:p>
+    <w:p>
+      <w:pPr>
+        <w:ind w:left="851" w:hanging="142"/>
+        <w:rPr>
+          <w:b/>
+          <w:color w:val="001F5F"/>
+          <w:sz w:val="24"/>
+        </w:rPr>
+      </w:pPr>
+    </w:p>
+    <w:p>
+      <w:pPr>
+        <w:ind w:left="851" w:hanging="142"/>
+        <w:rPr>
+          <w:b/>
+          <w:color w:val="001F5F"/>
+          <w:sz w:val="24"/>
+        </w:rPr>
+      </w:pPr>
+    </w:p>
+    <w:p>
+      <w:pPr>
+        <w:ind w:left="851" w:hanging="142"/>
+        <w:rPr>
+          <w:b/>
+          <w:sz w:val="24"/>
+        </w:rPr>
+      </w:pPr>
+    </w:p>
+    <w:p>
+      <w:pPr>
+        <w:pStyle w:val="Corpsdetexte"/>
+        <w:ind w:left="851" w:hanging="142"/>
+        <w:rPr>
+          <w:b/>
+        </w:rPr>
+      </w:pPr>
     </w:p>
     <w:p>
       <w:pPr>
@@ -874,10 +1430,18 @@
         <w:sectPr>
           <w:type w:val="continuous"/>
           <w:pgSz w:w="11920" w:h="16850"/>
-          <w:pgMar w:top="0" w:right="720" w:bottom="600" w:left="720" w:header="360" w:footer="360" w:gutter="0"/>
+          <w:pgMar w:top="1940" w:right="566" w:bottom="280" w:left="141" w:header="720" w:footer="720" w:gutter="0"/>
           <w:cols w:space="720"/>
         </w:sectPr>
       </w:pPr>
+      <w:r>
+        <w:rPr>
+          <w:b/>
+          <w:color w:val="1F497D" w:themeColor="text2"/>
+          <w:sz w:val="28"/>
+        </w:rPr>
+        <w:t xml:space="preserve">{{INTERVENANT}} – {{QUALITE}}</w:t>
+      </w:r>
     </w:p>
     <w:p>
       <w:pPr>
@@ -927,7 +1491,7 @@
       <w:sdtContent>
         <w:p>
           <w:pPr>
-            <w:pStyle w:val="TM2"/>
+            <w:pStyle w:val="Titre1"/>
             <w:ind w:firstLine="0"/>
             <w:rPr>
               <w:rFonts w:asciiTheme="minorHAnsi" w:hAnsiTheme="minorHAnsi" w:cstheme="minorHAnsi"/>
@@ -1993,7 +2557,7 @@
         </w:p>
         <w:p>
           <w:pPr>
-            <w:pStyle w:val="TM2"/>
+            <w:pStyle w:val="Titre2"/>
             <w:tabs>
               <w:tab w:val="left" w:pos="1275"/>
             </w:tabs>
@@ -2121,42 +2685,54 @@
         </w:tabs>
         <w:ind w:left="1042" w:hanging="331"/>
         <w:jc w:val="left"/>
-        <w:rPr/>
+        <w:rPr>
+          <w:u w:val="none"/>
+        </w:rPr>
       </w:pPr>
       <w:bookmarkStart w:id="3" w:name="_Toc233365499"/>
       <w:r>
-        <w:rPr/>
+        <w:rPr>
+          <w:smallCaps/>
+        </w:rPr>
         <w:lastRenderedPageBreak/>
         <w:t>Les</w:t>
       </w:r>
       <w:r>
         <w:rPr>
+          <w:smallCaps/>
           <w:spacing w:val="-15"/>
         </w:rPr>
         <w:t xml:space="preserve"> </w:t>
       </w:r>
       <w:r>
-        <w:rPr/>
+        <w:rPr>
+          <w:smallCaps/>
+        </w:rPr>
         <w:t>principes</w:t>
       </w:r>
       <w:r>
         <w:rPr>
+          <w:smallCaps/>
           <w:spacing w:val="-13"/>
         </w:rPr>
         <w:t xml:space="preserve"> </w:t>
       </w:r>
       <w:r>
-        <w:rPr/>
+        <w:rPr>
+          <w:smallCaps/>
+        </w:rPr>
         <w:t>de</w:t>
       </w:r>
       <w:r>
         <w:rPr>
+          <w:smallCaps/>
           <w:spacing w:val="-13"/>
         </w:rPr>
         <w:t xml:space="preserve"> </w:t>
       </w:r>
       <w:r>
         <w:rPr>
+          <w:smallCaps/>
           <w:spacing w:val="-2"/>
         </w:rPr>
         <w:t>deontologie</w:t>
@@ -2194,7 +2770,9 @@
         </w:tabs>
         <w:ind w:left="1562" w:hanging="431"/>
         <w:jc w:val="left"/>
-        <w:rPr/>
+        <w:rPr>
+          <w:sz w:val="26"/>
+        </w:rPr>
       </w:pPr>
       <w:r>
         <w:rPr>
@@ -2709,7 +3287,9 @@
         <w:spacing w:before="1"/>
         <w:ind w:left="1562" w:hanging="431"/>
         <w:jc w:val="left"/>
-        <w:rPr/>
+        <w:rPr>
+          <w:sz w:val="26"/>
+        </w:rPr>
       </w:pPr>
       <w:r>
         <w:t>Droit</w:t>
@@ -2986,7 +3566,9 @@
         </w:tabs>
         <w:ind w:left="1562" w:hanging="431"/>
         <w:jc w:val="left"/>
-        <w:rPr/>
+        <w:rPr>
+          <w:sz w:val="26"/>
+        </w:rPr>
       </w:pPr>
       <w:r>
         <w:t>Cession</w:t>
@@ -3344,42 +3926,54 @@
         </w:tabs>
         <w:ind w:left="1042" w:hanging="331"/>
         <w:jc w:val="left"/>
-        <w:rPr/>
+        <w:rPr>
+          <w:u w:val="none"/>
+        </w:rPr>
       </w:pPr>
       <w:bookmarkStart w:id="4" w:name="_Toc233365500"/>
       <w:r>
-        <w:rPr/>
+        <w:rPr>
+          <w:smallCaps/>
+        </w:rPr>
         <w:lastRenderedPageBreak/>
         <w:t>Les</w:t>
       </w:r>
       <w:r>
         <w:rPr>
+          <w:smallCaps/>
           <w:spacing w:val="-10"/>
         </w:rPr>
         <w:t xml:space="preserve"> </w:t>
       </w:r>
       <w:r>
-        <w:rPr/>
+        <w:rPr>
+          <w:smallCaps/>
+        </w:rPr>
         <w:t>termes</w:t>
       </w:r>
       <w:r>
         <w:rPr>
+          <w:smallCaps/>
           <w:spacing w:val="-10"/>
         </w:rPr>
         <w:t xml:space="preserve"> </w:t>
       </w:r>
       <w:r>
-        <w:rPr/>
+        <w:rPr>
+          <w:smallCaps/>
+        </w:rPr>
         <w:t>et</w:t>
       </w:r>
       <w:r>
         <w:rPr>
+          <w:smallCaps/>
           <w:spacing w:val="-9"/>
         </w:rPr>
         <w:t xml:space="preserve"> </w:t>
       </w:r>
       <w:r>
         <w:rPr>
+          <w:smallCaps/>
           <w:spacing w:val="-2"/>
         </w:rPr>
         <w:t>definitions</w:t>
@@ -4445,22 +5039,28 @@
         </w:tabs>
         <w:ind w:left="1042" w:hanging="331"/>
         <w:jc w:val="left"/>
-        <w:rPr/>
+        <w:rPr>
+          <w:u w:val="none"/>
+        </w:rPr>
       </w:pPr>
       <w:bookmarkStart w:id="5" w:name="_Toc233365501"/>
       <w:r>
-        <w:rPr/>
+        <w:rPr>
+          <w:smallCaps/>
+        </w:rPr>
         <w:lastRenderedPageBreak/>
         <w:t>La</w:t>
       </w:r>
       <w:r>
         <w:rPr>
+          <w:smallCaps/>
           <w:spacing w:val="-7"/>
         </w:rPr>
         <w:t xml:space="preserve"> </w:t>
       </w:r>
       <w:r>
         <w:rPr>
+          <w:smallCaps/>
           <w:spacing w:val="-2"/>
         </w:rPr>
         <w:t>demande</w:t>
@@ -4923,61 +5523,78 @@
         <w:jc w:val="left"/>
         <w:rPr>
           <w:spacing w:val="-10"/>
-        </w:rPr>
-      </w:pPr>
-      <w:r>
-        <w:rPr/>
+          <w:u w:val="single"/>
+        </w:rPr>
+      </w:pPr>
+      <w:r>
+        <w:rPr>
+          <w:u w:val="single"/>
+        </w:rPr>
         <w:t>Date</w:t>
       </w:r>
       <w:r>
         <w:rPr>
           <w:spacing w:val="-4"/>
-        </w:rPr>
-        <w:t xml:space="preserve"> </w:t>
-      </w:r>
-      <w:r>
-        <w:rPr/>
+          <w:u w:val="single"/>
+        </w:rPr>
+        <w:t xml:space="preserve"> </w:t>
+      </w:r>
+      <w:r>
+        <w:rPr>
+          <w:u w:val="single"/>
+        </w:rPr>
         <w:t>et</w:t>
       </w:r>
       <w:r>
         <w:rPr>
           <w:spacing w:val="-1"/>
-        </w:rPr>
-        <w:t xml:space="preserve"> </w:t>
-      </w:r>
-      <w:r>
-        <w:rPr/>
+          <w:u w:val="single"/>
+        </w:rPr>
+        <w:t xml:space="preserve"> </w:t>
+      </w:r>
+      <w:r>
+        <w:rPr>
+          <w:u w:val="single"/>
+        </w:rPr>
         <w:t>horaires</w:t>
       </w:r>
       <w:r>
         <w:rPr>
           <w:spacing w:val="-4"/>
-        </w:rPr>
-        <w:t xml:space="preserve"> </w:t>
-      </w:r>
-      <w:r>
-        <w:rPr/>
+          <w:u w:val="single"/>
+        </w:rPr>
+        <w:t xml:space="preserve"> </w:t>
+      </w:r>
+      <w:r>
+        <w:rPr>
+          <w:u w:val="single"/>
+        </w:rPr>
         <w:t>de</w:t>
       </w:r>
       <w:r>
         <w:rPr>
           <w:spacing w:val="-9"/>
-        </w:rPr>
-        <w:t xml:space="preserve"> </w:t>
-      </w:r>
-      <w:r>
-        <w:rPr/>
+          <w:u w:val="single"/>
+        </w:rPr>
+        <w:t xml:space="preserve"> </w:t>
+      </w:r>
+      <w:r>
+        <w:rPr>
+          <w:u w:val="single"/>
+        </w:rPr>
         <w:t>l’intervention</w:t>
       </w:r>
       <w:r>
         <w:rPr>
           <w:spacing w:val="2"/>
+          <w:u w:val="single"/>
         </w:rPr>
         <w:t xml:space="preserve"> </w:t>
       </w:r>
       <w:r>
         <w:rPr>
           <w:spacing w:val="-10"/>
+          <w:u w:val="single"/>
         </w:rPr>
         <w:t>:</w:t>
       </w:r>
@@ -4990,12 +5607,16 @@
         <w:rPr>
           <w:b w:val="0"/>
           <w:bCs w:val="0"/>
+          <w:i/>
+          <w:iCs/>
         </w:rPr>
       </w:pPr>
       <w:r>
         <w:rPr>
           <w:b w:val="0"/>
           <w:bCs w:val="0"/>
+          <w:i/>
+          <w:iCs/>
         </w:rPr>
         <w:t>{{HORAIRES_TITRE}}</w:t>
       </w:r>
@@ -5022,41 +5643,53 @@
         <w:spacing w:before="0"/>
         <w:ind w:left="1042" w:hanging="331"/>
         <w:jc w:val="left"/>
-        <w:rPr/>
+        <w:rPr>
+          <w:u w:val="none"/>
+        </w:rPr>
       </w:pPr>
       <w:bookmarkStart w:id="6" w:name="_Toc233365502"/>
       <w:r>
-        <w:rPr/>
+        <w:rPr>
+          <w:smallCaps/>
+        </w:rPr>
         <w:t>Les</w:t>
       </w:r>
       <w:r>
         <w:rPr>
+          <w:smallCaps/>
           <w:spacing w:val="-11"/>
         </w:rPr>
         <w:t xml:space="preserve"> </w:t>
       </w:r>
       <w:r>
-        <w:rPr/>
+        <w:rPr>
+          <w:smallCaps/>
+        </w:rPr>
         <w:t>normes</w:t>
       </w:r>
       <w:r>
         <w:rPr>
+          <w:smallCaps/>
           <w:spacing w:val="-9"/>
         </w:rPr>
         <w:t xml:space="preserve"> </w:t>
       </w:r>
       <w:r>
-        <w:rPr/>
+        <w:rPr>
+          <w:smallCaps/>
+        </w:rPr>
         <w:t>de</w:t>
       </w:r>
       <w:r>
         <w:rPr>
+          <w:smallCaps/>
           <w:spacing w:val="-12"/>
         </w:rPr>
         <w:t xml:space="preserve"> </w:t>
       </w:r>
       <w:r>
         <w:rPr>
+          <w:smallCaps/>
           <w:spacing w:val="-2"/>
         </w:rPr>
         <w:t>references</w:t>
@@ -6278,32 +6911,41 @@
         </w:tabs>
         <w:ind w:left="1042" w:hanging="331"/>
         <w:jc w:val="left"/>
-        <w:rPr/>
+        <w:rPr>
+          <w:u w:val="none"/>
+        </w:rPr>
       </w:pPr>
       <w:bookmarkStart w:id="7" w:name="_Toc233365503"/>
       <w:r>
-        <w:rPr/>
+        <w:rPr>
+          <w:smallCaps/>
+        </w:rPr>
         <w:lastRenderedPageBreak/>
         <w:t>Le</w:t>
       </w:r>
       <w:r>
         <w:rPr>
+          <w:smallCaps/>
           <w:spacing w:val="-13"/>
         </w:rPr>
         <w:t xml:space="preserve"> </w:t>
       </w:r>
       <w:r>
-        <w:rPr/>
+        <w:rPr>
+          <w:smallCaps/>
+        </w:rPr>
         <w:t>materiel</w:t>
       </w:r>
       <w:r>
         <w:rPr>
+          <w:smallCaps/>
           <w:spacing w:val="-12"/>
         </w:rPr>
         <w:t xml:space="preserve"> </w:t>
       </w:r>
       <w:r>
         <w:rPr>
+          <w:smallCaps/>
           <w:spacing w:val="-2"/>
         </w:rPr>
         <w:t>utilise</w:t>
@@ -7840,28 +8482,35 @@
         <w:jc w:val="left"/>
       </w:pPr>
       <w:r>
-        <w:rPr/>
+        <w:rPr>
+          <w:u w:val="single"/>
+        </w:rPr>
         <w:t>Vérification</w:t>
       </w:r>
       <w:r>
         <w:rPr>
           <w:spacing w:val="-8"/>
-        </w:rPr>
-        <w:t xml:space="preserve"> </w:t>
-      </w:r>
-      <w:r>
-        <w:rPr/>
+          <w:u w:val="single"/>
+        </w:rPr>
+        <w:t xml:space="preserve"> </w:t>
+      </w:r>
+      <w:r>
+        <w:rPr>
+          <w:u w:val="single"/>
+        </w:rPr>
         <w:t>du</w:t>
       </w:r>
       <w:r>
         <w:rPr>
           <w:spacing w:val="-8"/>
+          <w:u w:val="single"/>
         </w:rPr>
         <w:t xml:space="preserve"> </w:t>
       </w:r>
       <w:r>
         <w:rPr>
           <w:spacing w:val="-2"/>
+          <w:u w:val="single"/>
         </w:rPr>
         <w:t>calibrage</w:t>
       </w:r>
@@ -7949,28 +8598,35 @@
         <w:jc w:val="left"/>
       </w:pPr>
       <w:r>
-        <w:rPr/>
+        <w:rPr>
+          <w:u w:val="single"/>
+        </w:rPr>
         <w:t>Emplacement</w:t>
       </w:r>
       <w:r>
         <w:rPr>
           <w:spacing w:val="-6"/>
-        </w:rPr>
-        <w:t xml:space="preserve"> </w:t>
-      </w:r>
-      <w:r>
-        <w:rPr/>
+          <w:u w:val="single"/>
+        </w:rPr>
+        <w:t xml:space="preserve"> </w:t>
+      </w:r>
+      <w:r>
+        <w:rPr>
+          <w:u w:val="single"/>
+        </w:rPr>
         <w:t>du</w:t>
       </w:r>
       <w:r>
         <w:rPr>
           <w:spacing w:val="-6"/>
+          <w:u w:val="single"/>
         </w:rPr>
         <w:t xml:space="preserve"> </w:t>
       </w:r>
       <w:r>
         <w:rPr>
           <w:spacing w:val="-2"/>
+          <w:u w:val="single"/>
         </w:rPr>
         <w:t>microphone</w:t>
       </w:r>
@@ -8221,42 +8877,54 @@
         <w:jc w:val="left"/>
       </w:pPr>
       <w:r>
-        <w:rPr/>
+        <w:rPr>
+          <w:u w:val="single"/>
+        </w:rPr>
         <w:t>Traitement</w:t>
       </w:r>
       <w:r>
         <w:rPr>
           <w:spacing w:val="-6"/>
-        </w:rPr>
-        <w:t xml:space="preserve"> </w:t>
-      </w:r>
-      <w:r>
-        <w:rPr/>
+          <w:u w:val="single"/>
+        </w:rPr>
+        <w:t xml:space="preserve"> </w:t>
+      </w:r>
+      <w:r>
+        <w:rPr>
+          <w:u w:val="single"/>
+        </w:rPr>
         <w:t>des</w:t>
       </w:r>
       <w:r>
         <w:rPr>
           <w:spacing w:val="-8"/>
-        </w:rPr>
-        <w:t xml:space="preserve"> </w:t>
-      </w:r>
-      <w:r>
-        <w:rPr/>
+          <w:u w:val="single"/>
+        </w:rPr>
+        <w:t xml:space="preserve"> </w:t>
+      </w:r>
+      <w:r>
+        <w:rPr>
+          <w:u w:val="single"/>
+        </w:rPr>
         <w:t>données</w:t>
       </w:r>
       <w:r>
         <w:rPr>
           <w:spacing w:val="-4"/>
-        </w:rPr>
-        <w:t xml:space="preserve"> </w:t>
-      </w:r>
-      <w:r>
-        <w:rPr/>
+          <w:u w:val="single"/>
+        </w:rPr>
+        <w:t xml:space="preserve"> </w:t>
+      </w:r>
+      <w:r>
+        <w:rPr>
+          <w:u w:val="single"/>
+        </w:rPr>
         <w:t>(logiciel</w:t>
       </w:r>
       <w:r>
         <w:rPr>
           <w:spacing w:val="-2"/>
+          <w:u w:val="single"/>
         </w:rPr>
         <w:t xml:space="preserve"> ACOEM dBTRAIT v 6.x.)</w:t>
       </w:r>
@@ -8391,62 +9059,80 @@
         <w:spacing w:before="9"/>
         <w:ind w:left="1042" w:hanging="331"/>
         <w:jc w:val="left"/>
-        <w:rPr/>
+        <w:rPr>
+          <w:u w:val="none"/>
+        </w:rPr>
       </w:pPr>
       <w:bookmarkStart w:id="8" w:name="_Toc233365504"/>
       <w:r>
-        <w:rPr/>
+        <w:rPr>
+          <w:smallCaps/>
+        </w:rPr>
         <w:lastRenderedPageBreak/>
         <w:t>La</w:t>
       </w:r>
       <w:r>
         <w:rPr>
+          <w:smallCaps/>
           <w:spacing w:val="-14"/>
         </w:rPr>
         <w:t xml:space="preserve"> </w:t>
       </w:r>
       <w:r>
-        <w:rPr/>
+        <w:rPr>
+          <w:smallCaps/>
+        </w:rPr>
         <w:t>description</w:t>
       </w:r>
       <w:r>
         <w:rPr>
+          <w:smallCaps/>
           <w:spacing w:val="-9"/>
         </w:rPr>
         <w:t xml:space="preserve"> </w:t>
       </w:r>
       <w:r>
-        <w:rPr/>
+        <w:rPr>
+          <w:smallCaps/>
+        </w:rPr>
         <w:t>du</w:t>
       </w:r>
       <w:r>
         <w:rPr>
+          <w:smallCaps/>
           <w:spacing w:val="-10"/>
         </w:rPr>
         <w:t xml:space="preserve"> </w:t>
       </w:r>
       <w:r>
-        <w:rPr/>
+        <w:rPr>
+          <w:smallCaps/>
+        </w:rPr>
         <w:t>plan</w:t>
       </w:r>
       <w:r>
         <w:rPr>
+          <w:smallCaps/>
           <w:spacing w:val="-10"/>
         </w:rPr>
         <w:t xml:space="preserve"> </w:t>
       </w:r>
       <w:r>
-        <w:rPr/>
+        <w:rPr>
+          <w:smallCaps/>
+        </w:rPr>
         <w:t>de</w:t>
       </w:r>
       <w:r>
         <w:rPr>
+          <w:smallCaps/>
           <w:spacing w:val="-9"/>
         </w:rPr>
         <w:t xml:space="preserve"> </w:t>
       </w:r>
       <w:r>
         <w:rPr>
+          <w:smallCaps/>
           <w:spacing w:val="-2"/>
         </w:rPr>
         <w:t>mesurage</w:t>
@@ -8466,31 +9152,41 @@
         <w:spacing w:before="289"/>
         <w:ind w:left="1562" w:hanging="431"/>
         <w:jc w:val="left"/>
-        <w:rPr/>
-      </w:pPr>
-      <w:r>
-        <w:rPr/>
+        <w:rPr>
+          <w:sz w:val="26"/>
+          <w:u w:val="single"/>
+        </w:rPr>
+      </w:pPr>
+      <w:r>
+        <w:rPr>
+          <w:u w:val="single"/>
+        </w:rPr>
         <w:t>Estimation</w:t>
       </w:r>
       <w:r>
         <w:rPr>
           <w:spacing w:val="-12"/>
-        </w:rPr>
-        <w:t xml:space="preserve"> </w:t>
-      </w:r>
-      <w:r>
-        <w:rPr/>
+          <w:u w:val="single"/>
+        </w:rPr>
+        <w:t xml:space="preserve"> </w:t>
+      </w:r>
+      <w:r>
+        <w:rPr>
+          <w:u w:val="single"/>
+        </w:rPr>
         <w:t>acoustique</w:t>
       </w:r>
       <w:r>
         <w:rPr>
           <w:spacing w:val="-11"/>
+          <w:u w:val="single"/>
         </w:rPr>
         <w:t xml:space="preserve"> </w:t>
       </w:r>
       <w:r>
         <w:rPr>
           <w:spacing w:val="-2"/>
+          <w:u w:val="single"/>
         </w:rPr>
         <w:t>préalable :</w:t>
       </w:r>
@@ -11696,42 +12392,54 @@
         <w:spacing w:before="19"/>
         <w:ind w:left="2151" w:hanging="591"/>
         <w:jc w:val="left"/>
-        <w:rPr/>
-      </w:pPr>
-      <w:r>
-        <w:rPr/>
+        <w:rPr>
+          <w:u w:val="single"/>
+        </w:rPr>
+      </w:pPr>
+      <w:r>
+        <w:rPr>
+          <w:u w:val="single"/>
+        </w:rPr>
         <w:lastRenderedPageBreak/>
         <w:t>Période</w:t>
       </w:r>
       <w:r>
         <w:rPr>
           <w:spacing w:val="-13"/>
-        </w:rPr>
-        <w:t xml:space="preserve"> </w:t>
-      </w:r>
-      <w:r>
-        <w:rPr/>
+          <w:u w:val="single"/>
+        </w:rPr>
+        <w:t xml:space="preserve"> </w:t>
+      </w:r>
+      <w:r>
+        <w:rPr>
+          <w:u w:val="single"/>
+        </w:rPr>
         <w:t>de</w:t>
       </w:r>
       <w:r>
         <w:rPr>
           <w:spacing w:val="-11"/>
-        </w:rPr>
-        <w:t xml:space="preserve"> </w:t>
-      </w:r>
-      <w:r>
-        <w:rPr/>
+          <w:u w:val="single"/>
+        </w:rPr>
+        <w:t xml:space="preserve"> </w:t>
+      </w:r>
+      <w:r>
+        <w:rPr>
+          <w:u w:val="single"/>
+        </w:rPr>
         <w:t>représentativité</w:t>
       </w:r>
       <w:r>
         <w:rPr>
           <w:spacing w:val="-10"/>
+          <w:u w:val="single"/>
         </w:rPr>
         <w:t xml:space="preserve"> </w:t>
       </w:r>
       <w:r>
         <w:rPr>
           <w:spacing w:val="-2"/>
+          <w:u w:val="single"/>
         </w:rPr>
         <w:t>considérée :</w:t>
       </w:r>
@@ -11785,61 +12493,80 @@
         </w:tabs>
         <w:ind w:left="1994" w:hanging="431"/>
         <w:jc w:val="left"/>
-        <w:rPr/>
-      </w:pPr>
-      <w:r>
-        <w:rPr/>
+        <w:rPr>
+          <w:sz w:val="26"/>
+          <w:u w:val="single"/>
+        </w:rPr>
+      </w:pPr>
+      <w:r>
+        <w:rPr>
+          <w:u w:val="single"/>
+        </w:rPr>
         <w:t>Caractéristiques</w:t>
       </w:r>
       <w:r>
         <w:rPr>
           <w:spacing w:val="-8"/>
-        </w:rPr>
-        <w:t xml:space="preserve"> </w:t>
-      </w:r>
-      <w:r>
-        <w:rPr/>
+          <w:u w:val="single"/>
+        </w:rPr>
+        <w:t xml:space="preserve"> </w:t>
+      </w:r>
+      <w:r>
+        <w:rPr>
+          <w:u w:val="single"/>
+        </w:rPr>
         <w:t>de</w:t>
       </w:r>
       <w:r>
         <w:rPr>
           <w:spacing w:val="-7"/>
-        </w:rPr>
-        <w:t xml:space="preserve"> </w:t>
-      </w:r>
-      <w:r>
-        <w:rPr/>
+          <w:u w:val="single"/>
+        </w:rPr>
+        <w:t xml:space="preserve"> </w:t>
+      </w:r>
+      <w:r>
+        <w:rPr>
+          <w:u w:val="single"/>
+        </w:rPr>
         <w:t>l’entreprise</w:t>
       </w:r>
       <w:r>
         <w:rPr>
           <w:spacing w:val="-5"/>
-        </w:rPr>
-        <w:t xml:space="preserve"> </w:t>
-      </w:r>
-      <w:r>
-        <w:rPr/>
+          <w:u w:val="single"/>
+        </w:rPr>
+        <w:t xml:space="preserve"> </w:t>
+      </w:r>
+      <w:r>
+        <w:rPr>
+          <w:u w:val="single"/>
+        </w:rPr>
         <w:t>et</w:t>
       </w:r>
       <w:r>
         <w:rPr>
           <w:spacing w:val="-8"/>
-        </w:rPr>
-        <w:t xml:space="preserve"> </w:t>
-      </w:r>
-      <w:r>
-        <w:rPr/>
+          <w:u w:val="single"/>
+        </w:rPr>
+        <w:t xml:space="preserve"> </w:t>
+      </w:r>
+      <w:r>
+        <w:rPr>
+          <w:u w:val="single"/>
+        </w:rPr>
         <w:t>des</w:t>
       </w:r>
       <w:r>
         <w:rPr>
           <w:spacing w:val="-6"/>
+          <w:u w:val="single"/>
         </w:rPr>
         <w:t xml:space="preserve"> </w:t>
       </w:r>
       <w:r>
         <w:rPr>
           <w:spacing w:val="-5"/>
+          <w:u w:val="single"/>
         </w:rPr>
         <w:t>GEH :</w:t>
       </w:r>
@@ -11852,7 +12579,10 @@
         </w:tabs>
         <w:ind w:left="1994" w:firstLine="0"/>
         <w:jc w:val="right"/>
-        <w:rPr/>
+        <w:rPr>
+          <w:sz w:val="26"/>
+          <w:u w:val="single"/>
+        </w:rPr>
       </w:pPr>
     </w:p>
     <w:p>
@@ -11996,6 +12726,796 @@
           <w:bCs/>
         </w:rPr>
         <w:t>A l’aide d’une dosimétrie qui permet d’évaluer non seulement l’intensité sonore à laquelle une personne est exposée, mais aussi la durée de cette exposition sur une période donnée. Cette approche est essentielle pour comprendre l’impact cumulatif du bruit au fil du temps et évaluer correctement les risques pour la santé. </w:t>
+      </w:r>
+    </w:p>
+    <w:p>
+      <w:pPr>
+        <w:pStyle w:val="Corpsdetexte"/>
+        <w:ind w:right="-17"/>
+        <w:jc w:val="center"/>
+        <w:rPr>
+          <w:bCs/>
+        </w:rPr>
+      </w:pPr>
+      <w:r>
+        <w:rPr>
+          <w:b/>
+          <w:i/>
+          <w:noProof/>
+          <w:sz w:val="16"/>
+        </w:rPr>
+        <mc:AlternateContent>
+          <mc:Choice Requires="wps">
+            <w:drawing>
+              <wp:anchor distT="0" distB="0" distL="114300" distR="114300" simplePos="0" relativeHeight="251927552" behindDoc="0" locked="0" layoutInCell="1" allowOverlap="1" wp14:anchorId="79FD5AD1" wp14:editId="0A4EE955">
+                <wp:simplePos x="0" y="0"/>
+                <wp:positionH relativeFrom="column">
+                  <wp:posOffset>2775585</wp:posOffset>
+                </wp:positionH>
+                <wp:positionV relativeFrom="paragraph">
+                  <wp:posOffset>70485</wp:posOffset>
+                </wp:positionV>
+                <wp:extent cx="4899660" cy="2796540"/>
+                <wp:effectExtent l="0" t="0" r="15240" b="22860"/>
+                <wp:wrapNone/>
+                <wp:docPr id="9" name="Rectangle 9"/>
+                <wp:cNvGraphicFramePr/>
+                <a:graphic xmlns:a="http://schemas.openxmlformats.org/drawingml/2006/main">
+                  <a:graphicData uri="http://schemas.microsoft.com/office/word/2010/wordprocessingShape">
+                    <wps:wsp>
+                      <wps:cNvSpPr/>
+                      <wps:spPr>
+                        <a:xfrm>
+                          <a:off x="0" y="0"/>
+                          <a:ext cx="4899660" cy="2796540"/>
+                        </a:xfrm>
+                        <a:prstGeom prst="rect">
+                          <a:avLst/>
+                        </a:prstGeom>
+                        <a:gradFill flip="none" rotWithShape="1">
+                          <a:gsLst>
+                            <a:gs pos="0">
+                              <a:schemeClr val="accent1">
+                                <a:tint val="66000"/>
+                                <a:satMod val="160000"/>
+                              </a:schemeClr>
+                            </a:gs>
+                            <a:gs pos="50000">
+                              <a:schemeClr val="accent1">
+                                <a:tint val="44500"/>
+                                <a:satMod val="160000"/>
+                              </a:schemeClr>
+                            </a:gs>
+                            <a:gs pos="100000">
+                              <a:schemeClr val="accent1">
+                                <a:tint val="23500"/>
+                                <a:satMod val="160000"/>
+                              </a:schemeClr>
+                            </a:gs>
+                          </a:gsLst>
+                          <a:lin ang="2700000" scaled="1"/>
+                          <a:tileRect/>
+                        </a:gradFill>
+                      </wps:spPr>
+                      <wps:style>
+                        <a:lnRef idx="2">
+                          <a:schemeClr val="accent1">
+                            <a:shade val="15000"/>
+                          </a:schemeClr>
+                        </a:lnRef>
+                        <a:fillRef idx="1">
+                          <a:schemeClr val="accent1"/>
+                        </a:fillRef>
+                        <a:effectRef idx="0">
+                          <a:schemeClr val="accent1"/>
+                        </a:effectRef>
+                        <a:fontRef idx="minor">
+                          <a:schemeClr val="lt1"/>
+                        </a:fontRef>
+                      </wps:style>
+                      <wps:txbx>
+                        <w:txbxContent>
+                          <w:p>
+                            <w:pPr>
+                              <w:jc w:val="center"/>
+                              <w:rPr>
+                                <w:i/>
+                                <w:iCs/>
+                                <w:color w:val="000000" w:themeColor="text1"/>
+                              </w:rPr>
+                            </w:pPr>
+                            <w:r>
+                              <w:rPr>
+                                <w:i/>
+                                <w:iCs/>
+                                <w:color w:val="000000" w:themeColor="text1"/>
+                              </w:rPr>
+                              <w:t>Plan entreprise avec unités de travail</w:t>
+                            </w:r>
+                          </w:p>
+                        </w:txbxContent>
+                      </wps:txbx>
+                      <wps:bodyPr rot="0" spcFirstLastPara="0" vertOverflow="overflow" horzOverflow="overflow" vert="horz" wrap="square" lIns="91440" tIns="45720" rIns="91440" bIns="45720" numCol="1" spcCol="0" rtlCol="0" fromWordArt="0" anchor="ctr" anchorCtr="0" forceAA="0" compatLnSpc="1">
+                        <a:prstTxWarp prst="textNoShape">
+                          <a:avLst/>
+                        </a:prstTxWarp>
+                        <a:noAutofit/>
+                      </wps:bodyPr>
+                    </wps:wsp>
+                  </a:graphicData>
+                </a:graphic>
+                <wp14:sizeRelH relativeFrom="margin">
+                  <wp14:pctWidth>0</wp14:pctWidth>
+                </wp14:sizeRelH>
+                <wp14:sizeRelV relativeFrom="margin">
+                  <wp14:pctHeight>0</wp14:pctHeight>
+                </wp14:sizeRelV>
+              </wp:anchor>
+            </w:drawing>
+          </mc:Choice>
+          <mc:Fallback>
+            <w:pict>
+              <v:rect w14:anchorId="79FD5AD1" id="Rectangle 9" o:spid="_x0000_s1027" style="position:absolute;left:0;text-align:left;margin-left:218.55pt;margin-top:5.55pt;width:385.8pt;height:220.2pt;z-index:251927552;visibility:visible;mso-wrap-style:square;mso-width-percent:0;mso-height-percent:0;mso-wrap-distance-left:9pt;mso-wrap-distance-top:0;mso-wrap-distance-right:9pt;mso-wrap-distance-bottom:0;mso-position-horizontal:absolute;mso-position-horizontal-relative:text;mso-position-vertical:absolute;mso-position-vertical-relative:text;mso-width-percent:0;mso-height-percent:0;mso-width-relative:margin;mso-height-relative:margin;v-text-anchor:middle" o:gfxdata="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" fillcolor="#8aabd3 [2132]" strokecolor="#0a121c [484]" strokeweight="2pt">
+                <v:fill color2="#d6e2f0 [756]" rotate="t" angle="45" colors="0 #9ab5e4;.5 #c2d1ed;1 #e1e8f5" focus="100%" type="gradient"/>
+                <v:textbox>
+                  <w:txbxContent>
+                    <w:p>
+                      <w:pPr>
+                        <w:jc w:val="center"/>
+                        <w:rPr>
+                          <w:i/>
+                          <w:iCs/>
+                          <w:color w:val="000000" w:themeColor="text1"/>
+                        </w:rPr>
+                      </w:pPr>
+                      <w:r>
+                        <w:rPr>
+                          <w:i/>
+                          <w:iCs/>
+                          <w:color w:val="000000" w:themeColor="text1"/>
+                        </w:rPr>
+                        <w:t>Plan entreprise avec unités de travail</w:t>
+                      </w:r>
+                    </w:p>
+                  </w:txbxContent>
+                </v:textbox>
+              </v:rect>
+            </w:pict>
+          </mc:Fallback>
+        </mc:AlternateContent>
+      </w:r>
+    </w:p>
+    <w:p>
+      <w:pPr>
+        <w:pStyle w:val="Corpsdetexte"/>
+        <w:ind w:right="-17"/>
+        <w:jc w:val="center"/>
+        <w:rPr>
+          <w:bCs/>
+        </w:rPr>
+      </w:pPr>
+    </w:p>
+    <w:p>
+      <w:pPr>
+        <w:pStyle w:val="Corpsdetexte"/>
+        <w:ind w:right="-17"/>
+        <w:jc w:val="center"/>
+        <w:rPr>
+          <w:bCs/>
+        </w:rPr>
+      </w:pPr>
+    </w:p>
+    <w:p>
+      <w:pPr>
+        <w:pStyle w:val="Corpsdetexte"/>
+        <w:ind w:right="-17"/>
+        <w:jc w:val="center"/>
+        <w:rPr>
+          <w:bCs/>
+        </w:rPr>
+      </w:pPr>
+    </w:p>
+    <w:p>
+      <w:pPr>
+        <w:pStyle w:val="Corpsdetexte"/>
+        <w:ind w:right="-17"/>
+        <w:jc w:val="center"/>
+        <w:rPr>
+          <w:bCs/>
+        </w:rPr>
+      </w:pPr>
+    </w:p>
+    <w:p>
+      <w:pPr>
+        <w:pStyle w:val="Corpsdetexte"/>
+        <w:ind w:right="-17"/>
+        <w:jc w:val="center"/>
+        <w:rPr>
+          <w:bCs/>
+        </w:rPr>
+      </w:pPr>
+    </w:p>
+    <w:p>
+      <w:pPr>
+        <w:pStyle w:val="Corpsdetexte"/>
+        <w:ind w:right="-17"/>
+        <w:jc w:val="center"/>
+        <w:rPr>
+          <w:bCs/>
+        </w:rPr>
+      </w:pPr>
+    </w:p>
+    <w:p>
+      <w:pPr>
+        <w:pStyle w:val="Corpsdetexte"/>
+        <w:ind w:right="-17"/>
+        <w:jc w:val="center"/>
+        <w:rPr>
+          <w:bCs/>
+        </w:rPr>
+      </w:pPr>
+    </w:p>
+    <w:p>
+      <w:pPr>
+        <w:pStyle w:val="Corpsdetexte"/>
+        <w:ind w:right="-17"/>
+        <w:jc w:val="center"/>
+        <w:rPr>
+          <w:bCs/>
+        </w:rPr>
+      </w:pPr>
+    </w:p>
+    <w:p>
+      <w:pPr>
+        <w:pStyle w:val="Corpsdetexte"/>
+        <w:ind w:right="-17"/>
+        <w:jc w:val="center"/>
+        <w:rPr>
+          <w:bCs/>
+        </w:rPr>
+      </w:pPr>
+    </w:p>
+    <w:p>
+      <w:pPr>
+        <w:pStyle w:val="Corpsdetexte"/>
+        <w:ind w:right="-17"/>
+        <w:jc w:val="center"/>
+        <w:rPr>
+          <w:bCs/>
+        </w:rPr>
+      </w:pPr>
+      <w:r>
+        <w:rPr>
+          <w:b/>
+          <w:i/>
+          <w:noProof/>
+          <w:sz w:val="16"/>
+        </w:rPr>
+        <mc:AlternateContent>
+          <mc:Choice Requires="wps">
+            <w:drawing>
+              <wp:anchor distT="0" distB="0" distL="114300" distR="114300" simplePos="0" relativeHeight="251719680" behindDoc="0" locked="0" layoutInCell="1" allowOverlap="1" wp14:anchorId="19843E7B" wp14:editId="0E2C47D8">
+                <wp:simplePos x="0" y="0"/>
+                <wp:positionH relativeFrom="page">
+                  <wp:posOffset>6873240</wp:posOffset>
+                </wp:positionH>
+                <wp:positionV relativeFrom="paragraph">
+                  <wp:posOffset>1109980</wp:posOffset>
+                </wp:positionV>
+                <wp:extent cx="198120" cy="220980"/>
+                <wp:effectExtent l="0" t="0" r="11430" b="26670"/>
+                <wp:wrapNone/>
+                <wp:docPr id="1564393191" name="Zone de texte 864"/>
+                <wp:cNvGraphicFramePr/>
+                <a:graphic xmlns:a="http://schemas.openxmlformats.org/drawingml/2006/main">
+                  <a:graphicData uri="http://schemas.microsoft.com/office/word/2010/wordprocessingShape">
+                    <wps:wsp>
+                      <wps:cNvSpPr txBox="1"/>
+                      <wps:spPr>
+                        <a:xfrm>
+                          <a:off x="0" y="0"/>
+                          <a:ext cx="198120" cy="220980"/>
+                        </a:xfrm>
+                        <a:prstGeom prst="rect">
+                          <a:avLst/>
+                        </a:prstGeom>
+                        <a:solidFill>
+                          <a:sysClr val="window" lastClr="FFFFFF"/>
+                        </a:solidFill>
+                        <a:ln w="6350">
+                          <a:solidFill>
+                            <a:prstClr val="black"/>
+                          </a:solidFill>
+                        </a:ln>
+                      </wps:spPr>
+                      <wps:txbx>
+                        <w:txbxContent>
+                          <w:p>
+                            <w:r>
+                              <w:t>5</w:t>
+                            </w:r>
+                          </w:p>
+                        </w:txbxContent>
+                      </wps:txbx>
+                      <wps:bodyPr rot="0" spcFirstLastPara="0" vertOverflow="overflow" horzOverflow="overflow" vert="horz" wrap="square" lIns="91440" tIns="45720" rIns="91440" bIns="45720" numCol="1" spcCol="0" rtlCol="0" fromWordArt="0" anchor="t" anchorCtr="0" forceAA="0" compatLnSpc="1">
+                        <a:prstTxWarp prst="textNoShape">
+                          <a:avLst/>
+                        </a:prstTxWarp>
+                        <a:noAutofit/>
+                      </wps:bodyPr>
+                    </wps:wsp>
+                  </a:graphicData>
+                </a:graphic>
+                <wp14:sizeRelH relativeFrom="margin">
+                  <wp14:pctWidth>0</wp14:pctWidth>
+                </wp14:sizeRelH>
+                <wp14:sizeRelV relativeFrom="margin">
+                  <wp14:pctHeight>0</wp14:pctHeight>
+                </wp14:sizeRelV>
+              </wp:anchor>
+            </w:drawing>
+          </mc:Choice>
+          <mc:Fallback>
+            <w:pict>
+              <v:shape w14:anchorId="19843E7B" id="Zone de texte 864" o:spid="_x0000_s1028" type="#_x0000_t202" style="position:absolute;left:0;text-align:left;margin-left:541.2pt;margin-top:87.4pt;width:15.6pt;height:17.4pt;z-index:251719680;visibility:visible;mso-wrap-style:square;mso-width-percent:0;mso-height-percent:0;mso-wrap-distance-left:9pt;mso-wrap-distance-top:0;mso-wrap-distance-right:9pt;mso-wrap-distance-bottom:0;mso-position-horizontal:absolute;mso-position-horizontal-relative:page;mso-position-vertical:absolute;mso-position-vertical-relative:text;mso-width-percent:0;mso-height-percent:0;mso-width-relative:margin;mso-height-relative:margin;v-text-anchor:top" o:gfxdata="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" fillcolor="window" strokeweight=".5pt">
+                <v:textbox>
+                  <w:txbxContent>
+                    <w:p>
+                      <w:r>
+                        <w:t>5</w:t>
+                      </w:r>
+                    </w:p>
+                  </w:txbxContent>
+                </v:textbox>
+                <w10:wrap anchorx="page"/>
+              </v:shape>
+            </w:pict>
+          </mc:Fallback>
+        </mc:AlternateContent>
+      </w:r>
+      <w:r>
+        <w:rPr>
+          <w:b/>
+          <w:i/>
+          <w:noProof/>
+          <w:sz w:val="16"/>
+        </w:rPr>
+        <mc:AlternateContent>
+          <mc:Choice Requires="wps">
+            <w:drawing>
+              <wp:anchor distT="0" distB="0" distL="114300" distR="114300" simplePos="0" relativeHeight="251893760" behindDoc="0" locked="0" layoutInCell="1" allowOverlap="1" wp14:anchorId="5CD42948" wp14:editId="33EE0DFB">
+                <wp:simplePos x="0" y="0"/>
+                <wp:positionH relativeFrom="page">
+                  <wp:posOffset>4587240</wp:posOffset>
+                </wp:positionH>
+                <wp:positionV relativeFrom="paragraph">
+                  <wp:posOffset>2367280</wp:posOffset>
+                </wp:positionV>
+                <wp:extent cx="228600" cy="220980"/>
+                <wp:effectExtent l="0" t="0" r="19050" b="26670"/>
+                <wp:wrapNone/>
+                <wp:docPr id="537882109" name="Zone de texte 864"/>
+                <wp:cNvGraphicFramePr/>
+                <a:graphic xmlns:a="http://schemas.openxmlformats.org/drawingml/2006/main">
+                  <a:graphicData uri="http://schemas.microsoft.com/office/word/2010/wordprocessingShape">
+                    <wps:wsp>
+                      <wps:cNvSpPr txBox="1"/>
+                      <wps:spPr>
+                        <a:xfrm>
+                          <a:off x="0" y="0"/>
+                          <a:ext cx="228600" cy="220980"/>
+                        </a:xfrm>
+                        <a:prstGeom prst="rect">
+                          <a:avLst/>
+                        </a:prstGeom>
+                        <a:solidFill>
+                          <a:sysClr val="window" lastClr="FFFFFF"/>
+                        </a:solidFill>
+                        <a:ln w="6350">
+                          <a:solidFill>
+                            <a:prstClr val="black"/>
+                          </a:solidFill>
+                        </a:ln>
+                      </wps:spPr>
+                      <wps:txbx>
+                        <w:txbxContent>
+                          <w:p>
+                            <w:r>
+                              <w:t>5</w:t>
+                            </w:r>
+                          </w:p>
+                        </w:txbxContent>
+                      </wps:txbx>
+                      <wps:bodyPr rot="0" spcFirstLastPara="0" vertOverflow="overflow" horzOverflow="overflow" vert="horz" wrap="square" lIns="91440" tIns="45720" rIns="91440" bIns="45720" numCol="1" spcCol="0" rtlCol="0" fromWordArt="0" anchor="t" anchorCtr="0" forceAA="0" compatLnSpc="1">
+                        <a:prstTxWarp prst="textNoShape">
+                          <a:avLst/>
+                        </a:prstTxWarp>
+                        <a:noAutofit/>
+                      </wps:bodyPr>
+                    </wps:wsp>
+                  </a:graphicData>
+                </a:graphic>
+                <wp14:sizeRelH relativeFrom="margin">
+                  <wp14:pctWidth>0</wp14:pctWidth>
+                </wp14:sizeRelH>
+                <wp14:sizeRelV relativeFrom="margin">
+                  <wp14:pctHeight>0</wp14:pctHeight>
+                </wp14:sizeRelV>
+              </wp:anchor>
+            </w:drawing>
+          </mc:Choice>
+          <mc:Fallback>
+            <w:pict>
+              <v:shape w14:anchorId="5CD42948" id="_x0000_s1029" type="#_x0000_t202" style="position:absolute;left:0;text-align:left;margin-left:361.2pt;margin-top:186.4pt;width:18pt;height:17.4pt;z-index:251893760;visibility:visible;mso-wrap-style:square;mso-width-percent:0;mso-height-percent:0;mso-wrap-distance-left:9pt;mso-wrap-distance-top:0;mso-wrap-distance-right:9pt;mso-wrap-distance-bottom:0;mso-position-horizontal:absolute;mso-position-horizontal-relative:page;mso-position-vertical:absolute;mso-position-vertical-relative:text;mso-width-percent:0;mso-height-percent:0;mso-width-relative:margin;mso-height-relative:margin;v-text-anchor:top" o:gfxdata="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" fillcolor="window" strokeweight=".5pt">
+                <v:textbox>
+                  <w:txbxContent>
+                    <w:p>
+                      <w:r>
+                        <w:t>5</w:t>
+                      </w:r>
+                    </w:p>
+                  </w:txbxContent>
+                </v:textbox>
+                <w10:wrap anchorx="page"/>
+              </v:shape>
+            </w:pict>
+          </mc:Fallback>
+        </mc:AlternateContent>
+      </w:r>
+      <w:r>
+        <w:rPr>
+          <w:b/>
+          <w:i/>
+          <w:noProof/>
+          <w:sz w:val="16"/>
+        </w:rPr>
+        <mc:AlternateContent>
+          <mc:Choice Requires="wps">
+            <w:drawing>
+              <wp:anchor distT="0" distB="0" distL="114300" distR="114300" simplePos="0" relativeHeight="251891712" behindDoc="0" locked="0" layoutInCell="1" allowOverlap="1" wp14:anchorId="0627FDE2" wp14:editId="35438861">
+                <wp:simplePos x="0" y="0"/>
+                <wp:positionH relativeFrom="page">
+                  <wp:posOffset>4777740</wp:posOffset>
+                </wp:positionH>
+                <wp:positionV relativeFrom="paragraph">
+                  <wp:posOffset>3098800</wp:posOffset>
+                </wp:positionV>
+                <wp:extent cx="228600" cy="236220"/>
+                <wp:effectExtent l="0" t="0" r="19050" b="11430"/>
+                <wp:wrapNone/>
+                <wp:docPr id="200569158" name="Zone de texte 864"/>
+                <wp:cNvGraphicFramePr/>
+                <a:graphic xmlns:a="http://schemas.openxmlformats.org/drawingml/2006/main">
+                  <a:graphicData uri="http://schemas.microsoft.com/office/word/2010/wordprocessingShape">
+                    <wps:wsp>
+                      <wps:cNvSpPr txBox="1"/>
+                      <wps:spPr>
+                        <a:xfrm>
+                          <a:off x="0" y="0"/>
+                          <a:ext cx="228600" cy="236220"/>
+                        </a:xfrm>
+                        <a:prstGeom prst="rect">
+                          <a:avLst/>
+                        </a:prstGeom>
+                        <a:solidFill>
+                          <a:sysClr val="window" lastClr="FFFFFF"/>
+                        </a:solidFill>
+                        <a:ln w="6350">
+                          <a:solidFill>
+                            <a:prstClr val="black"/>
+                          </a:solidFill>
+                        </a:ln>
+                      </wps:spPr>
+                      <wps:txbx>
+                        <w:txbxContent>
+                          <w:p>
+                            <w:r>
+                              <w:t>4</w:t>
+                            </w:r>
+                          </w:p>
+                        </w:txbxContent>
+                      </wps:txbx>
+                      <wps:bodyPr rot="0" spcFirstLastPara="0" vertOverflow="overflow" horzOverflow="overflow" vert="horz" wrap="square" lIns="91440" tIns="45720" rIns="91440" bIns="45720" numCol="1" spcCol="0" rtlCol="0" fromWordArt="0" anchor="t" anchorCtr="0" forceAA="0" compatLnSpc="1">
+                        <a:prstTxWarp prst="textNoShape">
+                          <a:avLst/>
+                        </a:prstTxWarp>
+                        <a:noAutofit/>
+                      </wps:bodyPr>
+                    </wps:wsp>
+                  </a:graphicData>
+                </a:graphic>
+                <wp14:sizeRelH relativeFrom="margin">
+                  <wp14:pctWidth>0</wp14:pctWidth>
+                </wp14:sizeRelH>
+                <wp14:sizeRelV relativeFrom="margin">
+                  <wp14:pctHeight>0</wp14:pctHeight>
+                </wp14:sizeRelV>
+              </wp:anchor>
+            </w:drawing>
+          </mc:Choice>
+          <mc:Fallback>
+            <w:pict>
+              <v:shape w14:anchorId="0627FDE2" id="_x0000_s1030" type="#_x0000_t202" style="position:absolute;left:0;text-align:left;margin-left:376.2pt;margin-top:244pt;width:18pt;height:18.6pt;z-index:251891712;visibility:visible;mso-wrap-style:square;mso-width-percent:0;mso-height-percent:0;mso-wrap-distance-left:9pt;mso-wrap-distance-top:0;mso-wrap-distance-right:9pt;mso-wrap-distance-bottom:0;mso-position-horizontal:absolute;mso-position-horizontal-relative:page;mso-position-vertical:absolute;mso-position-vertical-relative:text;mso-width-percent:0;mso-height-percent:0;mso-width-relative:margin;mso-height-relative:margin;v-text-anchor:top" o:gfxdata="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" fillcolor="window" strokeweight=".5pt">
+                <v:textbox>
+                  <w:txbxContent>
+                    <w:p>
+                      <w:r>
+                        <w:t>4</w:t>
+                      </w:r>
+                    </w:p>
+                  </w:txbxContent>
+                </v:textbox>
+                <w10:wrap anchorx="page"/>
+              </v:shape>
+            </w:pict>
+          </mc:Fallback>
+        </mc:AlternateContent>
+      </w:r>
+      <w:r>
+        <w:rPr>
+          <w:b/>
+          <w:i/>
+          <w:noProof/>
+          <w:sz w:val="16"/>
+        </w:rPr>
+        <mc:AlternateContent>
+          <mc:Choice Requires="wps">
+            <w:drawing>
+              <wp:anchor distT="0" distB="0" distL="114300" distR="114300" simplePos="0" relativeHeight="251717632" behindDoc="0" locked="0" layoutInCell="1" allowOverlap="1" wp14:anchorId="2DDA8D95" wp14:editId="5CF1AAE2">
+                <wp:simplePos x="0" y="0"/>
+                <wp:positionH relativeFrom="page">
+                  <wp:posOffset>3909060</wp:posOffset>
+                </wp:positionH>
+                <wp:positionV relativeFrom="paragraph">
+                  <wp:posOffset>3059430</wp:posOffset>
+                </wp:positionV>
+                <wp:extent cx="213360" cy="228600"/>
+                <wp:effectExtent l="0" t="0" r="15240" b="19050"/>
+                <wp:wrapNone/>
+                <wp:docPr id="2108502289" name="Zone de texte 864"/>
+                <wp:cNvGraphicFramePr/>
+                <a:graphic xmlns:a="http://schemas.openxmlformats.org/drawingml/2006/main">
+                  <a:graphicData uri="http://schemas.microsoft.com/office/word/2010/wordprocessingShape">
+                    <wps:wsp>
+                      <wps:cNvSpPr txBox="1"/>
+                      <wps:spPr>
+                        <a:xfrm>
+                          <a:off x="0" y="0"/>
+                          <a:ext cx="213360" cy="228600"/>
+                        </a:xfrm>
+                        <a:prstGeom prst="rect">
+                          <a:avLst/>
+                        </a:prstGeom>
+                        <a:solidFill>
+                          <a:sysClr val="window" lastClr="FFFFFF"/>
+                        </a:solidFill>
+                        <a:ln w="6350">
+                          <a:solidFill>
+                            <a:prstClr val="black"/>
+                          </a:solidFill>
+                        </a:ln>
+                      </wps:spPr>
+                      <wps:txbx>
+                        <w:txbxContent>
+                          <w:p>
+                            <w:r>
+                              <w:t>3</w:t>
+                            </w:r>
+                          </w:p>
+                        </w:txbxContent>
+                      </wps:txbx>
+                      <wps:bodyPr rot="0" spcFirstLastPara="0" vertOverflow="overflow" horzOverflow="overflow" vert="horz" wrap="square" lIns="91440" tIns="45720" rIns="91440" bIns="45720" numCol="1" spcCol="0" rtlCol="0" fromWordArt="0" anchor="t" anchorCtr="0" forceAA="0" compatLnSpc="1">
+                        <a:prstTxWarp prst="textNoShape">
+                          <a:avLst/>
+                        </a:prstTxWarp>
+                        <a:noAutofit/>
+                      </wps:bodyPr>
+                    </wps:wsp>
+                  </a:graphicData>
+                </a:graphic>
+                <wp14:sizeRelH relativeFrom="margin">
+                  <wp14:pctWidth>0</wp14:pctWidth>
+                </wp14:sizeRelH>
+                <wp14:sizeRelV relativeFrom="margin">
+                  <wp14:pctHeight>0</wp14:pctHeight>
+                </wp14:sizeRelV>
+              </wp:anchor>
+            </w:drawing>
+          </mc:Choice>
+          <mc:Fallback>
+            <w:pict>
+              <v:shape w14:anchorId="2DDA8D95" id="_x0000_s1031" type="#_x0000_t202" style="position:absolute;left:0;text-align:left;margin-left:307.8pt;margin-top:240.9pt;width:16.8pt;height:18pt;z-index:251717632;visibility:visible;mso-wrap-style:square;mso-width-percent:0;mso-height-percent:0;mso-wrap-distance-left:9pt;mso-wrap-distance-top:0;mso-wrap-distance-right:9pt;mso-wrap-distance-bottom:0;mso-position-horizontal:absolute;mso-position-horizontal-relative:page;mso-position-vertical:absolute;mso-position-vertical-relative:text;mso-width-percent:0;mso-height-percent:0;mso-width-relative:margin;mso-height-relative:margin;v-text-anchor:top" o:gfxdata="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" fillcolor="window" strokeweight=".5pt">
+                <v:textbox>
+                  <w:txbxContent>
+                    <w:p>
+                      <w:r>
+                        <w:t>3</w:t>
+                      </w:r>
+                    </w:p>
+                  </w:txbxContent>
+                </v:textbox>
+                <w10:wrap anchorx="page"/>
+              </v:shape>
+            </w:pict>
+          </mc:Fallback>
+        </mc:AlternateContent>
+      </w:r>
+      <w:r>
+        <w:rPr>
+          <w:b/>
+          <w:i/>
+          <w:noProof/>
+          <w:sz w:val="16"/>
+        </w:rPr>
+        <mc:AlternateContent>
+          <mc:Choice Requires="wps">
+            <w:drawing>
+              <wp:anchor distT="0" distB="0" distL="114300" distR="114300" simplePos="0" relativeHeight="251889664" behindDoc="0" locked="0" layoutInCell="1" allowOverlap="1" wp14:anchorId="732311D1" wp14:editId="28DC3A10">
+                <wp:simplePos x="0" y="0"/>
+                <wp:positionH relativeFrom="page">
+                  <wp:posOffset>6918960</wp:posOffset>
+                </wp:positionH>
+                <wp:positionV relativeFrom="paragraph">
+                  <wp:posOffset>2153920</wp:posOffset>
+                </wp:positionV>
+                <wp:extent cx="213360" cy="228600"/>
+                <wp:effectExtent l="0" t="0" r="15240" b="19050"/>
+                <wp:wrapNone/>
+                <wp:docPr id="1085117822" name="Zone de texte 864"/>
+                <wp:cNvGraphicFramePr/>
+                <a:graphic xmlns:a="http://schemas.openxmlformats.org/drawingml/2006/main">
+                  <a:graphicData uri="http://schemas.microsoft.com/office/word/2010/wordprocessingShape">
+                    <wps:wsp>
+                      <wps:cNvSpPr txBox="1"/>
+                      <wps:spPr>
+                        <a:xfrm>
+                          <a:off x="0" y="0"/>
+                          <a:ext cx="213360" cy="228600"/>
+                        </a:xfrm>
+                        <a:prstGeom prst="rect">
+                          <a:avLst/>
+                        </a:prstGeom>
+                        <a:solidFill>
+                          <a:sysClr val="window" lastClr="FFFFFF"/>
+                        </a:solidFill>
+                        <a:ln w="6350">
+                          <a:solidFill>
+                            <a:prstClr val="black"/>
+                          </a:solidFill>
+                        </a:ln>
+                      </wps:spPr>
+                      <wps:txbx>
+                        <w:txbxContent>
+                          <w:p>
+                            <w:r>
+                              <w:t>2</w:t>
+                            </w:r>
+                          </w:p>
+                        </w:txbxContent>
+                      </wps:txbx>
+                      <wps:bodyPr rot="0" spcFirstLastPara="0" vertOverflow="overflow" horzOverflow="overflow" vert="horz" wrap="square" lIns="91440" tIns="45720" rIns="91440" bIns="45720" numCol="1" spcCol="0" rtlCol="0" fromWordArt="0" anchor="t" anchorCtr="0" forceAA="0" compatLnSpc="1">
+                        <a:prstTxWarp prst="textNoShape">
+                          <a:avLst/>
+                        </a:prstTxWarp>
+                        <a:noAutofit/>
+                      </wps:bodyPr>
+                    </wps:wsp>
+                  </a:graphicData>
+                </a:graphic>
+                <wp14:sizeRelH relativeFrom="margin">
+                  <wp14:pctWidth>0</wp14:pctWidth>
+                </wp14:sizeRelH>
+                <wp14:sizeRelV relativeFrom="margin">
+                  <wp14:pctHeight>0</wp14:pctHeight>
+                </wp14:sizeRelV>
+              </wp:anchor>
+            </w:drawing>
+          </mc:Choice>
+          <mc:Fallback>
+            <w:pict>
+              <v:shape w14:anchorId="732311D1" id="_x0000_s1032" type="#_x0000_t202" style="position:absolute;left:0;text-align:left;margin-left:544.8pt;margin-top:169.6pt;width:16.8pt;height:18pt;z-index:251889664;visibility:visible;mso-wrap-style:square;mso-width-percent:0;mso-height-percent:0;mso-wrap-distance-left:9pt;mso-wrap-distance-top:0;mso-wrap-distance-right:9pt;mso-wrap-distance-bottom:0;mso-position-horizontal:absolute;mso-position-horizontal-relative:page;mso-position-vertical:absolute;mso-position-vertical-relative:text;mso-width-percent:0;mso-height-percent:0;mso-width-relative:margin;mso-height-relative:margin;v-text-anchor:top" o:gfxdata="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" fillcolor="window" strokeweight=".5pt">
+                <v:textbox>
+                  <w:txbxContent>
+                    <w:p>
+                      <w:r>
+                        <w:t>2</w:t>
+                      </w:r>
+                    </w:p>
+                  </w:txbxContent>
+                </v:textbox>
+                <w10:wrap anchorx="page"/>
+              </v:shape>
+            </w:pict>
+          </mc:Fallback>
+        </mc:AlternateContent>
+      </w:r>
+      <w:r>
+        <w:rPr>
+          <w:b/>
+          <w:i/>
+          <w:noProof/>
+          <w:sz w:val="16"/>
+        </w:rPr>
+        <mc:AlternateContent>
+          <mc:Choice Requires="wps">
+            <w:drawing>
+              <wp:anchor distT="0" distB="0" distL="114300" distR="114300" simplePos="0" relativeHeight="251715584" behindDoc="0" locked="0" layoutInCell="1" allowOverlap="1" wp14:anchorId="467C3F3D" wp14:editId="6228F0D2">
+                <wp:simplePos x="0" y="0"/>
+                <wp:positionH relativeFrom="column">
+                  <wp:posOffset>6271260</wp:posOffset>
+                </wp:positionH>
+                <wp:positionV relativeFrom="paragraph">
+                  <wp:posOffset>2861310</wp:posOffset>
+                </wp:positionV>
+                <wp:extent cx="228600" cy="259080"/>
+                <wp:effectExtent l="0" t="0" r="19050" b="26670"/>
+                <wp:wrapNone/>
+                <wp:docPr id="2026544295" name="Zone de texte 864"/>
+                <wp:cNvGraphicFramePr/>
+                <a:graphic xmlns:a="http://schemas.openxmlformats.org/drawingml/2006/main">
+                  <a:graphicData uri="http://schemas.microsoft.com/office/word/2010/wordprocessingShape">
+                    <wps:wsp>
+                      <wps:cNvSpPr txBox="1"/>
+                      <wps:spPr>
+                        <a:xfrm>
+                          <a:off x="0" y="0"/>
+                          <a:ext cx="228600" cy="259080"/>
+                        </a:xfrm>
+                        <a:prstGeom prst="rect">
+                          <a:avLst/>
+                        </a:prstGeom>
+                        <a:solidFill>
+                          <a:schemeClr val="lt1"/>
+                        </a:solidFill>
+                        <a:ln w="6350">
+                          <a:solidFill>
+                            <a:prstClr val="black"/>
+                          </a:solidFill>
+                        </a:ln>
+                      </wps:spPr>
+                      <wps:txbx>
+                        <w:txbxContent>
+                          <w:p>
+                            <w:r>
+                              <w:t>1</w:t>
+                            </w:r>
+                          </w:p>
+                        </w:txbxContent>
+                      </wps:txbx>
+                      <wps:bodyPr rot="0" spcFirstLastPara="0" vertOverflow="overflow" horzOverflow="overflow" vert="horz" wrap="square" lIns="91440" tIns="45720" rIns="91440" bIns="45720" numCol="1" spcCol="0" rtlCol="0" fromWordArt="0" anchor="t" anchorCtr="0" forceAA="0" compatLnSpc="1">
+                        <a:prstTxWarp prst="textNoShape">
+                          <a:avLst/>
+                        </a:prstTxWarp>
+                        <a:noAutofit/>
+                      </wps:bodyPr>
+                    </wps:wsp>
+                  </a:graphicData>
+                </a:graphic>
+                <wp14:sizeRelH relativeFrom="margin">
+                  <wp14:pctWidth>0</wp14:pctWidth>
+                </wp14:sizeRelH>
+                <wp14:sizeRelV relativeFrom="margin">
+                  <wp14:pctHeight>0</wp14:pctHeight>
+                </wp14:sizeRelV>
+              </wp:anchor>
+            </w:drawing>
+          </mc:Choice>
+          <mc:Fallback>
+            <w:pict>
+              <v:shape w14:anchorId="467C3F3D" id="_x0000_s1033" type="#_x0000_t202" style="position:absolute;left:0;text-align:left;margin-left:493.8pt;margin-top:225.3pt;width:18pt;height:20.4pt;z-index:251715584;visibility:visible;mso-wrap-style:square;mso-width-percent:0;mso-height-percent:0;mso-wrap-distance-left:9pt;mso-wrap-distance-top:0;mso-wrap-distance-right:9pt;mso-wrap-distance-bottom:0;mso-position-horizontal:absolute;mso-position-horizontal-relative:text;mso-position-vertical:absolute;mso-position-vertical-relative:text;mso-width-percent:0;mso-height-percent:0;mso-width-relative:margin;mso-height-relative:margin;v-text-anchor:top" o:gfxdata="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" fillcolor="white [3201]" strokeweight=".5pt">
+                <v:textbox>
+                  <w:txbxContent>
+                    <w:p>
+                      <w:r>
+                        <w:t>1</w:t>
+                      </w:r>
+                    </w:p>
+                  </w:txbxContent>
+                </v:textbox>
+              </v:shape>
+            </w:pict>
+          </mc:Fallback>
+        </mc:AlternateContent>
       </w:r>
     </w:p>
     <w:p>
@@ -15282,7 +16802,7 @@
         <w:tc>
           <w:tcPr>
             <w:tcW w:w="2376" w:type="dxa"/>
-            <w:shd w:val="clear" w:color="auto" w:fill="DCE6EF"/>
+            <w:shd w:val="clear" w:color="auto" w:fill="B3B3B3"/>
           </w:tcPr>
           <w:p>
             <w:pPr>
@@ -15319,7 +16839,7 @@
             <w:tcBorders>
               <w:bottom w:val="single" w:sz="4" w:space="0" w:color="auto"/>
             </w:tcBorders>
-            <w:shd w:val="clear" w:color="auto" w:fill="DCE6EF"/>
+            <w:shd w:val="clear" w:color="auto" w:fill="B3B3B3"/>
           </w:tcPr>
           <w:p>
             <w:pPr>
@@ -15364,7 +16884,7 @@
         <w:tc>
           <w:tcPr>
             <w:tcW w:w="4565" w:type="dxa"/>
-            <w:shd w:val="clear" w:color="auto" w:fill="DCE6EF"/>
+            <w:shd w:val="clear" w:color="auto" w:fill="B3B3B3"/>
           </w:tcPr>
           <w:p>
             <w:pPr>
@@ -15491,7 +17011,7 @@
         <w:tc>
           <w:tcPr>
             <w:tcW w:w="2376" w:type="dxa"/>
-            <w:shd w:val="clear" w:color="auto" w:fill="EAF3FA" w:themeFill="accent4" w:themeFillTint="33"/>
+            <w:shd w:val="clear" w:color="auto" w:fill="E5DFEC" w:themeFill="accent4" w:themeFillTint="33"/>
           </w:tcPr>
           <w:p>
             <w:pPr>
@@ -15523,7 +17043,7 @@
         <w:tc>
           <w:tcPr>
             <w:tcW w:w="3686" w:type="dxa"/>
-            <w:shd w:val="clear" w:color="auto" w:fill="EAF3FA" w:themeFill="accent4" w:themeFillTint="33"/>
+            <w:shd w:val="clear" w:color="auto" w:fill="E5DFEC" w:themeFill="accent4" w:themeFillTint="33"/>
             <w:vAlign w:val="center"/>
           </w:tcPr>
           <w:p>
@@ -15546,7 +17066,7 @@
         <w:tc>
           <w:tcPr>
             <w:tcW w:w="4565" w:type="dxa"/>
-            <w:shd w:val="clear" w:color="auto" w:fill="EAF3FA" w:themeFill="accent4" w:themeFillTint="33"/>
+            <w:shd w:val="clear" w:color="auto" w:fill="E5DFEC" w:themeFill="accent4" w:themeFillTint="33"/>
           </w:tcPr>
           <w:p>
             <w:pPr>
@@ -15574,7 +17094,7 @@
         <w:tc>
           <w:tcPr>
             <w:tcW w:w="2376" w:type="dxa"/>
-            <w:shd w:val="clear" w:color="auto" w:fill="EAF3FA" w:themeFill="accent4" w:themeFillTint="33"/>
+            <w:shd w:val="clear" w:color="auto" w:fill="E5DFEC" w:themeFill="accent4" w:themeFillTint="33"/>
           </w:tcPr>
           <w:p>
             <w:pPr>
@@ -15611,7 +17131,7 @@
         <w:tc>
           <w:tcPr>
             <w:tcW w:w="3686" w:type="dxa"/>
-            <w:shd w:val="clear" w:color="auto" w:fill="EAF3FA" w:themeFill="accent4" w:themeFillTint="33"/>
+            <w:shd w:val="clear" w:color="auto" w:fill="E5DFEC" w:themeFill="accent4" w:themeFillTint="33"/>
             <w:vAlign w:val="center"/>
           </w:tcPr>
           <w:p>
@@ -15634,7 +17154,7 @@
         <w:tc>
           <w:tcPr>
             <w:tcW w:w="4565" w:type="dxa"/>
-            <w:shd w:val="clear" w:color="auto" w:fill="EAF3FA" w:themeFill="accent4" w:themeFillTint="33"/>
+            <w:shd w:val="clear" w:color="auto" w:fill="E5DFEC" w:themeFill="accent4" w:themeFillTint="33"/>
           </w:tcPr>
           <w:p>
             <w:pPr>
@@ -15662,7 +17182,7 @@
         <w:tc>
           <w:tcPr>
             <w:tcW w:w="2376" w:type="dxa"/>
-            <w:shd w:val="clear" w:color="auto" w:fill="D6E8F5" w:themeFill="accent4" w:themeFillTint="66"/>
+            <w:shd w:val="clear" w:color="auto" w:fill="CCC0D9" w:themeFill="accent4" w:themeFillTint="66"/>
           </w:tcPr>
           <w:p>
             <w:pPr>
@@ -15711,7 +17231,7 @@
           <w:tcPr>
             <w:tcW w:w="3686" w:type="dxa"/>
             <w:vMerge w:val="restart"/>
-            <w:shd w:val="clear" w:color="auto" w:fill="D6E8F5" w:themeFill="accent4" w:themeFillTint="66"/>
+            <w:shd w:val="clear" w:color="auto" w:fill="CCC0D9" w:themeFill="accent4" w:themeFillTint="66"/>
             <w:vAlign w:val="center"/>
           </w:tcPr>
           <w:p>
@@ -15734,7 +17254,7 @@
         <w:tc>
           <w:tcPr>
             <w:tcW w:w="4565" w:type="dxa"/>
-            <w:shd w:val="clear" w:color="auto" w:fill="D6E8F5" w:themeFill="accent4" w:themeFillTint="66"/>
+            <w:shd w:val="clear" w:color="auto" w:fill="CCC0D9" w:themeFill="accent4" w:themeFillTint="66"/>
           </w:tcPr>
           <w:p>
             <w:pPr>
@@ -15762,7 +17282,7 @@
         <w:tc>
           <w:tcPr>
             <w:tcW w:w="2376" w:type="dxa"/>
-            <w:shd w:val="clear" w:color="auto" w:fill="D6E8F5" w:themeFill="accent4" w:themeFillTint="66"/>
+            <w:shd w:val="clear" w:color="auto" w:fill="CCC0D9" w:themeFill="accent4" w:themeFillTint="66"/>
           </w:tcPr>
           <w:p>
             <w:pPr>
@@ -15795,7 +17315,7 @@
           <w:tcPr>
             <w:tcW w:w="3686" w:type="dxa"/>
             <w:vMerge/>
-            <w:shd w:val="clear" w:color="auto" w:fill="D6E8F5" w:themeFill="accent4" w:themeFillTint="66"/>
+            <w:shd w:val="clear" w:color="auto" w:fill="CCC0D9" w:themeFill="accent4" w:themeFillTint="66"/>
             <w:vAlign w:val="center"/>
           </w:tcPr>
           <w:p>
@@ -15818,7 +17338,7 @@
         <w:tc>
           <w:tcPr>
             <w:tcW w:w="4565" w:type="dxa"/>
-            <w:shd w:val="clear" w:color="auto" w:fill="D6E8F5" w:themeFill="accent4" w:themeFillTint="66"/>
+            <w:shd w:val="clear" w:color="auto" w:fill="CCC0D9" w:themeFill="accent4" w:themeFillTint="66"/>
           </w:tcPr>
           <w:p>
             <w:pPr>
@@ -15846,7 +17366,7 @@
     <w:bookmarkEnd w:id="13"/>
     <w:p>
       <w:pPr>
-        <w:pStyle w:val="Titre2"/>
+        <w:pStyle w:val="Paragraphedeliste"/>
         <w:numPr>
           <w:ilvl w:val="0"/>
           <w:numId w:val="18"/>
@@ -15859,17 +17379,22 @@
         <w:jc w:val="left"/>
         <w:rPr>
           <w:b/>
+          <w:sz w:val="32"/>
         </w:rPr>
       </w:pPr>
       <w:r>
         <w:rPr>
           <w:b/>
+          <w:sz w:val="32"/>
+          <w:u w:val="single"/>
         </w:rPr>
         <w:t>L</w:t>
       </w:r>
       <w:r>
         <w:rPr>
           <w:b/>
+          <w:sz w:val="26"/>
+          <w:u w:val="single"/>
         </w:rPr>
         <w:t>ES</w:t>
       </w:r>
@@ -15877,12 +17402,16 @@
         <w:rPr>
           <w:b/>
           <w:spacing w:val="-9"/>
+          <w:sz w:val="26"/>
+          <w:u w:val="single"/>
         </w:rPr>
         <w:t xml:space="preserve"> </w:t>
       </w:r>
       <w:r>
         <w:rPr>
           <w:b/>
+          <w:sz w:val="26"/>
+          <w:u w:val="single"/>
         </w:rPr>
         <w:t>RESULTATS</w:t>
       </w:r>
@@ -15891,12 +17420,16 @@
           <w:b/>
           <w:spacing w:val="66"/>
           <w:w w:val="150"/>
+          <w:sz w:val="26"/>
+          <w:u w:val="single"/>
         </w:rPr>
         <w:t xml:space="preserve"> </w:t>
       </w:r>
       <w:r>
         <w:rPr>
           <w:b/>
+          <w:sz w:val="24"/>
+          <w:u w:val="single"/>
         </w:rPr>
         <w:t>&amp;</w:t>
       </w:r>
@@ -15905,12 +17438,16 @@
           <w:b/>
           <w:spacing w:val="73"/>
           <w:w w:val="150"/>
+          <w:sz w:val="24"/>
+          <w:u w:val="single"/>
         </w:rPr>
         <w:t xml:space="preserve"> </w:t>
       </w:r>
       <w:r>
         <w:rPr>
           <w:b/>
+          <w:sz w:val="26"/>
+          <w:u w:val="single"/>
         </w:rPr>
         <w:t>CONCLUSIONS</w:t>
       </w:r>
@@ -15918,6 +17455,8 @@
         <w:rPr>
           <w:b/>
           <w:spacing w:val="-7"/>
+          <w:sz w:val="26"/>
+          <w:u w:val="single"/>
         </w:rPr>
         <w:t xml:space="preserve"> </w:t>
       </w:r>
@@ -15925,6 +17464,8 @@
         <w:rPr>
           <w:b/>
           <w:spacing w:val="-2"/>
+          <w:sz w:val="26"/>
+          <w:u w:val="single"/>
         </w:rPr>
         <w:t>TECHNIQUES :</w:t>
       </w:r>
@@ -15948,7 +17489,7 @@
     </w:p>
     <w:p>
       <w:pPr>
-        <w:pStyle w:val="Titre4"/>
+        <w:pStyle w:val="Paragraphedeliste"/>
         <w:tabs>
           <w:tab w:val="left" w:pos="1068"/>
         </w:tabs>
@@ -15957,12 +17498,17 @@
         <w:rPr>
           <w:rFonts w:asciiTheme="minorHAnsi" w:hAnsiTheme="minorHAnsi" w:cstheme="minorHAnsi"/>
           <w:bCs/>
+          <w:sz w:val="28"/>
+          <w:szCs w:val="28"/>
         </w:rPr>
       </w:pPr>
       <w:r>
         <w:rPr>
           <w:rFonts w:asciiTheme="minorHAnsi" w:hAnsiTheme="minorHAnsi" w:cstheme="minorHAnsi"/>
           <w:bCs/>
+          <w:sz w:val="28"/>
+          <w:szCs w:val="28"/>
+          <w:u w:val="single"/>
         </w:rPr>
         <w:t>7.1. Résultat des dosimétries :</w:t>
       </w:r>
@@ -16016,7 +17562,7 @@
           <w:tcPr>
             <w:tcW w:w="2676" w:type="dxa"/>
             <w:vMerge w:val="restart"/>
-            <w:shd w:val="clear" w:color="auto" w:fill="DCE6EF"/>
+            <w:shd w:val="clear" w:color="auto" w:fill="B3B3B3"/>
           </w:tcPr>
           <w:p>
             <w:pPr>
@@ -16072,7 +17618,7 @@
           <w:tcPr>
             <w:tcW w:w="3273" w:type="dxa"/>
             <w:vMerge w:val="restart"/>
-            <w:shd w:val="clear" w:color="auto" w:fill="DCE6EF"/>
+            <w:shd w:val="clear" w:color="auto" w:fill="B3B3B3"/>
           </w:tcPr>
           <w:p>
             <w:pPr>
@@ -16139,7 +17685,7 @@
           <w:tcPr>
             <w:tcW w:w="1753" w:type="dxa"/>
             <w:vMerge w:val="restart"/>
-            <w:shd w:val="clear" w:color="auto" w:fill="DCE6EF"/>
+            <w:shd w:val="clear" w:color="auto" w:fill="B3B3B3"/>
           </w:tcPr>
           <w:p>
             <w:pPr>
@@ -16216,7 +17762,7 @@
           <w:tcPr>
             <w:tcW w:w="5329" w:type="dxa"/>
             <w:gridSpan w:val="3"/>
-            <w:shd w:val="clear" w:color="auto" w:fill="DCE6EF"/>
+            <w:shd w:val="clear" w:color="auto" w:fill="B3B3B3"/>
           </w:tcPr>
           <w:p>
             <w:pPr>
@@ -16304,7 +17850,7 @@
             <w:tcBorders>
               <w:top w:val="nil"/>
             </w:tcBorders>
-            <w:shd w:val="clear" w:color="auto" w:fill="DCE6EF"/>
+            <w:shd w:val="clear" w:color="auto" w:fill="B3B3B3"/>
           </w:tcPr>
           <w:p>
             <w:pPr>
@@ -16322,7 +17868,7 @@
             <w:tcBorders>
               <w:top w:val="nil"/>
             </w:tcBorders>
-            <w:shd w:val="clear" w:color="auto" w:fill="DCE6EF"/>
+            <w:shd w:val="clear" w:color="auto" w:fill="B3B3B3"/>
           </w:tcPr>
           <w:p>
             <w:pPr>
@@ -16340,7 +17886,7 @@
             <w:tcBorders>
               <w:top w:val="nil"/>
             </w:tcBorders>
-            <w:shd w:val="clear" w:color="auto" w:fill="DCE6EF"/>
+            <w:shd w:val="clear" w:color="auto" w:fill="B3B3B3"/>
           </w:tcPr>
           <w:p>
             <w:pPr>
@@ -16354,7 +17900,7 @@
         <w:tc>
           <w:tcPr>
             <w:tcW w:w="1776" w:type="dxa"/>
-            <w:shd w:val="clear" w:color="auto" w:fill="EEF3F8"/>
+            <w:shd w:val="clear" w:color="auto" w:fill="DFDFDF"/>
           </w:tcPr>
           <w:p>
             <w:pPr>
@@ -16432,7 +17978,7 @@
         <w:tc>
           <w:tcPr>
             <w:tcW w:w="1777" w:type="dxa"/>
-            <w:shd w:val="clear" w:color="auto" w:fill="EEF3F8"/>
+            <w:shd w:val="clear" w:color="auto" w:fill="DFDFDF"/>
           </w:tcPr>
           <w:p>
             <w:pPr>
@@ -16510,7 +18056,7 @@
         <w:tc>
           <w:tcPr>
             <w:tcW w:w="1776" w:type="dxa"/>
-            <w:shd w:val="clear" w:color="auto" w:fill="EEF3F8"/>
+            <w:shd w:val="clear" w:color="auto" w:fill="DFDFDF"/>
           </w:tcPr>
           <w:p>
             <w:pPr>
@@ -17860,16 +19406,22 @@
     </w:p>
     <w:p>
       <w:pPr>
-        <w:pStyle w:val="Titre4"/>
+        <w:pStyle w:val="Corpsdetexte"/>
         <w:spacing w:before="83"/>
         <w:ind w:left="709"/>
         <w:rPr>
           <w:rFonts w:asciiTheme="minorHAnsi" w:hAnsiTheme="minorHAnsi" w:cstheme="minorHAnsi"/>
+          <w:sz w:val="28"/>
+          <w:szCs w:val="28"/>
+          <w:u w:val="single"/>
         </w:rPr>
       </w:pPr>
       <w:r>
         <w:rPr>
           <w:rFonts w:asciiTheme="minorHAnsi" w:hAnsiTheme="minorHAnsi" w:cstheme="minorHAnsi"/>
+          <w:sz w:val="28"/>
+          <w:szCs w:val="28"/>
+          <w:u w:val="single"/>
         </w:rPr>
         <w:lastRenderedPageBreak/>
         <w:t>7.2. Résultats des sonométries :</w:t>
@@ -17903,22 +19455,30 @@
     </w:p>
     <w:p>
       <w:pPr>
-        <w:pStyle w:val="Titre4"/>
+        <w:pStyle w:val="Corpsdetexte"/>
         <w:spacing w:before="83"/>
         <w:ind w:left="567"/>
         <w:rPr>
           <w:rFonts w:asciiTheme="minorHAnsi" w:hAnsiTheme="minorHAnsi" w:cstheme="minorHAnsi"/>
+          <w:sz w:val="28"/>
+          <w:szCs w:val="28"/>
+          <w:u w:val="single"/>
         </w:rPr>
       </w:pPr>
       <w:r>
         <w:rPr>
           <w:rFonts w:asciiTheme="minorHAnsi" w:hAnsiTheme="minorHAnsi" w:cstheme="minorHAnsi"/>
+          <w:sz w:val="28"/>
+          <w:szCs w:val="28"/>
+          <w:u w:val="single"/>
         </w:rPr>
         <w:t>7.3. Conclusions techniques :</w:t>
       </w:r>
       <w:r>
         <w:rPr>
           <w:rFonts w:asciiTheme="minorHAnsi" w:hAnsiTheme="minorHAnsi" w:cstheme="minorHAnsi"/>
+          <w:sz w:val="28"/>
+          <w:szCs w:val="28"/>
         </w:rPr>
         <w:t xml:space="preserve"> </w:t>
       </w:r>
@@ -18024,32 +19584,41 @@
         </w:tabs>
         <w:spacing w:before="23"/>
         <w:ind w:left="720" w:firstLine="0"/>
-        <w:rPr/>
-      </w:pPr>
-      <w:r>
-        <w:rPr/>
+        <w:rPr>
+          <w:u w:val="single"/>
+        </w:rPr>
+      </w:pPr>
+      <w:r>
+        <w:rPr>
+          <w:u w:val="single"/>
+        </w:rPr>
         <w:lastRenderedPageBreak/>
         <w:t>7.4. La</w:t>
       </w:r>
       <w:r>
         <w:rPr>
           <w:spacing w:val="-9"/>
-        </w:rPr>
-        <w:t xml:space="preserve"> </w:t>
-      </w:r>
-      <w:r>
-        <w:rPr/>
+          <w:u w:val="single"/>
+        </w:rPr>
+        <w:t xml:space="preserve"> </w:t>
+      </w:r>
+      <w:r>
+        <w:rPr>
+          <w:u w:val="single"/>
+        </w:rPr>
         <w:t>Protection</w:t>
       </w:r>
       <w:r>
         <w:rPr>
           <w:spacing w:val="-6"/>
+          <w:u w:val="single"/>
         </w:rPr>
         <w:t xml:space="preserve"> </w:t>
       </w:r>
       <w:r>
         <w:rPr>
           <w:spacing w:val="-2"/>
+          <w:u w:val="single"/>
         </w:rPr>
         <w:t>individuelle :</w:t>
       </w:r>
@@ -18077,7 +19646,7 @@
     </w:p>
     <w:p>
       <w:pPr>
-        <w:pStyle w:val="Titre2"/>
+        <w:pStyle w:val="Paragraphedeliste"/>
         <w:numPr>
           <w:ilvl w:val="0"/>
           <w:numId w:val="18"/>
@@ -18085,64 +19654,92 @@
         <w:ind w:right="4537"/>
         <w:rPr>
           <w:b/>
+          <w:sz w:val="36"/>
         </w:rPr>
       </w:pPr>
       <w:r>
         <w:rPr>
           <w:b/>
+          <w:smallCaps/>
+          <w:sz w:val="36"/>
+          <w:u w:val="thick"/>
         </w:rPr>
         <w:t>Les</w:t>
       </w:r>
       <w:r>
         <w:rPr>
           <w:b/>
+          <w:smallCaps/>
           <w:spacing w:val="-8"/>
+          <w:sz w:val="36"/>
+          <w:u w:val="thick"/>
         </w:rPr>
         <w:t xml:space="preserve"> </w:t>
       </w:r>
       <w:r>
         <w:rPr>
           <w:b/>
+          <w:smallCaps/>
+          <w:sz w:val="36"/>
+          <w:u w:val="thick"/>
         </w:rPr>
         <w:t>indicateurs</w:t>
       </w:r>
       <w:r>
         <w:rPr>
           <w:b/>
+          <w:smallCaps/>
           <w:spacing w:val="-7"/>
+          <w:sz w:val="36"/>
+          <w:u w:val="thick"/>
         </w:rPr>
         <w:t xml:space="preserve"> </w:t>
       </w:r>
       <w:r>
         <w:rPr>
           <w:b/>
+          <w:smallCaps/>
+          <w:sz w:val="36"/>
+          <w:u w:val="thick"/>
         </w:rPr>
         <w:t>de</w:t>
       </w:r>
       <w:r>
         <w:rPr>
           <w:b/>
+          <w:smallCaps/>
           <w:spacing w:val="-6"/>
+          <w:sz w:val="36"/>
+          <w:u w:val="thick"/>
         </w:rPr>
         <w:t xml:space="preserve"> </w:t>
       </w:r>
       <w:r>
         <w:rPr>
           <w:b/>
+          <w:smallCaps/>
+          <w:sz w:val="36"/>
+          <w:u w:val="thick"/>
         </w:rPr>
         <w:t>qualite</w:t>
       </w:r>
       <w:r>
         <w:rPr>
           <w:b/>
+          <w:smallCaps/>
           <w:spacing w:val="-5"/>
+          <w:sz w:val="36"/>
+          <w:u w:val="thick"/>
         </w:rPr>
         <w:t xml:space="preserve"> </w:t>
       </w:r>
       <w:r>
         <w:rPr>
           <w:b/>
+          <w:smallCaps/>
           <w:spacing w:val="-2"/>
+          <w:sz w:val="36"/>
+          <w:u w:val="thick"/>
         </w:rPr>
         <w:t>d’evaluation</w:t>
       </w:r>
@@ -18185,98 +19782,126 @@
         <w:jc w:val="both"/>
       </w:pPr>
       <w:r>
-        <w:rPr/>
+        <w:rPr>
+          <w:u w:val="single"/>
+        </w:rPr>
         <w:t>Pour</w:t>
       </w:r>
       <w:r>
         <w:rPr>
           <w:spacing w:val="-6"/>
-        </w:rPr>
-        <w:t xml:space="preserve"> </w:t>
-      </w:r>
-      <w:r>
-        <w:rPr/>
+          <w:u w:val="single"/>
+        </w:rPr>
+        <w:t xml:space="preserve"> </w:t>
+      </w:r>
+      <w:r>
+        <w:rPr>
+          <w:u w:val="single"/>
+        </w:rPr>
         <w:t>l’entreprise,</w:t>
       </w:r>
       <w:r>
         <w:rPr>
           <w:spacing w:val="-3"/>
-        </w:rPr>
-        <w:t xml:space="preserve"> </w:t>
-      </w:r>
-      <w:r>
-        <w:rPr/>
+          <w:u w:val="single"/>
+        </w:rPr>
+        <w:t xml:space="preserve"> </w:t>
+      </w:r>
+      <w:r>
+        <w:rPr>
+          <w:u w:val="single"/>
+        </w:rPr>
         <w:t>après</w:t>
       </w:r>
       <w:r>
         <w:rPr>
           <w:spacing w:val="-3"/>
-        </w:rPr>
-        <w:t xml:space="preserve"> </w:t>
-      </w:r>
-      <w:r>
-        <w:rPr/>
+          <w:u w:val="single"/>
+        </w:rPr>
+        <w:t xml:space="preserve"> </w:t>
+      </w:r>
+      <w:r>
+        <w:rPr>
+          <w:u w:val="single"/>
+        </w:rPr>
         <w:t>les</w:t>
       </w:r>
       <w:r>
         <w:rPr>
           <w:spacing w:val="-5"/>
-        </w:rPr>
-        <w:t xml:space="preserve"> </w:t>
-      </w:r>
-      <w:r>
-        <w:rPr/>
+          <w:u w:val="single"/>
+        </w:rPr>
+        <w:t xml:space="preserve"> </w:t>
+      </w:r>
+      <w:r>
+        <w:rPr>
+          <w:u w:val="single"/>
+        </w:rPr>
         <w:t>mesurages,</w:t>
       </w:r>
       <w:r>
         <w:rPr>
           <w:spacing w:val="-2"/>
-        </w:rPr>
-        <w:t xml:space="preserve"> </w:t>
-      </w:r>
-      <w:r>
-        <w:rPr/>
+          <w:u w:val="single"/>
+        </w:rPr>
+        <w:t xml:space="preserve"> </w:t>
+      </w:r>
+      <w:r>
+        <w:rPr>
+          <w:u w:val="single"/>
+        </w:rPr>
         <w:t>il</w:t>
       </w:r>
       <w:r>
         <w:rPr>
           <w:spacing w:val="-5"/>
-        </w:rPr>
-        <w:t xml:space="preserve"> </w:t>
-      </w:r>
-      <w:r>
-        <w:rPr/>
+          <w:u w:val="single"/>
+        </w:rPr>
+        <w:t xml:space="preserve"> </w:t>
+      </w:r>
+      <w:r>
+        <w:rPr>
+          <w:u w:val="single"/>
+        </w:rPr>
         <w:t>est</w:t>
       </w:r>
       <w:r>
         <w:rPr>
           <w:spacing w:val="1"/>
-        </w:rPr>
-        <w:t xml:space="preserve"> </w:t>
-      </w:r>
-      <w:r>
-        <w:rPr/>
+          <w:u w:val="single"/>
+        </w:rPr>
+        <w:t xml:space="preserve"> </w:t>
+      </w:r>
+      <w:r>
+        <w:rPr>
+          <w:u w:val="single"/>
+        </w:rPr>
         <w:t>recommandé</w:t>
       </w:r>
       <w:r>
         <w:rPr>
           <w:spacing w:val="-4"/>
-        </w:rPr>
-        <w:t xml:space="preserve"> </w:t>
-      </w:r>
-      <w:r>
-        <w:rPr/>
+          <w:u w:val="single"/>
+        </w:rPr>
+        <w:t xml:space="preserve"> </w:t>
+      </w:r>
+      <w:r>
+        <w:rPr>
+          <w:u w:val="single"/>
+        </w:rPr>
         <w:t>de</w:t>
       </w:r>
       <w:r>
         <w:rPr>
           <w:spacing w:val="-2"/>
+          <w:u w:val="single"/>
         </w:rPr>
         <w:t xml:space="preserve"> </w:t>
       </w:r>
       <w:r>
         <w:rPr>
           <w:spacing w:val="-10"/>
+          <w:u w:val="single"/>
         </w:rPr>
         <w:t>:</w:t>
       </w:r>
@@ -19015,68 +20640,87 @@
         <w:jc w:val="both"/>
       </w:pPr>
       <w:r>
-        <w:rPr/>
+        <w:rPr>
+          <w:u w:val="single"/>
+        </w:rPr>
         <w:t>Pour</w:t>
       </w:r>
       <w:r>
         <w:rPr>
           <w:spacing w:val="-4"/>
-        </w:rPr>
-        <w:t xml:space="preserve"> </w:t>
-      </w:r>
-      <w:r>
-        <w:rPr/>
+          <w:u w:val="single"/>
+        </w:rPr>
+        <w:t xml:space="preserve"> </w:t>
+      </w:r>
+      <w:r>
+        <w:rPr>
+          <w:u w:val="single"/>
+        </w:rPr>
         <w:t>chaque</w:t>
       </w:r>
       <w:r>
         <w:rPr>
           <w:spacing w:val="-5"/>
-        </w:rPr>
-        <w:t xml:space="preserve"> </w:t>
-      </w:r>
-      <w:r>
-        <w:rPr/>
+          <w:u w:val="single"/>
+        </w:rPr>
+        <w:t xml:space="preserve"> </w:t>
+      </w:r>
+      <w:r>
+        <w:rPr>
+          <w:u w:val="single"/>
+        </w:rPr>
         <w:t>GEH,</w:t>
       </w:r>
       <w:r>
         <w:rPr>
           <w:spacing w:val="-1"/>
-        </w:rPr>
-        <w:t xml:space="preserve"> </w:t>
-      </w:r>
-      <w:r>
-        <w:rPr/>
+          <w:u w:val="single"/>
+        </w:rPr>
+        <w:t xml:space="preserve"> </w:t>
+      </w:r>
+      <w:r>
+        <w:rPr>
+          <w:u w:val="single"/>
+        </w:rPr>
         <w:t>après</w:t>
       </w:r>
       <w:r>
         <w:rPr>
           <w:spacing w:val="-6"/>
-        </w:rPr>
-        <w:t xml:space="preserve"> </w:t>
-      </w:r>
-      <w:r>
-        <w:rPr/>
+          <w:u w:val="single"/>
+        </w:rPr>
+        <w:t xml:space="preserve"> </w:t>
+      </w:r>
+      <w:r>
+        <w:rPr>
+          <w:u w:val="single"/>
+        </w:rPr>
         <w:t>les</w:t>
       </w:r>
       <w:r>
         <w:rPr>
           <w:spacing w:val="-2"/>
-        </w:rPr>
-        <w:t xml:space="preserve"> </w:t>
-      </w:r>
-      <w:r>
-        <w:rPr/>
+          <w:u w:val="single"/>
+        </w:rPr>
+        <w:t xml:space="preserve"> </w:t>
+      </w:r>
+      <w:r>
+        <w:rPr>
+          <w:u w:val="single"/>
+        </w:rPr>
         <w:t>mesurages</w:t>
       </w:r>
       <w:r>
         <w:rPr>
           <w:spacing w:val="4"/>
+          <w:u w:val="single"/>
         </w:rPr>
         <w:t xml:space="preserve"> </w:t>
       </w:r>
       <w:r>
         <w:rPr>
           <w:spacing w:val="-10"/>
+          <w:u w:val="single"/>
         </w:rPr>
         <w:t>:</w:t>
       </w:r>
@@ -21813,51 +23457,66 @@
         </w:tabs>
         <w:ind w:left="1275" w:hanging="424"/>
         <w:jc w:val="left"/>
-        <w:rPr/>
+        <w:rPr>
+          <w:u w:val="none"/>
+        </w:rPr>
       </w:pPr>
       <w:bookmarkStart w:id="16" w:name="_Toc233365506"/>
       <w:r>
-        <w:rPr/>
+        <w:rPr>
+          <w:smallCaps/>
+        </w:rPr>
         <w:t>La</w:t>
       </w:r>
       <w:r>
         <w:rPr>
+          <w:smallCaps/>
           <w:spacing w:val="-15"/>
         </w:rPr>
         <w:t xml:space="preserve"> </w:t>
       </w:r>
       <w:r>
-        <w:rPr/>
+        <w:rPr>
+          <w:smallCaps/>
+        </w:rPr>
         <w:t>validation</w:t>
       </w:r>
       <w:r>
         <w:rPr>
+          <w:smallCaps/>
           <w:spacing w:val="-13"/>
         </w:rPr>
         <w:t xml:space="preserve"> </w:t>
       </w:r>
       <w:r>
-        <w:rPr/>
+        <w:rPr>
+          <w:smallCaps/>
+        </w:rPr>
         <w:t>du</w:t>
       </w:r>
       <w:r>
         <w:rPr>
+          <w:smallCaps/>
           <w:spacing w:val="-13"/>
         </w:rPr>
         <w:t xml:space="preserve"> </w:t>
       </w:r>
       <w:r>
-        <w:rPr/>
+        <w:rPr>
+          <w:smallCaps/>
+        </w:rPr>
         <w:t>rapport</w:t>
       </w:r>
       <w:r>
         <w:rPr>
+          <w:smallCaps/>
           <w:spacing w:val="-12"/>
         </w:rPr>
         <w:t xml:space="preserve"> </w:t>
       </w:r>
       <w:r>
         <w:rPr>
+          <w:smallCaps/>
           <w:spacing w:val="-2"/>
         </w:rPr>
         <w:t>d’intervention</w:t>
@@ -29507,9 +31166,6 @@
     <w:unhideWhenUsed/>
     <w:qFormat/>
     <w:pPr>
-      <w:pBdr>
-        <w:bottom w:val="single" w:sz="12" w:space="4" w:color="1D9BD1"/>
-      </w:pBdr>
       <w:spacing w:before="11"/>
       <w:ind w:left="1042" w:hanging="331"/>
       <w:outlineLvl w:val="1"/>
@@ -29517,10 +31173,9 @@
     <w:rPr>
       <w:b/>
       <w:bCs/>
-      <w:caps/>
-      <w:color w:val="0B3C78"/>
-      <w:sz w:val="30"/>
-      <w:szCs w:val="30"/>
+      <w:sz w:val="32"/>
+      <w:szCs w:val="32"/>
+      <w:u w:val="single" w:color="000000"/>
     </w:rPr>
   </w:style>
   <w:style w:type="paragraph" w:styleId="Titre3">
@@ -29536,9 +31191,8 @@
     <w:rPr>
       <w:b/>
       <w:bCs/>
-      <w:color w:val="0B3C78"/>
-      <w:sz w:val="26"/>
-      <w:szCs w:val="26"/>
+      <w:sz w:val="28"/>
+      <w:szCs w:val="28"/>
     </w:rPr>
   </w:style>
   <w:style w:type="paragraph" w:styleId="Titre4">
@@ -29552,11 +31206,8 @@
       <w:outlineLvl w:val="3"/>
     </w:pPr>
     <w:rPr>
-      <w:b/>
-      <w:bCs/>
-      <w:color w:val="1D9BD1"/>
-      <w:sz w:val="24"/>
-      <w:szCs w:val="24"/>
+      <w:sz w:val="28"/>
+      <w:szCs w:val="28"/>
     </w:rPr>
   </w:style>
   <w:style w:type="paragraph" w:styleId="Titre5">
@@ -29573,7 +31224,6 @@
     <w:rPr>
       <w:b/>
       <w:bCs/>
-      <w:color w:val="1D9BD1"/>
       <w:sz w:val="24"/>
       <w:szCs w:val="24"/>
     </w:rPr>

</xml_diff>